<commit_message>
WIP: regenerate Power BI homepage docx/pdf from draft-v7
Deliver agent output so far (interrupted by a rate limit mid-fix on
the docx raw-URL leaks). sources-log and insurance-format doc still
to follow.
</commit_message>
<xml_diff>
--- a/content-pipeline/requirements/2026-09-28-power-bi-services-homepage/output/power-bi-services-homepage.docx
+++ b/content-pipeline/requirements/2026-09-28-power-bi-services-homepage/output/power-bi-services-homepage.docx
@@ -7,7 +7,7 @@
         <w:pStyle w:val="Title"/>
       </w:pPr>
       <w:r>
-        <w:t xml:space="preserve">Microsoft Power BI Services Homepage</w:t>
+        <w:t xml:space="preserve">Power BI Services Homepage</w:t>
       </w:r>
     </w:p>
     <w:p>
@@ -23,7 +23,7 @@
         <w:pStyle w:val="Note"/>
       </w:pPr>
       <w:r>
-        <w:t xml:space="preserve">Prepared 28 September 2026 from the approved draft (draft-v4.md). Grey section bars, "Button:" lines and labels are production notes for the web team; everything else is page copy, in page order. Footnote numbers follow order of appearance on the page.</w:t>
+        <w:t xml:space="preserve">Prepared 29 September 2026 from the approved draft (draft-v7.md, Test PASS in test-report-v7.md). Replaces the 28 September delivery built from draft-v4.md. Grey section bars, "Button:" lines and labels are production notes for the web team; everything else is page copy, in page order. Footnote numbers follow order of appearance on the page.</w:t>
       </w:r>
     </w:p>
     <w:tbl>
@@ -289,7 +289,7 @@
                 <w:sz w:val="17"/>
                 <w:szCs w:val="17"/>
               </w:rPr>
-              <w:t xml:space="preserve">Power BI Services; Power BI consulting company; Power BI solutions expert; Certified Power BI Partner in UAE (not placed: certification unconfirmed, brief Section 10 point 1)</w:t>
+              <w:t xml:space="preserve">Power BI Services; Power BI consulting company; Power BI solutions expert; Certified Power BI Partner in UAE (not placed: HLB HAMT is positioned as a Power BI reselling partner, brief Section 13 point 2)</w:t>
             </w:r>
           </w:p>
         </w:tc>
@@ -478,7 +478,7 @@
                 <w:sz w:val="17"/>
                 <w:szCs w:val="17"/>
               </w:rPr>
-              <w:t xml:space="preserve">Why HLB HAMT (#whyhlbhamt)  ·  Why Power BI (#explorepowerbi)  ·  AI Insights (#aiinsights)  ·  Use Cases (#usecases)  ·  Services (#services)  ·  Proof of Concept (#methodology)  ·  Engagement Models (#packages)  ·  FAQ (#faq)</w:t>
+              <w:t xml:space="preserve">Why HLB HAMT (#whyhlbhamt)  ·  The Platform (#explorepowerbi)  ·  Use Cases (#usecases)  ·  Services (#services)  ·  Proof of Concept (#methodology)  ·  Engagement Models (#packages)  ·  FAQ (#faq)</w:t>
             </w:r>
           </w:p>
         </w:tc>
@@ -512,7 +512,7 @@
                 <w:sz w:val="17"/>
                 <w:szCs w:val="17"/>
               </w:rPr>
-              <w:t xml:space="preserve">In-copy links</w:t>
+              <w:t xml:space="preserve">In-copy links (anchor text is the live hyperlink)</w:t>
             </w:r>
           </w:p>
         </w:tc>
@@ -538,10 +538,215 @@
             </w:pPr>
             <w:r>
               <w:rPr>
+                <w:b/>
+                <w:bCs/>
                 <w:sz w:val="17"/>
                 <w:szCs w:val="17"/>
               </w:rPr>
-              <w:t xml:space="preserve">digital transformation and analytics services → https://hlbhamt.com/services/digital-transformation-uae/ (S4 lede)</w:t>
+              <w:t xml:space="preserve">L1  </w:t>
+            </w:r>
+            <w:hyperlink w:history="1" r:id="rId4tvxlgrmfsddv5smka_6q">
+              <w:r>
+                <w:rPr>
+                  <w:rStyle w:val="Hyperlink"/>
+                  <w:sz w:val="17"/>
+                  <w:szCs w:val="17"/>
+                </w:rPr>
+                <w:t xml:space="preserve">digital transformation and analytics services</w:t>
+              </w:r>
+            </w:hyperlink>
+            <w:r>
+              <w:rPr>
+                <w:sz w:val="17"/>
+                <w:szCs w:val="17"/>
+              </w:rPr>
+              <w:t xml:space="preserve">  (S4 lede)</w:t>
+            </w:r>
+          </w:p>
+          <w:p>
+            <w:pPr>
+              <w:spacing w:after="20" w:line="240" w:lineRule="auto"/>
+            </w:pPr>
+            <w:r>
+              <w:rPr>
+                <w:b/>
+                <w:bCs/>
+                <w:sz w:val="17"/>
+                <w:szCs w:val="17"/>
+              </w:rPr>
+              <w:t xml:space="preserve">L2  </w:t>
+            </w:r>
+            <w:hyperlink w:history="1" r:id="rIdicfrmvidxdca2sru8oobs">
+              <w:r>
+                <w:rPr>
+                  <w:rStyle w:val="Hyperlink"/>
+                  <w:sz w:val="17"/>
+                  <w:szCs w:val="17"/>
+                </w:rPr>
+                <w:t xml:space="preserve">SugarAI CRM</w:t>
+              </w:r>
+            </w:hyperlink>
+            <w:r>
+              <w:rPr>
+                <w:sz w:val="17"/>
+                <w:szCs w:val="17"/>
+              </w:rPr>
+              <w:t xml:space="preserve">  (S11 tile 4)</w:t>
+            </w:r>
+          </w:p>
+          <w:p>
+            <w:pPr>
+              <w:spacing w:after="20" w:line="240" w:lineRule="auto"/>
+            </w:pPr>
+            <w:r>
+              <w:rPr>
+                <w:b/>
+                <w:bCs/>
+                <w:sz w:val="17"/>
+                <w:szCs w:val="17"/>
+              </w:rPr>
+              <w:t xml:space="preserve">L3  </w:t>
+            </w:r>
+            <w:hyperlink w:history="1" r:id="rIdm61vbsxlo1e-_1ygbcc7g">
+              <w:r>
+                <w:rPr>
+                  <w:rStyle w:val="Hyperlink"/>
+                  <w:sz w:val="17"/>
+                  <w:szCs w:val="17"/>
+                </w:rPr>
+                <w:t xml:space="preserve">UAE Corporate Tax advisory</w:t>
+              </w:r>
+            </w:hyperlink>
+            <w:r>
+              <w:rPr>
+                <w:sz w:val="17"/>
+                <w:szCs w:val="17"/>
+              </w:rPr>
+              <w:t xml:space="preserve">  (S6 card 2)</w:t>
+            </w:r>
+          </w:p>
+          <w:p>
+            <w:pPr>
+              <w:spacing w:after="20" w:line="240" w:lineRule="auto"/>
+            </w:pPr>
+            <w:r>
+              <w:rPr>
+                <w:b/>
+                <w:bCs/>
+                <w:sz w:val="17"/>
+                <w:szCs w:val="17"/>
+              </w:rPr>
+              <w:t xml:space="preserve">L4  </w:t>
+            </w:r>
+            <w:hyperlink w:history="1" r:id="rIdsgwlziep3wmo9iax1bg3e">
+              <w:r>
+                <w:rPr>
+                  <w:rStyle w:val="Hyperlink"/>
+                  <w:sz w:val="17"/>
+                  <w:szCs w:val="17"/>
+                </w:rPr>
+                <w:t xml:space="preserve">Power BI automation</w:t>
+              </w:r>
+            </w:hyperlink>
+            <w:r>
+              <w:rPr>
+                <w:sz w:val="17"/>
+                <w:szCs w:val="17"/>
+              </w:rPr>
+              <w:t xml:space="preserve">  (FAQ 4)</w:t>
+            </w:r>
+          </w:p>
+          <w:p>
+            <w:pPr>
+              <w:spacing w:after="20" w:line="240" w:lineRule="auto"/>
+            </w:pPr>
+            <w:r>
+              <w:rPr>
+                <w:b/>
+                <w:bCs/>
+                <w:sz w:val="17"/>
+                <w:szCs w:val="17"/>
+              </w:rPr>
+              <w:t xml:space="preserve">L5  </w:t>
+            </w:r>
+            <w:hyperlink w:history="1" r:id="rIddlojhnik0sze5w471ul3z">
+              <w:r>
+                <w:rPr>
+                  <w:rStyle w:val="Hyperlink"/>
+                  <w:sz w:val="17"/>
+                  <w:szCs w:val="17"/>
+                </w:rPr>
+                <w:t xml:space="preserve">data protection advisory</w:t>
+              </w:r>
+            </w:hyperlink>
+            <w:r>
+              <w:rPr>
+                <w:sz w:val="17"/>
+                <w:szCs w:val="17"/>
+              </w:rPr>
+              <w:t xml:space="preserve">  (FAQ 6)</w:t>
+            </w:r>
+          </w:p>
+          <w:p>
+            <w:pPr>
+              <w:spacing w:after="20" w:line="240" w:lineRule="auto"/>
+            </w:pPr>
+            <w:r>
+              <w:rPr>
+                <w:b/>
+                <w:bCs/>
+                <w:sz w:val="17"/>
+                <w:szCs w:val="17"/>
+              </w:rPr>
+              <w:t xml:space="preserve">L6  </w:t>
+            </w:r>
+            <w:hyperlink w:history="1" r:id="rIdf_1ewi0sfzugay5yzug9q">
+              <w:r>
+                <w:rPr>
+                  <w:rStyle w:val="Hyperlink"/>
+                  <w:sz w:val="17"/>
+                  <w:szCs w:val="17"/>
+                </w:rPr>
+                <w:t xml:space="preserve">Power BI dashboard development</w:t>
+              </w:r>
+            </w:hyperlink>
+            <w:r>
+              <w:rPr>
+                <w:sz w:val="17"/>
+                <w:szCs w:val="17"/>
+              </w:rPr>
+              <w:t xml:space="preserve">  (S7 item 03)</w:t>
+            </w:r>
+          </w:p>
+          <w:p>
+            <w:pPr>
+              <w:spacing w:after="20" w:line="240" w:lineRule="auto"/>
+            </w:pPr>
+            <w:r>
+              <w:rPr>
+                <w:b/>
+                <w:bCs/>
+                <w:sz w:val="17"/>
+                <w:szCs w:val="17"/>
+              </w:rPr>
+              <w:t xml:space="preserve">L7  </w:t>
+            </w:r>
+            <w:hyperlink w:history="1" r:id="rId1grr1kfx4elgt2m2x2yme">
+              <w:r>
+                <w:rPr>
+                  <w:rStyle w:val="Hyperlink"/>
+                  <w:sz w:val="17"/>
+                  <w:szCs w:val="17"/>
+                </w:rPr>
+                <w:t xml:space="preserve">data visualisation services</w:t>
+              </w:r>
+            </w:hyperlink>
+            <w:r>
+              <w:rPr>
+                <w:sz w:val="17"/>
+                <w:szCs w:val="17"/>
+              </w:rPr>
+              <w:t xml:space="preserve">  (S6 intro)</w:t>
             </w:r>
           </w:p>
           <w:p>
@@ -553,67 +758,7 @@
                 <w:sz w:val="17"/>
                 <w:szCs w:val="17"/>
               </w:rPr>
-              <w:t xml:space="preserve">Power BI automation with Power Automate → https://hlbhamt.com/insights/unlocking-power-bi-automation-with-power-automate/ (S6 Alerts)</w:t>
-            </w:r>
-          </w:p>
-          <w:p>
-            <w:pPr>
-              <w:spacing w:after="20" w:line="240" w:lineRule="auto"/>
-            </w:pPr>
-            <w:r>
-              <w:rPr>
-                <w:sz w:val="17"/>
-                <w:szCs w:val="17"/>
-              </w:rPr>
-              <w:t xml:space="preserve">UAE Corporate Tax advisory → https://hlbhamt.com/services/corporate-tax-advisory-services-in-uae/ (S7 card 2)</w:t>
-            </w:r>
-          </w:p>
-          <w:p>
-            <w:pPr>
-              <w:spacing w:after="20" w:line="240" w:lineRule="auto"/>
-            </w:pPr>
-            <w:r>
-              <w:rPr>
-                <w:sz w:val="17"/>
-                <w:szCs w:val="17"/>
-              </w:rPr>
-              <w:t xml:space="preserve">SugarAI CRM → https://hlbhamt.com/sugarai-crm-2/ (S12 tile 4)</w:t>
-            </w:r>
-          </w:p>
-          <w:p>
-            <w:pPr>
-              <w:spacing w:after="20" w:line="240" w:lineRule="auto"/>
-            </w:pPr>
-            <w:r>
-              <w:rPr>
-                <w:sz w:val="17"/>
-                <w:szCs w:val="17"/>
-              </w:rPr>
-              <w:t xml:space="preserve">data protection advisory → https://hlbhamt.com/services/data-privacy-and-security-uae/ (FAQ 6)</w:t>
-            </w:r>
-          </w:p>
-          <w:p>
-            <w:pPr>
-              <w:spacing w:after="20" w:line="240" w:lineRule="auto"/>
-            </w:pPr>
-            <w:r>
-              <w:rPr>
-                <w:sz w:val="17"/>
-                <w:szCs w:val="17"/>
-              </w:rPr>
-              <w:t xml:space="preserve">PLACEHOLDER, page not yet built: advanced analytics services → /services/advanced-analytics-services/ (S6 lede; dotted underline in this document)</w:t>
-            </w:r>
-          </w:p>
-          <w:p>
-            <w:pPr>
-              <w:spacing w:after="20" w:line="240" w:lineRule="auto"/>
-            </w:pPr>
-            <w:r>
-              <w:rPr>
-                <w:sz w:val="17"/>
-                <w:szCs w:val="17"/>
-              </w:rPr>
-              <w:t xml:space="preserve">PLACEHOLDER, page not yet built: data visualisation services → /services/data-visualisation-services/ (S8 item 03; dotted underline in this document)</w:t>
+              <w:t xml:space="preserve">PLACEHOLDER, page not yet built: advanced analytics services → /services/advanced-analytics-services/ (S6 card 6; dotted underline in this document)</w:t>
             </w:r>
           </w:p>
         </w:tc>
@@ -676,7 +821,7 @@
                 <w:sz w:val="17"/>
                 <w:szCs w:val="17"/>
               </w:rPr>
-              <w:t xml:space="preserve">Service, FAQPage (9 Q&amp;As, text identical to the on-page answers) and BreadcrumbList JSON-LD, in the .html file.</w:t>
+              <w:t xml:space="preserve">Service, FAQPage (10 Q&amp;As, text identical to the on-page answers) and BreadcrumbList JSON-LD, in the .html file.</w:t>
             </w:r>
           </w:p>
         </w:tc>
@@ -739,7 +884,7 @@
                 <w:sz w:val="17"/>
                 <w:szCs w:val="17"/>
               </w:rPr>
-              <w:t xml:space="preserve">S13: static Power BI dashboard screenshot or GIF (no video supplied).</w:t>
+              <w:t xml:space="preserve">S12: static Power BI dashboard screenshot or GIF (no video supplied).</w:t>
             </w:r>
           </w:p>
         </w:tc>
@@ -763,7 +908,7 @@
       <w:pPr>
         <w:pStyle w:val="Note"/>
       </w:pPr>
-      <w:hyperlink w:history="1" r:id="rIdlkqgkwo9e9egncpwsxnsd">
+      <w:hyperlink w:history="1" r:id="rIdekt7fgytwdtp2kt3ykhim">
         <w:r>
           <w:rPr>
             <w:rStyle w:val="Hyperlink"/>
@@ -786,7 +931,7 @@
         </w:rPr>
         <w:t xml:space="preserve">  ›  </w:t>
       </w:r>
-      <w:hyperlink w:history="1" r:id="rIde1jlexcwija61fziempqc">
+      <w:hyperlink w:history="1" r:id="rIdivtydihl5ts09mehwxtf5">
         <w:r>
           <w:rPr>
             <w:rStyle w:val="Hyperlink"/>
@@ -800,7 +945,7 @@
         </w:rPr>
         <w:t xml:space="preserve">  ›  </w:t>
       </w:r>
-      <w:hyperlink w:history="1" r:id="rIdtzpz0wmk6dbiuxytjfg_z">
+      <w:hyperlink w:history="1" r:id="rIdeqth4ruj5maa5hk7apy17">
         <w:r>
           <w:rPr>
             <w:rStyle w:val="Hyperlink"/>
@@ -833,7 +978,7 @@
         <w:keepNext/>
       </w:pPr>
       <w:r>
-        <w:t xml:space="preserve">Microsoft Power BI</w:t>
+        <w:t xml:space="preserve">HLB HAMT POWER BI SERVICES</w:t>
       </w:r>
     </w:p>
     <w:p>
@@ -843,7 +988,7 @@
       </w:pPr>
       <w:bookmarkStart w:name="top" w:id="1"/>
       <w:r>
-        <w:t xml:space="preserve">Power BI Service Partner for Smarter Decisions Across the UAE</w:t>
+        <w:t xml:space="preserve">HLB HAMT: Your Power BI Service Partner for Smarter Decisions in the UAE</w:t>
       </w:r>
       <w:bookmarkEnd w:id="1"/>
     </w:p>
@@ -853,7 +998,7 @@
         <w:keepNext/>
       </w:pPr>
       <w:r>
-        <w:t xml:space="preserve">HLB HAMT designs, builds and runs your Power BI service, turning ERP, CRM, finance and spreadsheet data into dashboards your leadership team trusts. Our accountants and data engineers work on the same team, so reports built for organisations across the Emirates and the wider GCC follow the accounting logic their auditors apply.</w:t>
+        <w:t xml:space="preserve">HLB HAMT designs, builds and runs your Power BI service, turning ERP, CRM, finance and spreadsheet data into dashboards your leadership team can take straight into the boardroom. Our chartered accountants work beside our data engineers, so the measures behind each report follow the rules your auditors test, whether you operate in one emirate or across the GCC.</w:t>
       </w:r>
     </w:p>
     <w:p>
@@ -909,7 +1054,7 @@
     </w:p>
     <w:p>
       <w:r>
-        <w:t xml:space="preserve">A revenue figure means the same thing in every meeting, whether a director, an analyst or someone out in the field is reading it.</w:t>
+        <w:t xml:space="preserve">We define each measure once, so gross margin reads the same on the executive dashboard, in an analyst's drill-down and on a sales manager's phone.</w:t>
       </w:r>
     </w:p>
     <w:p>
@@ -923,7 +1068,7 @@
     </w:p>
     <w:p>
       <w:r>
-        <w:t xml:space="preserve">A single-page dashboard holding the handful of KPIs your executives check before the first meeting of the day.</w:t>
+        <w:t xml:space="preserve">A one-page view of the KPIs your executives check first thing, refreshed before they log in.</w:t>
       </w:r>
     </w:p>
     <w:p>
@@ -937,7 +1082,7 @@
     </w:p>
     <w:p>
       <w:r>
-        <w:t xml:space="preserve">Multi-page reports with filters and drill-downs that explain why a number moved, not only that it did.</w:t>
+        <w:t xml:space="preserve">Multi-page reports with filters and drill-downs that trace why a number moved, down to transactions.</w:t>
       </w:r>
     </w:p>
     <w:p>
@@ -951,7 +1096,7 @@
     </w:p>
     <w:p>
       <w:r>
-        <w:t xml:space="preserve">A regional manager reviews yesterday's figures and any alerts on iOS or Android between site visits.</w:t>
+        <w:t xml:space="preserve">Area managers open the same reports, with alerts, on their phones between site visits.</w:t>
       </w:r>
     </w:p>
     <w:p>
@@ -959,7 +1104,7 @@
         <w:pStyle w:val="Small"/>
       </w:pPr>
       <w:r>
-        <w:t xml:space="preserve">Data can stay in-country in Microsoft's UAE North (Dubai) or UAE Central (Abu Dhabi) cloud regions. The Dubai region runs the full Fabric platform; the Abu Dhabi region supports Power BI only.</w:t>
+        <w:t xml:space="preserve">We set up your environment so data can stay in-country, in Microsoft's UAE North (Dubai) or UAE Central (Abu Dhabi) cloud region. Dubai runs every data workload; Abu Dhabi supports Power BI only.</w:t>
       </w:r>
       <w:r>
         <w:rPr>
@@ -1035,7 +1180,7 @@
                 <w:sz w:val="18"/>
                 <w:szCs w:val="18"/>
               </w:rPr>
-              <w:t xml:space="preserve">Data connectors in Power BI, from ERP and CRM to cloud databases.</w:t>
+              <w:t xml:space="preserve">Power BI connectors; we configure yours and build missing ones.</w:t>
             </w:r>
             <w:r>
               <w:rPr>
@@ -1129,7 +1274,7 @@
                 <w:sz w:val="26"/>
                 <w:szCs w:val="26"/>
               </w:rPr>
-              <w:t xml:space="preserve">Finance + technology</w:t>
+              <w:t xml:space="preserve">Since 1999</w:t>
             </w:r>
           </w:p>
           <w:p>
@@ -1139,7 +1284,16 @@
                 <w:sz w:val="18"/>
                 <w:szCs w:val="18"/>
               </w:rPr>
-              <w:t xml:space="preserve">Licensed audit, tax and advisory firm building data platforms.</w:t>
+              <w:t xml:space="preserve">A licensed UAE audit, tax and advisory firm that also builds your data platform.</w:t>
+            </w:r>
+            <w:r>
+              <w:rPr>
+                <w:color w:val="E5E7EB"/>
+                <w:sz w:val="18"/>
+                <w:szCs w:val="18"/>
+                <w:vertAlign w:val="superscript"/>
+              </w:rPr>
+              <w:t xml:space="preserve">4</w:t>
             </w:r>
           </w:p>
         </w:tc>
@@ -1182,7 +1336,7 @@
                 <w:sz w:val="18"/>
                 <w:szCs w:val="18"/>
               </w:rPr>
-              <w:t xml:space="preserve">Right-to-left dashboards designed from the first mockup.</w:t>
+              <w:t xml:space="preserve">Right-to-left dashboards planned from the first mockup, not retrofitted.</w:t>
             </w:r>
           </w:p>
         </w:tc>
@@ -1203,7 +1357,7 @@
           <w:b/>
           <w:bCs/>
         </w:rPr>
-        <w:t xml:space="preserve">Microsoft: named a Leader in the 2026 Gartner® Magic Quadrant™ for Analytics and BI Platforms for the 19th consecutive year.</w:t>
+        <w:t xml:space="preserve">HLB HAMT builds on Power BI. Microsoft was named a Leader in the 2026 Gartner® Magic Quadrant™ for Analytics and BI Platforms for the 19th consecutive year.</w:t>
       </w:r>
       <w:r>
         <w:rPr>
@@ -1211,7 +1365,7 @@
           <w:bCs/>
           <w:vertAlign w:val="superscript"/>
         </w:rPr>
-        <w:t xml:space="preserve">4</w:t>
+        <w:t xml:space="preserve">5</w:t>
       </w:r>
     </w:p>
     <w:p>
@@ -1225,14 +1379,19 @@
         </w:rPr>
         <w:t xml:space="preserve">Button: </w:t>
       </w:r>
-      <w:r>
-        <w:t xml:space="preserve">Read Microsoft's announcement</w:t>
-      </w:r>
+      <w:hyperlink w:history="1" r:id="rId_0upnkqxqed4oi6yw3kvx">
+        <w:r>
+          <w:rPr>
+            <w:rStyle w:val="Hyperlink"/>
+          </w:rPr>
+          <w:t xml:space="preserve">Read Microsoft's announcement</w:t>
+        </w:r>
+      </w:hyperlink>
       <w:r>
         <w:rPr>
           <w:color w:val="4B5563"/>
         </w:rPr>
-        <w:t xml:space="preserve">  →  https://community.fabric.microsoft.com/t5/Power-BI-Updates-Blog/Microsoft-named-a-Leader-in-the-2026-Gartner-Magic-Quadrant-for/ba-p/5262403</w:t>
+        <w:t xml:space="preserve">  →  external link, opens in a new tab (same target as Source 5)</w:t>
       </w:r>
     </w:p>
     <w:p>
@@ -1249,7 +1408,7 @@
         <w:pStyle w:val="Note"/>
       </w:pPr>
       <w:r>
-        <w:t xml:space="preserve">Why HLB HAMT  ·  Why Power BI  ·  AI Insights  ·  Use Cases  ·  Services  ·  Proof of Concept  ·  Engagement Models  ·  FAQ</w:t>
+        <w:t xml:space="preserve">Why HLB HAMT  ·  The Platform  ·  Use Cases  ·  Services  ·  Proof of Concept  ·  Engagement Models  ·  FAQ</w:t>
       </w:r>
     </w:p>
     <w:p>
@@ -1287,9 +1446,9 @@
         <w:keepNext/>
       </w:pPr>
       <w:r>
-        <w:t xml:space="preserve">Microsoft supplies a capable platform. Whether people act on what it shows depends on the logic underneath. HLB HAMT is a Power BI consulting company that is also a licensed audit, tax and advisory firm and a member of the HLB International network, so our </w:t>
-      </w:r>
-      <w:hyperlink w:history="1" r:id="rId-13926klv7wqbp8dopgbb">
+        <w:t xml:space="preserve">HLB HAMT is a Power BI consulting company that is also a licensed audit, tax and advisory firm, and a member of the HLB International network. Power BI gives us the platform; our accountants and engineers make the numbers reconcile. That combination anchors our </w:t>
+      </w:r>
+      <w:hyperlink w:history="1" r:id="rIde5n1t7cbx7vfkrs4jotoi">
         <w:r>
           <w:rPr>
             <w:rStyle w:val="Hyperlink"/>
@@ -1298,7 +1457,7 @@
         </w:r>
       </w:hyperlink>
       <w:r>
-        <w:t xml:space="preserve"> team builds self-service BI on figures that reconcile to your ledgers.</w:t>
+        <w:t xml:space="preserve">, where we build self-service BI ecosystems on figures your finance team has already approved.</w:t>
       </w:r>
     </w:p>
     <w:p>
@@ -1312,7 +1471,7 @@
     </w:p>
     <w:p>
       <w:r>
-        <w:t xml:space="preserve">Discovery and data preparation come first, followed by modelling, DAX and report design. We then set up and govern your Power BI service: workspaces and apps, row-level security, scheduled refresh. Training and ongoing support continue after your teams start using it.</w:t>
+        <w:t xml:space="preserve">Discovery, data preparation, modelling and DAX, and report design all sit with us. So does setting up and governing your Power BI service: workspaces and apps, row-level security and scheduled refresh. Training and support carry on after launch, for as long as you need them.</w:t>
       </w:r>
     </w:p>
     <w:p>
@@ -1326,7 +1485,7 @@
     </w:p>
     <w:p>
       <w:r>
-        <w:t xml:space="preserve">A finance team piloting its first dashboard, or a multi-entity group consolidating reports across companies and currencies. Clients operate in all seven emirates as well as Saudi Arabia, Oman, Bahrain, Kuwait and Qatar, and the HLB International network extends our reach beyond the Gulf.</w:t>
+        <w:t xml:space="preserve">Clients range from a finance department piloting its first dashboard to multi-entity groups reporting across several companies and currencies. We deliver in all seven emirates and in Saudi Arabia, Oman, Bahrain, Kuwait and Qatar, with HLB International member firms extending our reach beyond the Gulf.</w:t>
       </w:r>
     </w:p>
     <w:p>
@@ -1340,7 +1499,7 @@
     </w:p>
     <w:p>
       <w:r>
-        <w:t xml:space="preserve">Start with a live demo or a </w:t>
+        <w:t xml:space="preserve">Most clients start with a live demo or a </w:t>
       </w:r>
       <w:hyperlink w:history="1" w:anchor="methodology">
         <w:r>
@@ -1351,7 +1510,7 @@
         </w:r>
       </w:hyperlink>
       <w:r>
-        <w:t xml:space="preserve"> on your own data, then scale in phases. Before any build, we write down the scope and the success criteria both sides will judge it by. Flexible engagement models let you add depth once phase one proves its value.</w:t>
+        <w:t xml:space="preserve">. Full implementations then move through five stages: we define the KPIs and their metric logic, model the data, design the report architecture and user experience, validate accuracy and tune performance, then deploy and drive adoption across your teams.</w:t>
       </w:r>
     </w:p>
     <w:p>
@@ -1365,7 +1524,7 @@
     </w:p>
     <w:p>
       <w:r>
-        <w:t xml:space="preserve">A UAE-based team answers in your time zone, Monday to Friday, through a single point of contact. When a report slows down or the board asks for a new view of the numbers, that contact owns the request until it is resolved.</w:t>
+        <w:t xml:space="preserve">Once reports are live, a single point of contact in our UAE-based team handles your requests in your time zone, Monday to Friday. That person knows your model, tracks each one through to a fix and brings in the right specialist when the board asks for something new.</w:t>
       </w:r>
     </w:p>
     <w:p>
@@ -1374,7 +1533,7 @@
         <w:keepNext/>
       </w:pPr>
       <w:r>
-        <w:t xml:space="preserve">S5  ·  Why Power BI (module table and platform layer)  ·  #explorepowerbi</w:t>
+        <w:t xml:space="preserve">S5  ·  The Platform We Deliver (module table and platform layer)  ·  #explorepowerbi</w:t>
       </w:r>
     </w:p>
     <w:p>
@@ -1383,7 +1542,7 @@
         <w:keepNext/>
       </w:pPr>
       <w:r>
-        <w:t xml:space="preserve">WHY POWER BI</w:t>
+        <w:t xml:space="preserve">THE PLATFORM WE DELIVER</w:t>
       </w:r>
     </w:p>
     <w:p>
@@ -1393,7 +1552,7 @@
       </w:pPr>
       <w:bookmarkStart w:name="explorepowerbi" w:id="3"/>
       <w:r>
-        <w:t xml:space="preserve">Why Power BI: From Raw Data to Boardroom Decisions</w:t>
+        <w:t xml:space="preserve">What HLB HAMT Builds for You on Power BI</w:t>
       </w:r>
       <w:bookmarkEnd w:id="3"/>
     </w:p>
@@ -1403,7 +1562,7 @@
         <w:keepNext/>
       </w:pPr>
       <w:r>
-        <w:t xml:space="preserve">Power BI is Microsoft's business intelligence platform, and it sits naturally beside the tools your teams open every day: Excel, Teams, SharePoint, Outlook, Azure and Dynamics 365. For organisations already running on Microsoft, that native fit means people adopt it with very little friction. Four capabilities do most of the work.</w:t>
+        <w:t xml:space="preserve">HLB HAMT delivers your reporting on Power BI because it works natively with the Microsoft productivity and business apps your staff already rely on. People who live in those tools pick it up with very little friction, which shortens the gap between go-live and everyday use. Below is what we build on each part of the platform.</w:t>
       </w:r>
     </w:p>
     <w:p>
@@ -1421,12 +1580,12 @@
         <w:keepNext/>
       </w:pPr>
       <w:r>
-        <w:t xml:space="preserve">Self-service analytics, built in Power BI Desktop</w:t>
-      </w:r>
-    </w:p>
-    <w:p>
-      <w:r>
-        <w:t xml:space="preserve">Business users build and explore their own visuals without joining an IT queue. Underneath, DAX measures calculate the KPIs finance reports on, such as year-over-year growth, running totals and year-to-date revenue. Every page then works from one agreed definition.</w:t>
+        <w:t xml:space="preserve">Self-service reporting your teams run themselves</w:t>
+      </w:r>
+    </w:p>
+    <w:p>
+      <w:r>
+        <w:t xml:space="preserve">We build semantic models in Power BI Desktop with standardised metric definitions and reusable data layers, then write the DAX measures behind YTD revenue, year-over-year growth and running totals. Business users can explore those numbers on their own, without raising a ticket with IT.</w:t>
       </w:r>
     </w:p>
     <w:p>
@@ -1477,7 +1636,7 @@
         <w:spacing w:after="30"/>
       </w:pPr>
       <w:r>
-        <w:t xml:space="preserve">Power Query data shaping</w:t>
+        <w:t xml:space="preserve">Data shaping and cleansing</w:t>
       </w:r>
     </w:p>
     <w:p>
@@ -1528,16 +1687,16 @@
     </w:p>
     <w:p>
       <w:r>
-        <w:t xml:space="preserve">It is the cloud side of the platform, where finished reports are published, bundled into apps, refreshed on schedule and secured.</w:t>
+        <w:t xml:space="preserve">We set up, govern and run the cloud service where your reports are published as apps, refreshed on schedule and secured by role.</w:t>
       </w:r>
       <w:r>
         <w:rPr>
           <w:vertAlign w:val="superscript"/>
         </w:rPr>
-        <w:t xml:space="preserve">5</w:t>
-      </w:r>
-      <w:r>
-        <w:t xml:space="preserve"> Dashboards serve leadership and reports serve analysts. Both draw on the same data, which puts every part of the business in view from one place.</w:t>
+        <w:t xml:space="preserve">6</w:t>
+      </w:r>
+      <w:r>
+        <w:t xml:space="preserve"> Leadership reads dashboards, analysts work in reports, and our administrators keep both healthy as usage grows.</w:t>
       </w:r>
     </w:p>
     <w:p>
@@ -1634,12 +1793,12 @@
         <w:keepNext/>
       </w:pPr>
       <w:r>
-        <w:t xml:space="preserve">Connected to your ecosystem</w:t>
-      </w:r>
-    </w:p>
-    <w:p>
-      <w:r>
-        <w:t xml:space="preserve">Native, certified and custom connectors cover systems such as SAP, Oracle, NetSuite, Dynamics 365, Salesforce, SugarCRM, Excel, SharePoint, Snowflake, Google BigQuery and REST APIs. For servers inside your own network, the on-premises data gateway keeps scheduled refresh running without moving the source.</w:t>
+        <w:t xml:space="preserve">Connected to the systems you run</w:t>
+      </w:r>
+    </w:p>
+    <w:p>
+      <w:r>
+        <w:t xml:space="preserve">Our engineers reach your ERP, CRM, accounting and finance systems, cloud warehouses, spreadsheets, file shares and REST APIs through native, partner-built and custom connectors. For servers inside your network, we install the on-premises data gateway so scheduled refresh keeps running.</w:t>
       </w:r>
     </w:p>
     <w:p>
@@ -1662,7 +1821,7 @@
         <w:spacing w:after="30"/>
       </w:pPr>
       <w:r>
-        <w:t xml:space="preserve">Certified connectors</w:t>
+        <w:t xml:space="preserve">Native and partner connectors</w:t>
       </w:r>
     </w:p>
     <w:p>
@@ -1718,7 +1877,7 @@
         <w:spacing w:after="120"/>
       </w:pPr>
       <w:r>
-        <w:t xml:space="preserve">Excel and SharePoint sources</w:t>
+        <w:t xml:space="preserve">Spreadsheet and file sources</w:t>
       </w:r>
     </w:p>
     <w:p>
@@ -1736,12 +1895,12 @@
         <w:keepNext/>
       </w:pPr>
       <w:r>
-        <w:t xml:space="preserve">Decisions on the go, and inside your own portals</w:t>
-      </w:r>
-    </w:p>
-    <w:p>
-      <w:r>
-        <w:t xml:space="preserve">Power BI Mobile puts reports on iOS and Android, with alerts, annotation and sharing from the phone. Power BI Embedded goes further: investor portals, client platforms and your web apps can carry branded dashboards on capacity-based licensing, without the expense of building reporting from scratch.</w:t>
+        <w:t xml:space="preserve">On every device, and inside your own portals</w:t>
+      </w:r>
+    </w:p>
+    <w:p>
+      <w:r>
+        <w:t xml:space="preserve">We design mobile layouts so reports, alerts and annotations work properly on phones and tablets. Where customers or investors need access, we embed branded dashboards in your web apps and portals through Power BI Embedded, on capacity-based licensing that keeps external distribution affordable.</w:t>
       </w:r>
     </w:p>
     <w:p>
@@ -1764,7 +1923,7 @@
         <w:spacing w:after="30"/>
       </w:pPr>
       <w:r>
-        <w:t xml:space="preserve">iOS and Android apps</w:t>
+        <w:t xml:space="preserve">Power BI mobile apps</w:t>
       </w:r>
     </w:p>
     <w:p>
@@ -1838,21 +1997,12 @@
         <w:keepNext/>
       </w:pPr>
       <w:r>
-        <w:t xml:space="preserve">Microsoft Fabric and a medallion data lakehouse</w:t>
-      </w:r>
-    </w:p>
-    <w:p>
-      <w:r>
-        <w:t xml:space="preserve">Fabric brings Power BI together with data engineering, warehousing and real-time analytics on one platform. Microsoft reports more than 40,000 paid Fabric customers, up more than 60% year on year.</w:t>
-      </w:r>
-      <w:r>
-        <w:rPr>
-          <w:vertAlign w:val="superscript"/>
-        </w:rPr>
-        <w:t xml:space="preserve">6</w:t>
-      </w:r>
-      <w:r>
-        <w:t xml:space="preserve"> When your data lives in five or more systems, we build a Bronze, Silver and Gold lakehouse fed by Azure Data Factory pipelines, giving every report one source of truth.</w:t>
+        <w:t xml:space="preserve">Data platform readiness and a medallion lakehouse</w:t>
+      </w:r>
+    </w:p>
+    <w:p>
+      <w:r>
+        <w:t xml:space="preserve">We assess whether you are ready for a unified data platform, one that brings data preparation, storage and reporting into a single environment. When your data sits in five or more systems, we build a lakehouse fed by automated data pipelines, refining records through Bronze, Silver and Gold layers so every dashboard reads from one trusted set of tables.</w:t>
       </w:r>
     </w:p>
     <w:p>
@@ -1875,7 +2025,7 @@
         <w:spacing w:after="30"/>
       </w:pPr>
       <w:r>
-        <w:t xml:space="preserve">Fabric readiness assessment</w:t>
+        <w:t xml:space="preserve">Data platform readiness assessment</w:t>
       </w:r>
     </w:p>
     <w:p>
@@ -1889,7 +2039,7 @@
         <w:spacing w:after="30"/>
       </w:pPr>
       <w:r>
-        <w:t xml:space="preserve">Azure Data Factory pipelines</w:t>
+        <w:t xml:space="preserve">Automated data pipelines</w:t>
       </w:r>
     </w:p>
     <w:p>
@@ -1926,7 +2076,7 @@
         <w:keepNext/>
       </w:pPr>
       <w:r>
-        <w:t xml:space="preserve">S6  ·  AI insights  ·  #aiinsights</w:t>
+        <w:t xml:space="preserve">S6  ·  Use cases (6 flip cards: front = title and tagline, back = detail and button)  ·  #usecases</w:t>
       </w:r>
     </w:p>
     <w:p>
@@ -1935,7 +2085,7 @@
         <w:keepNext/>
       </w:pPr>
       <w:r>
-        <w:t xml:space="preserve">AI INSIGHTS</w:t>
+        <w:t xml:space="preserve">USE CASES</w:t>
       </w:r>
     </w:p>
     <w:p>
@@ -1943,9 +2093,9 @@
         <w:pStyle w:val="Heading2"/>
         <w:keepNext/>
       </w:pPr>
-      <w:bookmarkStart w:name="aiinsights" w:id="4"/>
-      <w:r>
-        <w:t xml:space="preserve">Ask Your Data a Question and Act on the Answer</w:t>
+      <w:bookmarkStart w:name="usecases" w:id="4"/>
+      <w:r>
+        <w:t xml:space="preserve">Dashboards Shaped Around the Decisions You Make</w:t>
       </w:r>
       <w:bookmarkEnd w:id="4"/>
     </w:p>
@@ -1955,123 +2105,18 @@
         <w:keepNext/>
       </w:pPr>
       <w:r>
-        <w:t xml:space="preserve">Copilot and the AI visuals built into Power BI move a team from asking what happened to deciding what to do next, without anyone writing a query. The appetite is already there: in Q2 2026, 73.3% of the UAE's working-age population used generative AI tools, against 18.8% worldwide.</w:t>
-      </w:r>
-      <w:r>
-        <w:rPr>
-          <w:vertAlign w:val="superscript"/>
-        </w:rPr>
-        <w:t xml:space="preserve">7</w:t>
-      </w:r>
-      <w:r>
-        <w:t xml:space="preserve"> Forecasting and scoring models, built on Azure Machine Learning, are part of our </w:t>
-      </w:r>
-      <w:r>
-        <w:rPr>
-          <w:color w:val="005A77"/>
-          <w:u w:val="dotted" w:color="005A77"/>
-        </w:rPr>
-        <w:t xml:space="preserve">advanced analytics services</w:t>
-      </w:r>
-      <w:r>
-        <w:t xml:space="preserve">.</w:t>
-      </w:r>
-    </w:p>
-    <w:p>
-      <w:pPr>
-        <w:pStyle w:val="Heading3"/>
-        <w:keepNext/>
-      </w:pPr>
-      <w:r>
-        <w:t xml:space="preserve">Answers</w:t>
-      </w:r>
-    </w:p>
-    <w:p>
-      <w:r>
-        <w:t xml:space="preserve">Copilot answers questions about an open report, summarises what each page shows and drafts DAX measures and new report pages for your authors to refine.</w:t>
-      </w:r>
-      <w:r>
-        <w:rPr>
-          <w:vertAlign w:val="superscript"/>
-        </w:rPr>
-        <w:t xml:space="preserve">8</w:t>
-      </w:r>
-    </w:p>
-    <w:p>
-      <w:pPr>
-        <w:pStyle w:val="Heading3"/>
-        <w:keepNext/>
-      </w:pPr>
-      <w:r>
-        <w:t xml:space="preserve">Explains</w:t>
-      </w:r>
-    </w:p>
-    <w:p>
-      <w:r>
-        <w:t xml:space="preserve">Key influencers and the decomposition tree show what is pushing a number up or down, and the narrative visual describes the change in words.</w:t>
-      </w:r>
-    </w:p>
-    <w:p>
-      <w:pPr>
-        <w:pStyle w:val="Heading3"/>
-        <w:keepNext/>
-      </w:pPr>
-      <w:r>
-        <w:t xml:space="preserve">Alerts</w:t>
-      </w:r>
-    </w:p>
-    <w:p>
-      <w:r>
-        <w:t xml:space="preserve">Anomaly detection flags unusual movements. Data alerts, extended through </w:t>
-      </w:r>
-      <w:hyperlink w:history="1" r:id="rIdep_qjurjrurlpg0njeimn">
+        <w:t xml:space="preserve">Our consultants begin with the KPIs a role or sector is judged on, then design the model, measures and page layout around those numbers. The same KPI-first thinking runs through our wider </w:t>
+      </w:r>
+      <w:hyperlink w:history="1" r:id="rIdfo_17q2kqycic5i1chcml">
         <w:r>
           <w:rPr>
             <w:rStyle w:val="Hyperlink"/>
           </w:rPr>
-          <w:t xml:space="preserve">Power BI automation with Power Automate</w:t>
+          <w:t xml:space="preserve">data visualisation services</w:t>
         </w:r>
       </w:hyperlink>
       <w:r>
-        <w:t xml:space="preserve">, email the owner when a KPI crosses its threshold.</w:t>
-      </w:r>
-    </w:p>
-    <w:p>
-      <w:pPr>
-        <w:pStyle w:val="Marker"/>
-        <w:keepNext/>
-      </w:pPr>
-      <w:r>
-        <w:t xml:space="preserve">S7  ·  Use cases (6 flip cards: front = title and tagline, back = detail and button)  ·  #usecases</w:t>
-      </w:r>
-    </w:p>
-    <w:p>
-      <w:pPr>
-        <w:pStyle w:val="Eyebrow"/>
-        <w:keepNext/>
-      </w:pPr>
-      <w:r>
-        <w:t xml:space="preserve">USE CASES</w:t>
-      </w:r>
-    </w:p>
-    <w:p>
-      <w:pPr>
-        <w:pStyle w:val="Heading2"/>
-        <w:keepNext/>
-      </w:pPr>
-      <w:bookmarkStart w:name="usecases" w:id="5"/>
-      <w:r>
-        <w:t xml:space="preserve">Dashboards Shaped Around the Decisions You Make</w:t>
-      </w:r>
-      <w:bookmarkEnd w:id="5"/>
-    </w:p>
-    <w:p>
-      <w:pPr>
-        <w:pStyle w:val="Lede"/>
-        <w:keepNext/>
-      </w:pPr>
-      <w:r>
-        <w:t xml:space="preserve">Every engagement starts from the KPIs a role or sector runs on. We shape the model, measures and page layout around the decisions those KPIs support, instead of adapting a generic template.</w:t>
+        <w:t xml:space="preserve">.</w:t>
       </w:r>
     </w:p>
     <w:p>
@@ -2090,12 +2135,12 @@
           <w:iCs/>
           <w:color w:val="005A77"/>
         </w:rPr>
-        <w:t xml:space="preserve">Consolidation across entities and currencies, without the spreadsheets</w:t>
-      </w:r>
-    </w:p>
-    <w:p>
-      <w:r>
-        <w:t xml:space="preserve">Every entity rolls up into one group P&amp;L, balance sheet and cash flow, whatever currency it reports in, from AED and SAR to USD and EUR. With audit in mind, chartered accountants design the intercompany eliminations, currency translation and IFRS segment views.</w:t>
+        <w:t xml:space="preserve">Group consolidation and variance without spreadsheet stitching</w:t>
+      </w:r>
+    </w:p>
+    <w:p>
+      <w:r>
+        <w:t xml:space="preserve">Group P&amp;L, balance sheet and cash flow roll up from every entity, across AED, USD, SAR, EUR and more, with budget variance and forecasts next to actuals. Our chartered accountants design intercompany eliminations, FX conversion and IFRS segment views so they stand up to audit.</w:t>
       </w:r>
     </w:p>
     <w:p>
@@ -2135,14 +2180,14 @@
           <w:iCs/>
           <w:color w:val="005A77"/>
         </w:rPr>
-        <w:t xml:space="preserve">Tax positions tracked month by month, not at year end</w:t>
-      </w:r>
-    </w:p>
-    <w:p>
-      <w:r>
-        <w:t xml:space="preserve">Taxable income, IAS 12 deferred tax, transfer pricing and VAT return figures sit together, with free zone results kept apart from mainland ones. Because our </w:t>
-      </w:r>
-      <w:hyperlink w:history="1" r:id="rId1pxbnw7zyxtce1lx5acva">
+        <w:t xml:space="preserve">Tax exposure tracked monthly, long before the return is due</w:t>
+      </w:r>
+    </w:p>
+    <w:p>
+      <w:r>
+        <w:t xml:space="preserve">We track taxable income, IAS 12 deferred tax, transfer pricing and VAT returns, with free zone and mainland results kept apart. With our </w:t>
+      </w:r>
+      <w:hyperlink w:history="1" r:id="rIds4gxq5o38sfmts91l4y2p">
         <w:r>
           <w:rPr>
             <w:rStyle w:val="Hyperlink"/>
@@ -2151,7 +2196,7 @@
         </w:r>
       </w:hyperlink>
       <w:r>
-        <w:t xml:space="preserve"> practice sits in the same firm, the dashboards are built audit-ready from the start.</w:t>
+        <w:t xml:space="preserve"> practice in the same firm, tax specialists set the logic behind every figure.</w:t>
       </w:r>
     </w:p>
     <w:p>
@@ -2191,12 +2236,12 @@
           <w:iCs/>
           <w:color w:val="005A77"/>
         </w:rPr>
-        <w:t xml:space="preserve">Sales velocity, inventory and broker results, side by side</w:t>
-      </w:r>
-    </w:p>
-    <w:p>
-      <w:r>
-        <w:t xml:space="preserve">Follow each unit from first expression of interest to signed deal, with lead conversion, live availability, payment plans, broker performance and DLD compliance reported alongside. CRM and ERP records are matched unit by unit in a lakehouse.</w:t>
+        <w:t xml:space="preserve">Units, brokers and collections tracked from EOI onwards</w:t>
+      </w:r>
+    </w:p>
+    <w:p>
+      <w:r>
+        <w:t xml:space="preserve">Dashboards cover expressions of interest, deal pipeline, lead conversion, unit availability, payment plans, broker performance and DLD compliance. We land CRM and ERP data in a lakehouse first and match them unit by unit, so a sold unit counts once, whichever team reports it.</w:t>
       </w:r>
     </w:p>
     <w:p>
@@ -2236,12 +2281,12 @@
           <w:iCs/>
           <w:color w:val="005A77"/>
         </w:rPr>
-        <w:t xml:space="preserve">Governance that makes the data worth trusting</w:t>
-      </w:r>
-    </w:p>
-    <w:p>
-      <w:r>
-        <w:t xml:space="preserve">Governance frameworks, clearer ownership and better capture at source, with accountability and compliance built in. We help set a data roadmap tied to business strategy, build a culture that asks for evidence, and digitise processes at a scale the organisation can sustain.</w:t>
+        <w:t xml:space="preserve">Clear ownership of data, from capture to boardroom</w:t>
+      </w:r>
+    </w:p>
+    <w:p>
+      <w:r>
+        <w:t xml:space="preserve">We help put governance frameworks, accountability, compliance controls and better data capture in place, activate data across channels and business units, and shape a roadmap tied to strategy. That builds a data-driven culture and lets you digitise processes at a scale the organisation can sustain.</w:t>
       </w:r>
     </w:p>
     <w:p>
@@ -2281,12 +2326,12 @@
           <w:iCs/>
           <w:color w:val="005A77"/>
         </w:rPr>
-        <w:t xml:space="preserve">Campaign spend traced through to customer behaviour</w:t>
-      </w:r>
-    </w:p>
-    <w:p>
-      <w:r>
-        <w:t xml:space="preserve">A unified 360-degree customer view, omnichannel campaign results and buying behaviour by cohort. Segment and target with more precision, read behaviour from digital and e-commerce channels, and compare spend performance across DSPs, SSPs and ad channels.</w:t>
+        <w:t xml:space="preserve">Channel spend linked to what customers actually buy</w:t>
+      </w:r>
+    </w:p>
+    <w:p>
+      <w:r>
+        <w:t xml:space="preserve">CRM, e-commerce and campaign data meet in a 360-degree customer view, from which we report omnichannel performance, cohort buying behaviour and segment response. Media teams compare DSPs, SSPs and ad channels on shared revenue measures, which sharpens targeting for the next campaign.</w:t>
       </w:r>
     </w:p>
     <w:p>
@@ -2326,12 +2371,22 @@
           <w:iCs/>
           <w:color w:val="005A77"/>
         </w:rPr>
-        <w:t xml:space="preserve">Where analytics strategy meets commercial return</w:t>
-      </w:r>
-    </w:p>
-    <w:p>
-      <w:r>
-        <w:t xml:space="preserve">Line up business objectives with what the technology can deliver, then turn raw data into action. Dashboards help spot untapped, blue-ocean market opportunities, feed competitive intelligence and data monetisation plans, and support next-best-action frameworks for frontline decisions.</w:t>
+        <w:t xml:space="preserve">Analytics strategy tied to commercial return</w:t>
+      </w:r>
+    </w:p>
+    <w:p>
+      <w:r>
+        <w:t xml:space="preserve">We align business objectives with what the technology can deliver, then turn raw enterprise data into action: spotting blue-ocean market opportunities and feeding competitive intelligence and data monetisation plans. Forecasting and next-best-action models come through our </w:t>
+      </w:r>
+      <w:r>
+        <w:rPr>
+          <w:color w:val="005A77"/>
+          <w:u w:val="dotted" w:color="005A77"/>
+        </w:rPr>
+        <w:t xml:space="preserve">advanced analytics services</w:t>
+      </w:r>
+      <w:r>
+        <w:t xml:space="preserve">.</w:t>
       </w:r>
     </w:p>
     <w:p>
@@ -2366,7 +2421,7 @@
     </w:p>
     <w:p>
       <w:r>
-        <w:t xml:space="preserve">Real Estate  ·  Construction  ·  Hospitality  ·  Trading  ·  Financial Services  ·  Healthcare  ·  Retail  ·  Logistics  ·  Government  ·  Education</w:t>
+        <w:t xml:space="preserve">Real Estate  ·  Construction  ·  Hospitality  ·  Trading  ·  Financial Services  ·  Healthcare  ·  Retail  ·  Logistics  ·  Manufacturing  ·  Wholesale Distribution  ·  Government  ·  Education</w:t>
       </w:r>
     </w:p>
     <w:p>
@@ -2375,7 +2430,7 @@
         <w:keepNext/>
       </w:pPr>
       <w:r>
-        <w:t xml:space="preserve">S8  ·  Our Power BI Services (numbered offerings 01 to 06)  ·  #services</w:t>
+        <w:t xml:space="preserve">S7  ·  HLB HAMT's Power BI Services (numbered offerings 01 to 06)  ·  #services</w:t>
       </w:r>
     </w:p>
     <w:p>
@@ -2392,11 +2447,11 @@
         <w:pStyle w:val="Heading2"/>
         <w:keepNext/>
       </w:pPr>
-      <w:bookmarkStart w:name="services" w:id="6"/>
-      <w:r>
-        <w:t xml:space="preserve">Our Power BI Services</w:t>
-      </w:r>
-      <w:bookmarkEnd w:id="6"/>
+      <w:bookmarkStart w:name="services" w:id="5"/>
+      <w:r>
+        <w:t xml:space="preserve">HLB HAMT's Power BI Services</w:t>
+      </w:r>
+      <w:bookmarkEnd w:id="5"/>
     </w:p>
     <w:p>
       <w:pPr>
@@ -2404,7 +2459,7 @@
         <w:keepNext/>
       </w:pPr>
       <w:r>
-        <w:t xml:space="preserve">From the first whiteboard session to the support that follows launch, the work falls into the service lines below. The engagement model you agree with us sets how many you need and when each begins.</w:t>
+        <w:t xml:space="preserve">We handle every stage of a Power BI programme ourselves, from strategy through to post-launch support, and most clients use several of the services below. Your engagement model, covered further down, decides the mix.</w:t>
       </w:r>
     </w:p>
     <w:p>
@@ -2422,12 +2477,12 @@
         <w:keepNext/>
       </w:pPr>
       <w:r>
-        <w:t xml:space="preserve">Consulting and discovery workshops</w:t>
-      </w:r>
-    </w:p>
-    <w:p>
-      <w:r>
-        <w:t xml:space="preserve">We map your source systems, test how ready your people and data are for self-service reporting, and sketch an architecture that fits your plans for growth. Licence planning is part of the work: which users need Pro, who needs Premium Per User, and whether capacity makes more sense at your scale.</w:t>
+        <w:t xml:space="preserve">Strategy, discovery and licence planning</w:t>
+      </w:r>
+    </w:p>
+    <w:p>
+      <w:r>
+        <w:t xml:space="preserve">We start from your business goals, data needs and reporting expectations, then translate objectives into KPIs with agreed calculation rules and spot where each role lacks information. Our consultants assess BI readiness and design a scalable architecture. As a Power BI reselling partner, we also recommend and supply the right licence mix: Pro, Premium Per User or capacity.</w:t>
       </w:r>
     </w:p>
     <w:p>
@@ -2445,12 +2500,12 @@
         <w:keepNext/>
       </w:pPr>
       <w:r>
-        <w:t xml:space="preserve">Data preparation and ETL kickstart</w:t>
-      </w:r>
-    </w:p>
-    <w:p>
-      <w:r>
-        <w:t xml:space="preserve">Dependable data comes first; the charts come later. We consolidate sources into data marts and warehouse layers, then automate loads with Azure Data Factory pipelines. When volume and system count call for it, we step up to a full lakehouse rather than stretching a smaller design.</w:t>
+        <w:t xml:space="preserve">Data integration and preparation</w:t>
+      </w:r>
+    </w:p>
+    <w:p>
+      <w:r>
+        <w:t xml:space="preserve">Our engineers build automated ETL and ELT data pipelines, shape data marts and warehouse layers, and configure connectors and the on-premises gateway, writing custom connectors for legacy systems. We configure scheduled and incremental refresh, add near-real-time feeds where a process needs them, and move to a lakehouse once volume and system count call for it.</w:t>
       </w:r>
     </w:p>
     <w:p>
@@ -2468,22 +2523,23 @@
         <w:keepNext/>
       </w:pPr>
       <w:r>
-        <w:t xml:space="preserve">Dashboard and report development</w:t>
-      </w:r>
-    </w:p>
-    <w:p>
-      <w:r>
-        <w:t xml:space="preserve">Executive dashboards and analyst reports built on optimised DAX, with mobile layouts and Arabic right-to-left design where you need it. When an existing report drags, we tune it across the pipeline, data model and semantic layers. Related design work is covered by our </w:t>
-      </w:r>
-      <w:r>
-        <w:rPr>
-          <w:color w:val="005A77"/>
-          <w:u w:val="dotted" w:color="005A77"/>
-        </w:rPr>
-        <w:t xml:space="preserve">data visualisation services</w:t>
-      </w:r>
-      <w:r>
-        <w:t xml:space="preserve">.</w:t>
+        <w:t xml:space="preserve">KPI-centric modelling and dashboard development</w:t>
+      </w:r>
+    </w:p>
+    <w:p>
+      <w:r>
+        <w:t xml:space="preserve">We work model-first, not visual-first: semantic models with consistent KPI definitions and tested DAX come ahead of the first chart. On that base we build executive dashboards and analyst reports with drill-through, cross-filtering, slicers and bookmarks, plus mobile layouts and Arabic right-to-left design. See </w:t>
+      </w:r>
+      <w:hyperlink w:history="1" r:id="rIdclvprp1tx9vrcjmslfez4">
+        <w:r>
+          <w:rPr>
+            <w:rStyle w:val="Hyperlink"/>
+          </w:rPr>
+          <w:t xml:space="preserve">Power BI dashboard development</w:t>
+        </w:r>
+      </w:hyperlink>
+      <w:r>
+        <w:t xml:space="preserve"> for the full scope of this work.</w:t>
       </w:r>
     </w:p>
     <w:p>
@@ -2501,12 +2557,12 @@
         <w:keepNext/>
       </w:pPr>
       <w:r>
-        <w:t xml:space="preserve">Connectors and system integration</w:t>
-      </w:r>
-    </w:p>
-    <w:p>
-      <w:r>
-        <w:t xml:space="preserve">We set up certified connectors, write custom connectors for sources without an off-the-shelf option, and bring ERP, CRM and finance systems together in one governed reporting layer. We also install and configure the on-premises data gateway, then test refresh for every source behind your firewall.</w:t>
+        <w:t xml:space="preserve">Performance tuning, security and governance</w:t>
+      </w:r>
+    </w:p>
+    <w:p>
+      <w:r>
+        <w:t xml:space="preserve">When reports drag, we tune across the pipeline, data model and semantic layers, cutting query load, adding aggregation tables over large fact tables and replacing heavy measures with efficient DAX patterns. On the governance side, we implement row-level security, workspace governance and access controls, so each person sees only the data their role allows and publishing stays controlled.</w:t>
       </w:r>
     </w:p>
     <w:p>
@@ -2524,12 +2580,12 @@
         <w:keepNext/>
       </w:pPr>
       <w:r>
-        <w:t xml:space="preserve">Migration, embedded analytics and Fabric readiness</w:t>
-      </w:r>
-    </w:p>
-    <w:p>
-      <w:r>
-        <w:t xml:space="preserve">Move reporting off spreadsheets or another BI tool such as Tableau or Qlik, without losing the logic your teams rely on. We embed dashboards in customer and investor portals with Power BI Embedded, and assess whether Microsoft Fabric is the right next step ahead of planning a migration.</w:t>
+        <w:t xml:space="preserve">Migration, embedded analytics and data platform readiness</w:t>
+      </w:r>
+    </w:p>
+    <w:p>
+      <w:r>
+        <w:t xml:space="preserve">We migrate reports from other BI tools to Power BI, carrying your business logic across and redesigning each visual for the new platform instead of copying screens one for one. We also move reporting off spreadsheets, embed dashboards in customer and investor portals with Power BI Embedded, and assess readiness for a unified data platform so any move happens in planned stages.</w:t>
       </w:r>
     </w:p>
     <w:p>
@@ -2552,7 +2608,7 @@
     </w:p>
     <w:p>
       <w:r>
-        <w:t xml:space="preserve">Three tracks: Executive, for reading and questioning dashboards; Business User, for building reports; and Developer, for data modelling and advanced DAX. Sessions run on-site in Dubai, remotely or in a hybrid format, with Arabic-language delivery available. Documentation and ongoing support keep the platform healthy after handover.</w:t>
+        <w:t xml:space="preserve">We train in three tracks: Executive, for reading and questioning dashboards; Business User, for building reports; and Developer, for data modelling and advanced DAX. Sessions run on-site in Dubai, remotely or in a hybrid format, and can be delivered in Arabic. Contextual documentation written around your own reports, plus ongoing support, keeps your team self-sufficient after handover.</w:t>
       </w:r>
     </w:p>
     <w:p>
@@ -2561,7 +2617,7 @@
         <w:keepNext/>
       </w:pPr>
       <w:r>
-        <w:t xml:space="preserve">S9  ·  Mid-page CTA 1</w:t>
+        <w:t xml:space="preserve">S8  ·  Mid-page CTA 1</w:t>
       </w:r>
     </w:p>
     <w:p>
@@ -2575,7 +2631,7 @@
     </w:p>
     <w:p>
       <w:r>
-        <w:t xml:space="preserve">Send a file from your systems or use our demo figures, then tell us what to click next.</w:t>
+        <w:t xml:space="preserve">Watch us work through sample figures or an extract from your own systems in a live session.</w:t>
       </w:r>
     </w:p>
     <w:p>
@@ -2605,7 +2661,7 @@
         <w:keepNext/>
       </w:pPr>
       <w:r>
-        <w:t xml:space="preserve">S10  ·  5-step proof of concept (highlighted band)  ·  #methodology</w:t>
+        <w:t xml:space="preserve">S9  ·  5-step proof of concept (highlighted band)  ·  #methodology</w:t>
       </w:r>
     </w:p>
     <w:p>
@@ -2622,7 +2678,7 @@
         <w:pStyle w:val="Heading2"/>
         <w:keepNext/>
       </w:pPr>
-      <w:bookmarkStart w:name="methodology" w:id="7"/>
+      <w:bookmarkStart w:name="methodology" w:id="6"/>
       <w:r>
         <w:t xml:space="preserve">A Working Power BI Dashboard on Your Data in 7 Days</w:t>
       </w:r>
@@ -2630,9 +2686,9 @@
         <w:rPr>
           <w:vertAlign w:val="superscript"/>
         </w:rPr>
-        <w:t xml:space="preserve">9</w:t>
-      </w:r>
-      <w:bookmarkEnd w:id="7"/>
+        <w:t xml:space="preserve">7</w:t>
+      </w:r>
+      <w:bookmarkEnd w:id="6"/>
     </w:p>
     <w:p>
       <w:pPr>
@@ -2640,7 +2696,7 @@
         <w:keepNext/>
       </w:pPr>
       <w:r>
-        <w:t xml:space="preserve">A proof of concept shows the value on your own data, measured against success criteria agreed at the start, well before any larger investment is on the table. The next decision is then made on working evidence, not on a slide deck.</w:t>
+        <w:t xml:space="preserve">We prove the value on your own data for a defined use case, measured against success criteria agreed at the outset, while the investment is still small. Your next decision then rests on pages your team has clicked through itself.</w:t>
       </w:r>
     </w:p>
     <w:p>
@@ -2663,7 +2719,7 @@
     </w:p>
     <w:p>
       <w:r>
-        <w:t xml:space="preserve">A structured workshop pins down your objectives, the KPIs that matter, the data sources involved and how success will be judged.</w:t>
+        <w:t xml:space="preserve">A structured workshop fixes your objectives, the KPIs that matter most, the data sources involved and how success will be measured.</w:t>
       </w:r>
     </w:p>
     <w:p>
@@ -2686,7 +2742,7 @@
     </w:p>
     <w:p>
       <w:r>
-        <w:t xml:space="preserve">Your raw extracts are loaded, cleaned and reshaped until they can be trusted, then modelled for fast reporting.</w:t>
+        <w:t xml:space="preserve">We ingest, cleanse and transform your extracts, then build optimised data models ready for fast reporting.</w:t>
       </w:r>
     </w:p>
     <w:p>
@@ -2709,7 +2765,7 @@
     </w:p>
     <w:p>
       <w:r>
-        <w:t xml:space="preserve">Wireframes and visual mockups go to your stakeholders, and nothing is built until they approve the design.</w:t>
+        <w:t xml:space="preserve">Stakeholders review wireframes and visual mockups, and development starts only when they have approved the design.</w:t>
       </w:r>
     </w:p>
     <w:p>
@@ -2732,7 +2788,7 @@
     </w:p>
     <w:p>
       <w:r>
-        <w:t xml:space="preserve">Our developers build the interactive pages exactly as signed off, on top of the models from step two.</w:t>
+        <w:t xml:space="preserve">Our developers build the interactive reports, dashboards and visuals to the approved design, on the step-two models.</w:t>
       </w:r>
     </w:p>
     <w:p>
@@ -2755,7 +2811,7 @@
     </w:p>
     <w:p>
       <w:r>
-        <w:t xml:space="preserve">Users get hands-on training and give feedback, one revision round follows, and the finished app goes live in your tenant.</w:t>
+        <w:t xml:space="preserve">Users get hands-on training and give feedback, one revision round follows, and we publish the finished Power BI app to your tenant.</w:t>
       </w:r>
     </w:p>
     <w:p>
@@ -2785,7 +2841,7 @@
         <w:keepNext/>
       </w:pPr>
       <w:r>
-        <w:t xml:space="preserve">S11  ·  Engagement models and PowerUP!  ·  #packages</w:t>
+        <w:t xml:space="preserve">S10  ·  Engagement models and PowerUP!  ·  #packages</w:t>
       </w:r>
     </w:p>
     <w:p>
@@ -2802,11 +2858,11 @@
         <w:pStyle w:val="Heading2"/>
         <w:keepNext/>
       </w:pPr>
-      <w:bookmarkStart w:name="packages" w:id="8"/>
+      <w:bookmarkStart w:name="packages" w:id="7"/>
       <w:r>
         <w:t xml:space="preserve">Engagement Models That Match Where You Are Today</w:t>
       </w:r>
-      <w:bookmarkEnd w:id="8"/>
+      <w:bookmarkEnd w:id="7"/>
     </w:p>
     <w:p>
       <w:pPr>
@@ -2814,7 +2870,7 @@
         <w:keepNext/>
       </w:pPr>
       <w:r>
-        <w:t xml:space="preserve">Some teams want a quick, fixed-scope win. Others need a phased rollout across departments, or specialist expertise added to an in-house BI team. Pick the model that fits your starting point and change it as you grow.</w:t>
+        <w:t xml:space="preserve">We offer four ways in: explore before you spend, implement in phases, extend your own team, or hand us the ongoing care. You can switch models as your needs change.</w:t>
       </w:r>
     </w:p>
     <w:p>
@@ -2832,7 +2888,7 @@
         <w:keepNext/>
       </w:pPr>
       <w:r>
-        <w:t xml:space="preserve">Microsoft Power BI PowerUP!</w:t>
+        <w:t xml:space="preserve">PowerUP!: HLB HAMT's Fixed-Price Power BI Accelerator</w:t>
       </w:r>
     </w:p>
     <w:p>
@@ -2845,7 +2901,7 @@
     </w:p>
     <w:p>
       <w:r>
-        <w:t xml:space="preserve">PowerUP! is for teams with questions they can't yet answer from data they already own. From workshop to go-live, we wire in your spreadsheets and exports, then sit down with you to choose the KPIs that answer those questions first. Scope is capped, which is what keeps the price fixed.</w:t>
+        <w:t xml:space="preserve">PowerUP! is for organisations sitting on useful data that nobody has yet turned into answers. We connect your files, chart the KPIs your stakeholders care about most, and guide your team towards early results against objectives agreed on day one. Because the scope is capped, the fee does not move.</w:t>
       </w:r>
     </w:p>
     <w:p>
@@ -2868,7 +2924,7 @@
         <w:spacing w:after="30"/>
       </w:pPr>
       <w:r>
-        <w:t xml:space="preserve">A requirements workshop to capture a clear use case</w:t>
+        <w:t xml:space="preserve">A requirements workshop that pins down a clear use case</w:t>
       </w:r>
     </w:p>
     <w:p>
@@ -2910,7 +2966,7 @@
         <w:spacing w:after="30"/>
       </w:pPr>
       <w:r>
-        <w:t xml:space="preserve">Up to 2 consumer personas</w:t>
+        <w:t xml:space="preserve">Up to 2 distinct consumer personas</w:t>
       </w:r>
     </w:p>
     <w:p>
@@ -2924,7 +2980,7 @@
         <w:spacing w:after="120"/>
       </w:pPr>
       <w:r>
-        <w:t xml:space="preserve">Design approved at mockup, plus 1 revision round after functional delivery</w:t>
+        <w:t xml:space="preserve">Mockup approval, then 1 revision round after functional delivery</w:t>
       </w:r>
     </w:p>
     <w:p>
@@ -3060,7 +3116,7 @@
           <w:iCs/>
           <w:color w:val="005A77"/>
         </w:rPr>
-        <w:t xml:space="preserve">See it working before you spend on a full build.</w:t>
+        <w:t xml:space="preserve">Proof on real numbers first, a bigger build later.</w:t>
       </w:r>
     </w:p>
     <w:p>
@@ -3074,7 +3130,7 @@
     </w:p>
     <w:p>
       <w:r>
-        <w:t xml:space="preserve">A consultant-led session exploring dashboards built on sample data or extracts you share.</w:t>
+        <w:t xml:space="preserve">A consultant-led session, at no cost, on sample data or a dataset of your choosing.</w:t>
       </w:r>
     </w:p>
     <w:p>
@@ -3121,7 +3177,7 @@
           <w:iCs/>
           <w:color w:val="005A77"/>
         </w:rPr>
-        <w:t xml:space="preserve">Rollouts scoped to one team, several, or the enterprise.</w:t>
+        <w:t xml:space="preserve">Rollouts sized to one department, several, or the whole group.</w:t>
       </w:r>
     </w:p>
     <w:p>
@@ -3149,7 +3205,7 @@
     </w:p>
     <w:p>
       <w:r>
-        <w:t xml:space="preserve">Shared semantic models and a workspace structure that several departments can build on together.</w:t>
+        <w:t xml:space="preserve">Shared semantic models and a workspace structure that several departments build on together.</w:t>
       </w:r>
     </w:p>
     <w:p>
@@ -3163,7 +3219,7 @@
     </w:p>
     <w:p>
       <w:r>
-        <w:t xml:space="preserve">Group-wide reporting on a medallion lakehouse, governed centrally and delivered in phases.</w:t>
+        <w:t xml:space="preserve">Group reporting on a medallion lakehouse, delivered in phases under central governance.</w:t>
       </w:r>
     </w:p>
     <w:p>
@@ -3185,7 +3241,7 @@
           <w:iCs/>
           <w:color w:val="005A77"/>
         </w:rPr>
-        <w:t xml:space="preserve">Specialist help for the parts your team hasn't covered yet.</w:t>
+        <w:t xml:space="preserve">Extra hands for the parts your team hasn't covered yet.</w:t>
       </w:r>
     </w:p>
     <w:p>
@@ -3199,7 +3255,7 @@
     </w:p>
     <w:p>
       <w:r>
-        <w:t xml:space="preserve">Existing connectors configured, or custom ones written, for sources your reports depend on.</w:t>
+        <w:t xml:space="preserve">Setup for sources your reports can't currently reach, from standard connectors to custom builds.</w:t>
       </w:r>
     </w:p>
     <w:p>
@@ -3213,7 +3269,7 @@
     </w:p>
     <w:p>
       <w:r>
-        <w:t xml:space="preserve">A Power BI solutions expert working inside your team, on short-term contract or long-term retainer.</w:t>
+        <w:t xml:space="preserve">A Power BI solutions expert working inside your team, on a short-term contract or retainer.</w:t>
       </w:r>
     </w:p>
     <w:p>
@@ -3235,7 +3291,7 @@
           <w:iCs/>
           <w:color w:val="005A77"/>
         </w:rPr>
-        <w:t xml:space="preserve">Ongoing care once your dashboards are part of daily work.</w:t>
+        <w:t xml:space="preserve">Keeping live reports fast, accurate and secure.</w:t>
       </w:r>
     </w:p>
     <w:p>
@@ -3249,7 +3305,7 @@
     </w:p>
     <w:p>
       <w:r>
-        <w:t xml:space="preserve">Refresh failures, slow pages and data issues investigated and fixed by consultants who know your model.</w:t>
+        <w:t xml:space="preserve">We investigate refresh failures, gateway connectivity problems and slow pages, then fix the root cause.</w:t>
       </w:r>
     </w:p>
     <w:p>
@@ -3263,7 +3319,7 @@
     </w:p>
     <w:p>
       <w:r>
-        <w:t xml:space="preserve">A review every quarter of models, refresh schedules, capacity use and security settings.</w:t>
+        <w:t xml:space="preserve">A review every three months of models, refresh schedules, capacity use and security settings.</w:t>
       </w:r>
     </w:p>
     <w:p>
@@ -3277,21 +3333,35 @@
     </w:p>
     <w:p>
       <w:r>
-        <w:t xml:space="preserve">Extra pages, measures and reports added when the business starts asking different questions.</w:t>
-      </w:r>
-    </w:p>
-    <w:p>
-      <w:pPr>
-        <w:pStyle w:val="Heading3"/>
-        <w:keepNext/>
-      </w:pPr>
-      <w:r>
-        <w:t xml:space="preserve">Licence advisory and Fabric migration</w:t>
-      </w:r>
-    </w:p>
-    <w:p>
-      <w:r>
-        <w:t xml:space="preserve">Help administering the platform, right-sizing licences and planning a move to Fabric.</w:t>
+        <w:t xml:space="preserve">Extra pages, measures and reports as the business starts asking different questions.</w:t>
+      </w:r>
+    </w:p>
+    <w:p>
+      <w:pPr>
+        <w:pStyle w:val="Heading3"/>
+        <w:keepNext/>
+      </w:pPr>
+      <w:r>
+        <w:t xml:space="preserve">Licence advisory and data platform migration</w:t>
+      </w:r>
+    </w:p>
+    <w:p>
+      <w:r>
+        <w:t xml:space="preserve">Right-sizing licences, administering your tenant and planning a staged move to a unified data platform.</w:t>
+      </w:r>
+    </w:p>
+    <w:p>
+      <w:pPr>
+        <w:pStyle w:val="Heading3"/>
+        <w:keepNext/>
+      </w:pPr>
+      <w:r>
+        <w:t xml:space="preserve">Security and access reviews</w:t>
+      </w:r>
+    </w:p>
+    <w:p>
+      <w:r>
+        <w:t xml:space="preserve">Row-level security and workspace permissions rechecked as people join, move or leave.</w:t>
       </w:r>
     </w:p>
     <w:p>
@@ -3300,7 +3370,7 @@
         <w:keepNext/>
       </w:pPr>
       <w:r>
-        <w:t xml:space="preserve">S12  ·  HLB HAMT advantage (6-tile credential grid)</w:t>
+        <w:t xml:space="preserve">S11  ·  HLB HAMT advantage (6-tile credential grid)</w:t>
       </w:r>
     </w:p>
     <w:p>
@@ -3317,11 +3387,11 @@
         <w:pStyle w:val="Heading2"/>
         <w:keepNext/>
       </w:pPr>
-      <w:bookmarkStart w:name="advantage" w:id="9"/>
+      <w:bookmarkStart w:name="advantage" w:id="8"/>
       <w:r>
         <w:t xml:space="preserve">Why UAE Businesses Choose HLB HAMT for Power BI Services</w:t>
       </w:r>
-      <w:bookmarkEnd w:id="9"/>
+      <w:bookmarkEnd w:id="8"/>
     </w:p>
     <w:p>
       <w:pPr>
@@ -3329,21 +3399,21 @@
         <w:keepNext/>
       </w:pPr>
       <w:r>
-        <w:t xml:space="preserve">Picking a Power BI consulting company is really a decision about whose numbers you will trust in the boardroom.</w:t>
-      </w:r>
-    </w:p>
-    <w:p>
-      <w:pPr>
-        <w:pStyle w:val="Heading3"/>
-        <w:keepNext/>
-      </w:pPr>
-      <w:r>
-        <w:t xml:space="preserve">Microsoft Power BI partner in the UAE</w:t>
-      </w:r>
-    </w:p>
-    <w:p>
-      <w:r>
-        <w:t xml:space="preserve">Our own staff handle everything from data engineering to aftercare; nothing is subcontracted.</w:t>
+        <w:t xml:space="preserve">We expect to be judged the way any Power BI consulting company should be: on whether your board acts on the figures we deliver.</w:t>
+      </w:r>
+    </w:p>
+    <w:p>
+      <w:pPr>
+        <w:pStyle w:val="Heading3"/>
+        <w:keepNext/>
+      </w:pPr>
+      <w:r>
+        <w:t xml:space="preserve">Power BI reselling partner in the UAE</w:t>
+      </w:r>
+    </w:p>
+    <w:p>
+      <w:r>
+        <w:t xml:space="preserve">We supply your licences, and our own staff handle everything from data engineering to aftercare.</w:t>
       </w:r>
     </w:p>
     <w:p>
@@ -3357,7 +3427,7 @@
     </w:p>
     <w:p>
       <w:r>
-        <w:t xml:space="preserve">Corporate Tax, VAT, IFRS and PDPL expertise built into the data model, not bolted on afterwards.</w:t>
+        <w:t xml:space="preserve">Finance and technology under one roof, with Corporate Tax, VAT, IFRS and PDPL expertise inside the model.</w:t>
       </w:r>
     </w:p>
     <w:p>
@@ -3371,7 +3441,7 @@
     </w:p>
     <w:p>
       <w:r>
-        <w:t xml:space="preserve">Prove the value on your own data, or through the fixed-price PowerUP!, then decide how far to go.</w:t>
+        <w:t xml:space="preserve">Begin with the fixed-price PowerUP! or a working dashboard on your data, then scale once it proves itself.</w:t>
       </w:r>
     </w:p>
     <w:p>
@@ -3385,9 +3455,9 @@
     </w:p>
     <w:p>
       <w:r>
-        <w:t xml:space="preserve">Power BI tracks booked revenue; </w:t>
-      </w:r>
-      <w:hyperlink w:history="1" r:id="rIdy3aehzcqk0fcvazkwvg-x">
+        <w:t xml:space="preserve">Booked revenue in Power BI, open-deal scoring in </w:t>
+      </w:r>
+      <w:hyperlink w:history="1" r:id="rId3apivezgtkf2_m0apct_k">
         <w:r>
           <w:rPr>
             <w:rStyle w:val="Hyperlink"/>
@@ -3396,7 +3466,7 @@
         </w:r>
       </w:hyperlink>
       <w:r>
-        <w:t xml:space="preserve"> scores the deals still open. We deliver and maintain both.</w:t>
+        <w:t xml:space="preserve">, both configured and maintained by our team.</w:t>
       </w:r>
     </w:p>
     <w:p>
@@ -3410,7 +3480,13 @@
     </w:p>
     <w:p>
       <w:r>
-        <w:t xml:space="preserve">Part of the HLB International network, with access to member firms when your group operates abroad.</w:t>
+        <w:t xml:space="preserve">An HLB International member since 2007, bringing the standards and reach of a global advisory network.</w:t>
+      </w:r>
+      <w:r>
+        <w:rPr>
+          <w:vertAlign w:val="superscript"/>
+        </w:rPr>
+        <w:t xml:space="preserve">4</w:t>
       </w:r>
     </w:p>
     <w:p>
@@ -3424,7 +3500,7 @@
     </w:p>
     <w:p>
       <w:r>
-        <w:t xml:space="preserve">Your project team is based in the Emirates and works Gulf business hours, so questions don't wait overnight.</w:t>
+        <w:t xml:space="preserve">Consultants based in the Emirates, on Gulf working hours, and on-site whenever a workshop calls for it.</w:t>
       </w:r>
     </w:p>
     <w:p>
@@ -3433,7 +3509,7 @@
         <w:keepNext/>
       </w:pPr>
       <w:r>
-        <w:t xml:space="preserve">S13  ·  See it in action (static visual; no video supplied)</w:t>
+        <w:t xml:space="preserve">S12  ·  See it in action (static visual; no video supplied)</w:t>
       </w:r>
     </w:p>
     <w:p>
@@ -3450,15 +3526,15 @@
         <w:pStyle w:val="Heading2"/>
         <w:keepNext/>
       </w:pPr>
-      <w:bookmarkStart w:name="demo" w:id="10"/>
-      <w:r>
-        <w:t xml:space="preserve">Inside a Live Power BI Dashboard</w:t>
-      </w:r>
-      <w:bookmarkEnd w:id="10"/>
-    </w:p>
-    <w:p>
-      <w:r>
-        <w:t xml:space="preserve">An example of the executive views we build, in Arabic and English, drilling from the group total down to each entity with every figure reconciling along the way.</w:t>
+      <w:bookmarkStart w:name="demo" w:id="9"/>
+      <w:r>
+        <w:t xml:space="preserve">Inside an HLB HAMT Power BI Dashboard</w:t>
+      </w:r>
+      <w:bookmarkEnd w:id="9"/>
+    </w:p>
+    <w:p>
+      <w:r>
+        <w:t xml:space="preserve">A sample of the executive views we build, in Arabic and English, drilling from the group total to each entity with every subtotal adding up on the way down.</w:t>
       </w:r>
     </w:p>
     <w:p>
@@ -3503,7 +3579,7 @@
         <w:keepNext/>
       </w:pPr>
       <w:r>
-        <w:t xml:space="preserve">S14  ·  Mid-page CTA 2</w:t>
+        <w:t xml:space="preserve">S13  ·  Mid-page CTA 2</w:t>
       </w:r>
     </w:p>
     <w:p>
@@ -3512,12 +3588,12 @@
         <w:keepNext/>
       </w:pPr>
       <w:r>
-        <w:t xml:space="preserve">Talk Through Your Roadmap With a Specialist</w:t>
-      </w:r>
-    </w:p>
-    <w:p>
-      <w:r>
-        <w:t xml:space="preserve">Share your reporting wish list, and a Power BI solutions expert will map it to sources, licences and phases, free of charge.</w:t>
+        <w:t xml:space="preserve">Map Out Your Reporting Roadmap, Free of Charge</w:t>
+      </w:r>
+    </w:p>
+    <w:p>
+      <w:r>
+        <w:t xml:space="preserve">Share what you need to report on, and a Power BI solutions expert will scope sources, licences and phasing with you.</w:t>
       </w:r>
     </w:p>
     <w:p>
@@ -3547,7 +3623,7 @@
         <w:keepNext/>
       </w:pPr>
       <w:r>
-        <w:t xml:space="preserve">S15  ·  FAQ (single accordion, first item open)  ·  #faq</w:t>
+        <w:t xml:space="preserve">S14  ·  FAQ (single accordion, first item open)  ·  #faq</w:t>
       </w:r>
     </w:p>
     <w:p>
@@ -3564,11 +3640,11 @@
         <w:pStyle w:val="Heading2"/>
         <w:keepNext/>
       </w:pPr>
-      <w:bookmarkStart w:name="faq" w:id="11"/>
+      <w:bookmarkStart w:name="faq" w:id="10"/>
       <w:r>
         <w:t xml:space="preserve">Questions UAE Teams Ask Before Choosing a Power BI Partner</w:t>
       </w:r>
-      <w:bookmarkEnd w:id="11"/>
+      <w:bookmarkEnd w:id="10"/>
     </w:p>
     <w:p>
       <w:pPr>
@@ -3581,16 +3657,16 @@
     </w:p>
     <w:p>
       <w:r>
-        <w:t xml:space="preserve">Power BI Desktop is Microsoft's free Windows application for connecting to data, building the semantic model and designing reports.</w:t>
+        <w:t xml:space="preserve">Power BI Desktop is a free, installable application for connecting to data, modelling it and designing reports.</w:t>
       </w:r>
       <w:r>
         <w:rPr>
           <w:vertAlign w:val="superscript"/>
         </w:rPr>
-        <w:t xml:space="preserve">5</w:t>
-      </w:r>
-      <w:r>
-        <w:t xml:space="preserve"> The Power BI service is the browser-based cloud platform where those reports go live: they are shared as apps, refreshed automatically and protected by access rules. Authors tend to work in Desktop, while everyone else reads and interacts with reports online. We set up both, including a workspace structure that keeps the right numbers in front of the right people.</w:t>
+        <w:t xml:space="preserve">6</w:t>
+      </w:r>
+      <w:r>
+        <w:t xml:space="preserve"> The Power BI service runs in the browser: access rules decide who sees each published report, data refreshes on its own schedule, and related reports are grouped into apps for each audience. Report authors mostly work in Desktop; everyone else uses the cloud. We set up both, with a workspace structure matched to how your organisation shares information.</w:t>
       </w:r>
     </w:p>
     <w:p>
@@ -3604,44 +3680,66 @@
     </w:p>
     <w:p>
       <w:r>
-        <w:t xml:space="preserve">At the time of writing, Microsoft lists Power BI Pro at US$14 and Premium Per User at US$24 per user per month, the list prices since 1 April 2025.</w:t>
+        <w:t xml:space="preserve">Your total cost has three parts: licences, implementation and dashboard development, and data integration and modelling, each scaled to your scope. At the time of writing, Microsoft's list prices are US$14 per user per month for Pro and US$24 for Premium Per User, unchanged since 1 April 2025.</w:t>
       </w:r>
       <w:r>
         <w:rPr>
           <w:vertAlign w:val="superscript"/>
         </w:rPr>
-        <w:t xml:space="preserve">10</w:t>
-      </w:r>
-      <w:r>
-        <w:t xml:space="preserve"> Per-user licences suit teams where most people both view and share reports. Larger deployments, embedding for external audiences and Copilot run on Fabric capacity, which is priced separately. Our licence advisory works out which mix fits your user base, so you aren't paying for seats or capacity nobody uses.</w:t>
-      </w:r>
-    </w:p>
-    <w:p>
-      <w:pPr>
-        <w:pStyle w:val="Heading3"/>
-        <w:keepNext/>
-      </w:pPr>
-      <w:r>
-        <w:t xml:space="preserve">Which data sources can Power BI connect to, and do we need a data warehouse first?</w:t>
-      </w:r>
-    </w:p>
-    <w:p>
-      <w:r>
-        <w:t xml:space="preserve">Most business systems are within reach. Microsoft's own connectors, partner-built connectors and custom builds cover sources such as SAP, Oracle, NetSuite, Dynamics 365, Salesforce, SugarCRM, Tally, QuickBooks, SQL Server, Snowflake, Google BigQuery and REST APIs. A warehouse is not always the first step. For a smaller scope with a handful of sources, connecting directly works well. Once data is spread across five or more systems, a lakehouse is usually worth it: every report reconciles to the same cleaned tables.</w:t>
-      </w:r>
-    </w:p>
-    <w:p>
-      <w:pPr>
-        <w:pStyle w:val="Heading3"/>
-        <w:keepNext/>
-      </w:pPr>
-      <w:r>
-        <w:t xml:space="preserve">Can Power BI replace our manual Excel reports?</w:t>
-      </w:r>
-    </w:p>
-    <w:p>
-      <w:r>
-        <w:t xml:space="preserve">Yes, and it is often the first job we take on. Instead of someone rebuilding spreadsheets every Monday, data refreshes on a schedule and dashboards always show current figures. Power Automate can email whoever owns a figure the moment it moves outside its agreed range. For clients in the Emirates, that Monday routine used to cost hours; now it largely runs itself. Excel stays available for anyone who still prefers to analyse there.</w:t>
+        <w:t xml:space="preserve">8</w:t>
+      </w:r>
+      <w:r>
+        <w:t xml:space="preserve"> Large deployments and external embedding run on capacity-based licensing, priced separately. As a reselling partner, we advise on the right licence mix and supply it, and </w:t>
+      </w:r>
+      <w:hyperlink w:history="1" w:anchor="packages">
+        <w:r>
+          <w:rPr>
+            <w:rStyle w:val="Hyperlink"/>
+          </w:rPr>
+          <w:t xml:space="preserve">PowerUP!</w:t>
+        </w:r>
+      </w:hyperlink>
+      <w:r>
+        <w:t xml:space="preserve"> gives you a fixed-price way to start.</w:t>
+      </w:r>
+    </w:p>
+    <w:p>
+      <w:pPr>
+        <w:pStyle w:val="Heading3"/>
+        <w:keepNext/>
+      </w:pPr>
+      <w:r>
+        <w:t xml:space="preserve">Which of our systems can you connect to Power BI, and do we need a warehouse first?</w:t>
+      </w:r>
+    </w:p>
+    <w:p>
+      <w:r>
+        <w:t xml:space="preserve">Most of them. Where a standard or partner-built connector exists, we use it, and we write custom connectors for legacy systems that have none. That covers accounting packages, ERP and CRM platforms, on-premises databases, cloud warehouses and REST APIs. A warehouse is not always step one. For a handful of sources, direct connection is fine. Once data spreads across five or more systems, we recommend a lakehouse so every report works from the same cleaned tables.</w:t>
+      </w:r>
+    </w:p>
+    <w:p>
+      <w:pPr>
+        <w:pStyle w:val="Heading3"/>
+        <w:keepNext/>
+      </w:pPr>
+      <w:r>
+        <w:t xml:space="preserve">Can you replace our manual spreadsheet reports with Power BI?</w:t>
+      </w:r>
+    </w:p>
+    <w:p>
+      <w:r>
+        <w:t xml:space="preserve">Yes. It is often the first thing clients ask us to fix. Rather than a team member copying figures between workbooks every week, data refreshes on a schedule and dashboards stay current. Through </w:t>
+      </w:r>
+      <w:hyperlink w:history="1" r:id="rIdssdcc3oruhe0bjdtpulsw">
+        <w:r>
+          <w:rPr>
+            <w:rStyle w:val="Hyperlink"/>
+          </w:rPr>
+          <w:t xml:space="preserve">Power BI automation</w:t>
+        </w:r>
+      </w:hyperlink>
+      <w:r>
+        <w:t xml:space="preserve">, we set alerts that email a KPI's owner the moment it moves outside its agreed range. Clients in the Emirates have taken hours of weekly manual reporting off their teams. Spreadsheets stay available for anyone who prefers to analyse there.</w:t>
       </w:r>
     </w:p>
     <w:p>
@@ -3655,7 +3753,7 @@
     </w:p>
     <w:p>
       <w:r>
-        <w:t xml:space="preserve">Yes. We plan right-to-left layouts before the first visual is placed, instead of mirroring an English report at the end. Labels, filters, slicers and KPI descriptions appear in Arabic, and page layouts, visual order and navigation read right to left. The same approach works for other right-to-left languages such as Urdu and Persian. Where you need Arabic and English versions of the same report, both sit on one model and the numbers always match.</w:t>
+        <w:t xml:space="preserve">Yes. We design right-to-left from the first wireframe rather than mirroring a finished English report. Labels, filters, slicers and KPI descriptions appear in Arabic, while page layout, visual order and navigation all run right to left. We apply the same method to other right-to-left languages, such as Urdu and Persian. When you need Arabic and English editions of one report, both run on a single model, so their totals always agree.</w:t>
       </w:r>
     </w:p>
     <w:p>
@@ -3669,16 +3767,16 @@
     </w:p>
     <w:p>
       <w:r>
-        <w:t xml:space="preserve">Yes. Row-level security limits each user to the rows they are entitled to see, data is encrypted, and the platform sits within the scope of Microsoft's ISO/IEC 27001 certification and SOC 2 reports.</w:t>
+        <w:t xml:space="preserve">We configure row-level security so people see only the records they are entitled to, and data is encrypted. Power BI falls within the scope of Microsoft's ISO/IEC 27001 and SOC 2 audits.</w:t>
       </w:r>
       <w:r>
         <w:rPr>
           <w:vertAlign w:val="superscript"/>
         </w:rPr>
-        <w:t xml:space="preserve">11</w:t>
-      </w:r>
-      <w:r>
-        <w:t xml:space="preserve"> Your data can be hosted in Microsoft's Dubai or Abu Dhabi cloud regions</w:t>
+        <w:t xml:space="preserve">9</w:t>
+      </w:r>
+      <w:r>
+        <w:t xml:space="preserve"> Data can be kept in-country in the Dubai or Abu Dhabi cloud region</w:t>
       </w:r>
       <w:r>
         <w:rPr>
@@ -3689,7 +3787,7 @@
       <w:r>
         <w:t xml:space="preserve">, and our </w:t>
       </w:r>
-      <w:hyperlink w:history="1" r:id="rIdm4fzfsunznnmjkah6m90x">
+      <w:hyperlink w:history="1" r:id="rIdul1b_aue8dpppfadztibi">
         <w:r>
           <w:rPr>
             <w:rStyle w:val="Hyperlink"/>
@@ -3698,47 +3796,61 @@
         </w:r>
       </w:hyperlink>
       <w:r>
-        <w:t xml:space="preserve"> team helps set each environment up in line with PDPL, DIFC and ADGM requirements. Outside the US and EU data boundaries, Copilot is off by default unless an admin allows cross-region processing. We make that call with you.</w:t>
+        <w:t xml:space="preserve"> team sets each environment up in line with PDPL, DIFC and ADGM requirements. Outside the US and EU data boundaries, Power BI's AI assistant stays off unless an admin allows cross-region processing; we make that call with you.</w:t>
       </w:r>
       <w:r>
         <w:rPr>
           <w:vertAlign w:val="superscript"/>
         </w:rPr>
-        <w:t xml:space="preserve">8</w:t>
-      </w:r>
-    </w:p>
-    <w:p>
-      <w:pPr>
-        <w:pStyle w:val="Heading3"/>
-        <w:keepNext/>
-      </w:pPr>
-      <w:r>
-        <w:t xml:space="preserve">What is Microsoft Fabric, and should we plan for it?</w:t>
-      </w:r>
-    </w:p>
-    <w:p>
-      <w:r>
-        <w:t xml:space="preserve">Fabric is the larger Microsoft service that Power BI now belongs to. Its other workloads (real-time analytics, data engineering and warehousing) share one pool of capacity. Fabric pays off when reporting depends on several large or fast-moving sources, when engineers and analysts should query a single copy of the data, or when your per-user licence costs are climbing. For a single team reporting from a couple of systems, it can wait. Our readiness assessment tells you which situation you are in and plans any migration in stages.</w:t>
-      </w:r>
-    </w:p>
-    <w:p>
-      <w:pPr>
-        <w:pStyle w:val="Heading3"/>
-        <w:keepNext/>
-      </w:pPr>
-      <w:r>
-        <w:t xml:space="preserve">What do we need to use Copilot in Power BI?</w:t>
-      </w:r>
-    </w:p>
-    <w:p>
-      <w:r>
-        <w:t xml:space="preserve">Three things. First, paid capacity: Fabric F2 or higher, or Premium P1 or higher, because Pro or Premium Per User licences alone do not include it. Second, an administrator has to enable Copilot in the tenant settings. Third, a well-prepared semantic model, with clear table names, descriptions and tested measures; that groundwork makes Copilot's answers reliable. Microsoft officially supports English prompts only at present, so we design Arabic into the reports themselves rather than into the questions.</w:t>
+        <w:t xml:space="preserve">10</w:t>
+      </w:r>
+    </w:p>
+    <w:p>
+      <w:pPr>
+        <w:pStyle w:val="Heading3"/>
+        <w:keepNext/>
+      </w:pPr>
+      <w:r>
+        <w:t xml:space="preserve">Do we need a data platform beyond Power BI, and when?</w:t>
+      </w:r>
+    </w:p>
+    <w:p>
+      <w:r>
+        <w:t xml:space="preserve">Not always. Power BI handles most departmental reporting on its own. Microsoft's wider data platform, which adds data engineering, warehousing and real-time analytics on a common pool of capacity, becomes worth planning for once you feed reports from large or fast-changing sources, once engineering and analyst teams want to work off a shared copy of the data, or once per-user licence spend outgrows capacity pricing. Our readiness assessment tells you where you stand, and if the move makes sense, we plan it in stages.</w:t>
+      </w:r>
+    </w:p>
+    <w:p>
+      <w:pPr>
+        <w:pStyle w:val="Heading3"/>
+        <w:keepNext/>
+      </w:pPr>
+      <w:r>
+        <w:t xml:space="preserve">Does Power BI include AI features, and what do we need to use them?</w:t>
+      </w:r>
+    </w:p>
+    <w:p>
+      <w:r>
+        <w:t xml:space="preserve">Yes. Power BI includes a generative AI assistant that answers plain-language questions and drafts written summaries of report pages. It runs only on paid capacity, a higher-tier licence bought for the whole organisation; Pro and Premium Per User on their own are not enough. A tenant administrator must also switch it on, and the semantic model needs clear table names, descriptions and tested measures, which we prepare. Prompts are officially supported in English only for now, so we put Arabic into report design instead.</w:t>
       </w:r>
       <w:r>
         <w:rPr>
           <w:vertAlign w:val="superscript"/>
         </w:rPr>
-        <w:t xml:space="preserve">8</w:t>
+        <w:t xml:space="preserve">10</w:t>
+      </w:r>
+    </w:p>
+    <w:p>
+      <w:pPr>
+        <w:pStyle w:val="Heading3"/>
+        <w:keepNext/>
+      </w:pPr>
+      <w:r>
+        <w:t xml:space="preserve">Why are some Power BI dashboards slow, and can you fix ours?</w:t>
+      </w:r>
+    </w:p>
+    <w:p>
+      <w:r>
+        <w:t xml:space="preserve">Usually, yes. The tool is rarely the problem; how the report was built almost always is. Typical causes are a weak data model, inefficient DAX or queries, large datasets nobody has optimised, and missing aggregations or indexing. We work through the pipeline, the model and the semantic layer: trimming what each visual asks for, adding aggregation tables and rewriting heavy measures. Every fix is retested at realistic data volumes before the report goes back to your users.</w:t>
       </w:r>
     </w:p>
     <w:p>
@@ -3752,7 +3864,7 @@
     </w:p>
     <w:p>
       <w:r>
-        <w:t xml:space="preserve">It depends on scope. A single-department rollout usually takes two to four weeks. A multi-department programme runs six to ten weeks, and an enterprise build with a data lakehouse takes three to six months. Whatever the size, a working prototype arrives within two weeks, early enough for your feedback to shape the build. Timelines are confirmed once discovery has shown the state of your data and the number of sources involved.</w:t>
+        <w:t xml:space="preserve">Scope drives the timeline. Expect two to four weeks for a single department, six to ten weeks for a multi-department programme, and three to six months for an enterprise build on a data lakehouse. In every case you get a working prototype inside the first two weeks, so your feedback steers the rest of the build. HLB HAMT confirms the timeline after discovery, once we know the condition of your data and how many sources are involved.</w:t>
       </w:r>
     </w:p>
     <w:p>
@@ -3773,30 +3885,23 @@
         </w:numPr>
         <w:spacing w:after="40"/>
       </w:pPr>
-      <w:r>
-        <w:rPr>
-          <w:sz w:val="16"/>
-          <w:szCs w:val="16"/>
-        </w:rPr>
-        <w:t xml:space="preserve">Microsoft Learn, "Fabric region availability" (UAE North and UAE Central).</w:t>
-      </w:r>
-      <w:r>
-        <w:rPr>
-          <w:sz w:val="16"/>
-          <w:szCs w:val="16"/>
-        </w:rPr>
-        <w:t xml:space="preserve"> </w:t>
-      </w:r>
-      <w:hyperlink w:history="1" r:id="rId-us6bjl3j7ne1csuyzncj">
+      <w:hyperlink w:history="1" r:id="rIdh6bdviwsikfn2sjohj7ci">
         <w:r>
           <w:rPr>
             <w:rStyle w:val="Hyperlink"/>
             <w:sz w:val="16"/>
             <w:szCs w:val="16"/>
           </w:rPr>
-          <w:t xml:space="preserve">https://learn.microsoft.com/en-us/fabric/admin/region-availability</w:t>
+          <w:t xml:space="preserve">Microsoft Learn, cloud region availability for Power BI and Microsoft's data platform</w:t>
         </w:r>
       </w:hyperlink>
+      <w:r>
+        <w:rPr>
+          <w:sz w:val="16"/>
+          <w:szCs w:val="16"/>
+        </w:rPr>
+        <w:t xml:space="preserve">.</w:t>
+      </w:r>
     </w:p>
     <w:p>
       <w:pPr>
@@ -3807,30 +3912,23 @@
         </w:numPr>
         <w:spacing w:after="40"/>
       </w:pPr>
-      <w:r>
-        <w:rPr>
-          <w:sz w:val="16"/>
-          <w:szCs w:val="16"/>
-        </w:rPr>
-        <w:t xml:space="preserve">Microsoft Learn, "Data sources in Power BI Desktop".</w:t>
-      </w:r>
-      <w:r>
-        <w:rPr>
-          <w:sz w:val="16"/>
-          <w:szCs w:val="16"/>
-        </w:rPr>
-        <w:t xml:space="preserve"> </w:t>
-      </w:r>
-      <w:hyperlink w:history="1" r:id="rIdzshi0mtrvzyyku0ncnsjp">
+      <w:hyperlink w:history="1" r:id="rIdxttrp-urqtzo73yiprb1a">
         <w:r>
           <w:rPr>
             <w:rStyle w:val="Hyperlink"/>
             <w:sz w:val="16"/>
             <w:szCs w:val="16"/>
           </w:rPr>
-          <w:t xml:space="preserve">https://learn.microsoft.com/en-us/power-bi/connect-data/desktop-data-sources</w:t>
+          <w:t xml:space="preserve">Microsoft Learn, "Data sources in Power BI Desktop"</w:t>
         </w:r>
       </w:hyperlink>
+      <w:r>
+        <w:rPr>
+          <w:sz w:val="16"/>
+          <w:szCs w:val="16"/>
+        </w:rPr>
+        <w:t xml:space="preserve">.</w:t>
+      </w:r>
     </w:p>
     <w:p>
       <w:pPr>
@@ -3841,12 +3939,22 @@
         </w:numPr>
         <w:spacing w:after="40"/>
       </w:pPr>
+      <w:hyperlink w:history="1" r:id="rIdupeedkvnlj8omoxxmtzs3">
+        <w:r>
+          <w:rPr>
+            <w:rStyle w:val="Hyperlink"/>
+            <w:sz w:val="16"/>
+            <w:szCs w:val="16"/>
+          </w:rPr>
+          <w:t xml:space="preserve">HLB HAMT, Data Visualization Services</w:t>
+        </w:r>
+      </w:hyperlink>
       <w:r>
         <w:rPr>
           <w:sz w:val="16"/>
           <w:szCs w:val="16"/>
         </w:rPr>
-        <w:t xml:space="preserve">HLB HAMT client engagement (internal). No public source.</w:t>
+        <w:t xml:space="preserve"> ("In a recent engagement, we achieved a 33x improvement in report load times and interactivity").</w:t>
       </w:r>
     </w:p>
     <w:p>
@@ -3858,45 +3966,39 @@
         </w:numPr>
         <w:spacing w:after="40"/>
       </w:pPr>
-      <w:r>
-        <w:rPr>
-          <w:sz w:val="16"/>
-          <w:szCs w:val="16"/>
-        </w:rPr>
-        <w:t xml:space="preserve">Microsoft, "Microsoft named a Leader in the 2026 Gartner Magic Quadrant for Analytics and BI Platforms" (Power BI Updates Blog).</w:t>
-      </w:r>
-      <w:r>
-        <w:rPr>
-          <w:sz w:val="16"/>
-          <w:szCs w:val="16"/>
-        </w:rPr>
-        <w:t xml:space="preserve"> </w:t>
-      </w:r>
-      <w:hyperlink w:history="1" r:id="rIdlkank3kojvumitjev3bw_">
+      <w:hyperlink w:history="1" r:id="rIdmdaw3jpl8td0kdhiyz5hn">
         <w:r>
           <w:rPr>
             <w:rStyle w:val="Hyperlink"/>
             <w:sz w:val="16"/>
             <w:szCs w:val="16"/>
           </w:rPr>
-          <w:t xml:space="preserve">https://community.fabric.microsoft.com/t5/Power-BI-Updates-Blog/Microsoft-named-a-Leader-in-the-2026-Gartner-Magic-Quadrant-for/ba-p/5262403</w:t>
+          <w:t xml:space="preserve">HLB HAMT press release, "HLB HAMT Celebrates 25 Years of Unwavering Excellence"</w:t>
         </w:r>
       </w:hyperlink>
-    </w:p>
-    <w:p>
-      <w:pPr>
-        <w:spacing w:after="40"/>
-        <w:ind w:left="360"/>
-      </w:pPr>
-      <w:r>
-        <w:rPr>
-          <w:i/>
-          <w:iCs/>
-          <w:color w:val="4B5563"/>
+      <w:r>
+        <w:rPr>
           <w:sz w:val="16"/>
           <w:szCs w:val="16"/>
         </w:rPr>
-        <w:t xml:space="preserve">Gartner does not endorse any vendor, product or service depicted in its research publications. GARTNER and MAGIC QUADRANT are registered trademarks of Gartner, Inc. and/or its affiliates.</w:t>
+        <w:t xml:space="preserve">; also </w:t>
+      </w:r>
+      <w:hyperlink w:history="1" r:id="rIdqm52snt4syg9xd8i46uum">
+        <w:r>
+          <w:rPr>
+            <w:rStyle w:val="Hyperlink"/>
+            <w:sz w:val="16"/>
+            <w:szCs w:val="16"/>
+          </w:rPr>
+          <w:t xml:space="preserve">HLB HAMT, 25 Years of Excellence</w:t>
+        </w:r>
+      </w:hyperlink>
+      <w:r>
+        <w:rPr>
+          <w:sz w:val="16"/>
+          <w:szCs w:val="16"/>
+        </w:rPr>
+        <w:t xml:space="preserve"> (founded as HAMT &amp; Associates in 1999; joined HLB International in 2007).</w:t>
       </w:r>
     </w:p>
     <w:p>
@@ -3908,30 +4010,56 @@
         </w:numPr>
         <w:spacing w:after="40"/>
       </w:pPr>
-      <w:r>
-        <w:rPr>
-          <w:sz w:val="16"/>
-          <w:szCs w:val="16"/>
-        </w:rPr>
-        <w:t xml:space="preserve">Microsoft Learn, "Power BI service vs Power BI Desktop".</w:t>
-      </w:r>
-      <w:r>
-        <w:rPr>
-          <w:sz w:val="16"/>
-          <w:szCs w:val="16"/>
-        </w:rPr>
-        <w:t xml:space="preserve"> </w:t>
-      </w:r>
-      <w:hyperlink w:history="1" r:id="rIdphnoeehqhzsa-ffyastjj">
+      <w:hyperlink w:history="1" r:id="rIdup54iatbriobchinsslpk">
         <w:r>
           <w:rPr>
             <w:rStyle w:val="Hyperlink"/>
             <w:sz w:val="16"/>
             <w:szCs w:val="16"/>
           </w:rPr>
-          <w:t xml:space="preserve">https://learn.microsoft.com/en-us/power-bi/fundamentals/service-service-vs-desktop</w:t>
+          <w:t xml:space="preserve">Microsoft, "Microsoft named a Leader in the 2026 Gartner Magic Quadrant for Analytics and BI Platforms" (Power BI Updates Blog)</w:t>
         </w:r>
       </w:hyperlink>
+      <w:r>
+        <w:rPr>
+          <w:sz w:val="16"/>
+          <w:szCs w:val="16"/>
+        </w:rPr>
+        <w:t xml:space="preserve">; </w:t>
+      </w:r>
+      <w:hyperlink w:history="1" r:id="rId3k57q_xmmrn1uie6oov7m">
+        <w:r>
+          <w:rPr>
+            <w:rStyle w:val="Hyperlink"/>
+            <w:sz w:val="16"/>
+            <w:szCs w:val="16"/>
+          </w:rPr>
+          <w:t xml:space="preserve">verbatim repost</w:t>
+        </w:r>
+      </w:hyperlink>
+      <w:r>
+        <w:rPr>
+          <w:sz w:val="16"/>
+          <w:szCs w:val="16"/>
+        </w:rPr>
+        <w:t xml:space="preserve">.</w:t>
+      </w:r>
+    </w:p>
+    <w:p>
+      <w:pPr>
+        <w:spacing w:after="40"/>
+        <w:ind w:left="360"/>
+      </w:pPr>
+      <w:r>
+        <w:rPr>
+          <w:i/>
+          <w:iCs/>
+          <w:color w:val="4B5563"/>
+          <w:sz w:val="16"/>
+          <w:szCs w:val="16"/>
+        </w:rPr>
+        <w:t xml:space="preserve">Gartner does not endorse any vendor, product or service depicted in its research publications. GARTNER and MAGIC QUADRANT are registered trademarks of Gartner, Inc. and/or its affiliates.</w:t>
+      </w:r>
     </w:p>
     <w:p>
       <w:pPr>
@@ -3942,30 +4070,23 @@
         </w:numPr>
         <w:spacing w:after="40"/>
       </w:pPr>
-      <w:r>
-        <w:rPr>
-          <w:sz w:val="16"/>
-          <w:szCs w:val="16"/>
-        </w:rPr>
-        <w:t xml:space="preserve">Microsoft FY26 Q4 earnings call, 29 July 2026.</w:t>
-      </w:r>
-      <w:r>
-        <w:rPr>
-          <w:sz w:val="16"/>
-          <w:szCs w:val="16"/>
-        </w:rPr>
-        <w:t xml:space="preserve"> </w:t>
-      </w:r>
-      <w:hyperlink w:history="1" r:id="rIdiyqaekxprnb5ehalazdhn">
+      <w:hyperlink w:history="1" r:id="rId6wpm4pw8f9t-irnfqar3w">
         <w:r>
           <w:rPr>
             <w:rStyle w:val="Hyperlink"/>
             <w:sz w:val="16"/>
             <w:szCs w:val="16"/>
           </w:rPr>
-          <w:t xml:space="preserve">https://www.microsoft.com/en-us/investor/events/fy-2026/earnings-fy-2026-q4</w:t>
+          <w:t xml:space="preserve">Microsoft Learn, Power BI service vs Power BI Desktop</w:t>
         </w:r>
       </w:hyperlink>
+      <w:r>
+        <w:rPr>
+          <w:sz w:val="16"/>
+          <w:szCs w:val="16"/>
+        </w:rPr>
+        <w:t xml:space="preserve">.</w:t>
+      </w:r>
     </w:p>
     <w:p>
       <w:pPr>
@@ -3976,30 +4097,23 @@
         </w:numPr>
         <w:spacing w:after="40"/>
       </w:pPr>
-      <w:r>
-        <w:rPr>
-          <w:sz w:val="16"/>
-          <w:szCs w:val="16"/>
-        </w:rPr>
-        <w:t xml:space="preserve">Microsoft On the Issues (Microsoft AI Economy Institute), "The continued state of global AI diffusion in 2026", 21 September 2026.</w:t>
-      </w:r>
-      <w:r>
-        <w:rPr>
-          <w:sz w:val="16"/>
-          <w:szCs w:val="16"/>
-        </w:rPr>
-        <w:t xml:space="preserve"> </w:t>
-      </w:r>
-      <w:hyperlink w:history="1" r:id="rIdsp_dpvvdmh8af1ub7yyyr">
+      <w:hyperlink w:history="1" r:id="rIdewkz8vhsy5zx0zoziqy-j">
         <w:r>
           <w:rPr>
             <w:rStyle w:val="Hyperlink"/>
             <w:sz w:val="16"/>
             <w:szCs w:val="16"/>
           </w:rPr>
-          <w:t xml:space="preserve">https://blogs.microsoft.com/on-the-issues/2026/09/21/the-continued-state-of-global-ai-diffusion-in-2026/</w:t>
+          <w:t xml:space="preserve">HLB HAMT service commitment</w:t>
         </w:r>
       </w:hyperlink>
+      <w:r>
+        <w:rPr>
+          <w:sz w:val="16"/>
+          <w:szCs w:val="16"/>
+        </w:rPr>
+        <w:t xml:space="preserve"> ("a Power BI proof of concept can be delivered in as little as 7 days for defined use cases").</w:t>
+      </w:r>
     </w:p>
     <w:p>
       <w:pPr>
@@ -4015,25 +4129,42 @@
           <w:sz w:val="16"/>
           <w:szCs w:val="16"/>
         </w:rPr>
-        <w:t xml:space="preserve">Microsoft Learn, "Copilot for Power BI" overview.</w:t>
-      </w:r>
-      <w:r>
-        <w:rPr>
-          <w:sz w:val="16"/>
-          <w:szCs w:val="16"/>
-        </w:rPr>
-        <w:t xml:space="preserve"> </w:t>
-      </w:r>
-      <w:hyperlink w:history="1" r:id="rIdrywuxkpzoqtasknggveqh">
+        <w:t xml:space="preserve">Microsoft Power BI </w:t>
+      </w:r>
+      <w:hyperlink w:history="1" r:id="rIdf2f44cr3wxhnqgqpfhjvy">
         <w:r>
           <w:rPr>
             <w:rStyle w:val="Hyperlink"/>
             <w:sz w:val="16"/>
             <w:szCs w:val="16"/>
           </w:rPr>
-          <w:t xml:space="preserve">https://learn.microsoft.com/en-us/power-bi/create-reports/copilot-introduction</w:t>
+          <w:t xml:space="preserve">pricing update</w:t>
         </w:r>
       </w:hyperlink>
+      <w:r>
+        <w:rPr>
+          <w:sz w:val="16"/>
+          <w:szCs w:val="16"/>
+        </w:rPr>
+        <w:t xml:space="preserve"> and </w:t>
+      </w:r>
+      <w:hyperlink w:history="1" r:id="rIdivtqszqnqcepxgy_8oxnt">
+        <w:r>
+          <w:rPr>
+            <w:rStyle w:val="Hyperlink"/>
+            <w:sz w:val="16"/>
+            <w:szCs w:val="16"/>
+          </w:rPr>
+          <w:t xml:space="preserve">pricing page</w:t>
+        </w:r>
+      </w:hyperlink>
+      <w:r>
+        <w:rPr>
+          <w:sz w:val="16"/>
+          <w:szCs w:val="16"/>
+        </w:rPr>
+        <w:t xml:space="preserve">.</w:t>
+      </w:r>
     </w:p>
     <w:p>
       <w:pPr>
@@ -4049,7 +4180,41 @@
           <w:sz w:val="16"/>
           <w:szCs w:val="16"/>
         </w:rPr>
-        <w:t xml:space="preserve">HLB HAMT service commitment.</w:t>
+        <w:t xml:space="preserve">Microsoft Learn, </w:t>
+      </w:r>
+      <w:hyperlink w:history="1" r:id="rIdg5hshnjopn158ofwczv4l">
+        <w:r>
+          <w:rPr>
+            <w:rStyle w:val="Hyperlink"/>
+            <w:sz w:val="16"/>
+            <w:szCs w:val="16"/>
+          </w:rPr>
+          <w:t xml:space="preserve">ISO/IEC 27001</w:t>
+        </w:r>
+      </w:hyperlink>
+      <w:r>
+        <w:rPr>
+          <w:sz w:val="16"/>
+          <w:szCs w:val="16"/>
+        </w:rPr>
+        <w:t xml:space="preserve"> and </w:t>
+      </w:r>
+      <w:hyperlink w:history="1" r:id="rIdupp9jintmax2v8jqtpmxq">
+        <w:r>
+          <w:rPr>
+            <w:rStyle w:val="Hyperlink"/>
+            <w:sz w:val="16"/>
+            <w:szCs w:val="16"/>
+          </w:rPr>
+          <w:t xml:space="preserve">SOC 2</w:t>
+        </w:r>
+      </w:hyperlink>
+      <w:r>
+        <w:rPr>
+          <w:sz w:val="16"/>
+          <w:szCs w:val="16"/>
+        </w:rPr>
+        <w:t xml:space="preserve"> offerings.</w:t>
       </w:r>
     </w:p>
     <w:p>
@@ -4061,28 +4226,14 @@
         </w:numPr>
         <w:spacing w:after="40"/>
       </w:pPr>
-      <w:r>
-        <w:rPr>
-          <w:sz w:val="16"/>
-          <w:szCs w:val="16"/>
-        </w:rPr>
-        <w:t xml:space="preserve">Microsoft Power BI pricing update and pricing page.</w:t>
-      </w:r>
-      <w:r>
-        <w:rPr>
-          <w:sz w:val="16"/>
-          <w:szCs w:val="16"/>
-        </w:rPr>
-        <w:t xml:space="preserve"> </w:t>
-      </w:r>
-      <w:hyperlink w:history="1" r:id="rIdhuvvkjo3kzb7jdgt6yer8">
+      <w:hyperlink w:history="1" r:id="rIdtmofxx0pyfvl_3osnlq-u">
         <w:r>
           <w:rPr>
             <w:rStyle w:val="Hyperlink"/>
             <w:sz w:val="16"/>
             <w:szCs w:val="16"/>
           </w:rPr>
-          <w:t xml:space="preserve">https://powerbi.microsoft.com/en-us/blog/important-update-to-microsoft-power-bi-pricing/</w:t>
+          <w:t xml:space="preserve">Microsoft Learn, overview of the generative AI assistant in Power BI</w:t>
         </w:r>
       </w:hyperlink>
       <w:r>
@@ -4090,69 +4241,8 @@
           <w:sz w:val="16"/>
           <w:szCs w:val="16"/>
         </w:rPr>
-        <w:t xml:space="preserve"> ; </w:t>
-      </w:r>
-      <w:hyperlink w:history="1" r:id="rIdnwnqjmknspqlm9euizgid">
-        <w:r>
-          <w:rPr>
-            <w:rStyle w:val="Hyperlink"/>
-            <w:sz w:val="16"/>
-            <w:szCs w:val="16"/>
-          </w:rPr>
-          <w:t xml:space="preserve">https://www.microsoft.com/en-us/power-platform/products/power-bi/pricing</w:t>
-        </w:r>
-      </w:hyperlink>
-    </w:p>
-    <w:p>
-      <w:pPr>
-        <w:pStyle w:val="ListParagraph"/>
-        <w:numPr>
-          <w:ilvl w:val="0"/>
-          <w:numId w:val="3"/>
-        </w:numPr>
-        <w:spacing w:after="40"/>
-      </w:pPr>
-      <w:r>
-        <w:rPr>
-          <w:sz w:val="16"/>
-          <w:szCs w:val="16"/>
-        </w:rPr>
-        <w:t xml:space="preserve">Microsoft Learn, ISO/IEC 27001 and SOC 2 compliance offerings.</w:t>
-      </w:r>
-      <w:r>
-        <w:rPr>
-          <w:sz w:val="16"/>
-          <w:szCs w:val="16"/>
-        </w:rPr>
-        <w:t xml:space="preserve"> </w:t>
-      </w:r>
-      <w:hyperlink w:history="1" r:id="rIdr2dqkhua9gemvrn-d841g">
-        <w:r>
-          <w:rPr>
-            <w:rStyle w:val="Hyperlink"/>
-            <w:sz w:val="16"/>
-            <w:szCs w:val="16"/>
-          </w:rPr>
-          <w:t xml:space="preserve">https://learn.microsoft.com/en-us/compliance/regulatory/offering-iso-27001</w:t>
-        </w:r>
-      </w:hyperlink>
-      <w:r>
-        <w:rPr>
-          <w:sz w:val="16"/>
-          <w:szCs w:val="16"/>
-        </w:rPr>
-        <w:t xml:space="preserve"> ; </w:t>
-      </w:r>
-      <w:hyperlink w:history="1" r:id="rId5d08ezl5jwmtno3aoskrr">
-        <w:r>
-          <w:rPr>
-            <w:rStyle w:val="Hyperlink"/>
-            <w:sz w:val="16"/>
-            <w:szCs w:val="16"/>
-          </w:rPr>
-          <w:t xml:space="preserve">https://learn.microsoft.com/en-us/compliance/regulatory/offering-soc-2</w:t>
-        </w:r>
-      </w:hyperlink>
+        <w:t xml:space="preserve">.</w:t>
+      </w:r>
     </w:p>
     <w:p>
       <w:pPr>
@@ -4160,7 +4250,7 @@
         <w:keepNext/>
       </w:pPr>
       <w:r>
-        <w:t xml:space="preserve">S16  ·  Final contact CTA and form  ·  #contact</w:t>
+        <w:t xml:space="preserve">S15  ·  Final contact CTA and form  ·  #contact</w:t>
       </w:r>
     </w:p>
     <w:p>
@@ -4168,15 +4258,15 @@
         <w:pStyle w:val="Heading2"/>
         <w:keepNext/>
       </w:pPr>
-      <w:bookmarkStart w:name="contact" w:id="12"/>
+      <w:bookmarkStart w:name="contact" w:id="11"/>
       <w:r>
         <w:t xml:space="preserve">Book Your Free Consultation</w:t>
       </w:r>
-      <w:bookmarkEnd w:id="12"/>
-    </w:p>
-    <w:p>
-      <w:r>
-        <w:t xml:space="preserve">Tell us what you report on today and what you want to see instead. Our Power BI Services team replies within one business day.</w:t>
+      <w:bookmarkEnd w:id="11"/>
+    </w:p>
+    <w:p>
+      <w:r>
+        <w:t xml:space="preserve">Describe the reports you run today and the ones you wish you had. Our Power BI Services team replies within one business day.</w:t>
       </w:r>
     </w:p>
     <w:p>
@@ -4231,7 +4321,7 @@
         <w:keepNext/>
       </w:pPr>
       <w:r>
-        <w:t xml:space="preserve">S17  ·  Footer</w:t>
+        <w:t xml:space="preserve">S16  ·  Footer</w:t>
       </w:r>
     </w:p>
     <w:p>
@@ -4392,7 +4482,7 @@
         <w:sz w:val="16"/>
         <w:szCs w:val="16"/>
       </w:rPr>
-      <w:t xml:space="preserve">HLB HAMT  |  Microsoft Power BI Services homepage</w:t>
+      <w:t xml:space="preserve">HLB HAMT  |  Power BI Services homepage</w:t>
     </w:r>
   </w:p>
 </w:hdr>

</xml_diff>

<commit_message>
Deliver Power BI homepage revision (final: Revision 2 + Revision 3)
Full re-delivery from the approved draft-v7.md: docx, pdf, sources
log, and the Insurance-format docx all regenerated. AI Insights
removed, HLB HAMT-led branding throughout, "Power BI reselling
partner" replacing any certified claim, and all competitor/tool
names removed per Revision 3 (Fabric, Copilot, SAP, Oracle, Tableau,
Qlik, Excel, Teams, SharePoint, Azure, Dynamics 365, etc.). FAQ
schema updated to 10 questions, footnotes renumbered by appearance,
Gartner disclaimer included. 3,477 words.
</commit_message>
<xml_diff>
--- a/content-pipeline/requirements/2026-09-28-power-bi-services-homepage/output/power-bi-services-homepage.docx
+++ b/content-pipeline/requirements/2026-09-28-power-bi-services-homepage/output/power-bi-services-homepage.docx
@@ -545,7 +545,7 @@
               </w:rPr>
               <w:t xml:space="preserve">L1  </w:t>
             </w:r>
-            <w:hyperlink w:history="1" r:id="rId4tvxlgrmfsddv5smka_6q">
+            <w:hyperlink w:history="1" r:id="rId749ga3svso-nnzn7tqhhj">
               <w:r>
                 <w:rPr>
                   <w:rStyle w:val="Hyperlink"/>
@@ -576,7 +576,7 @@
               </w:rPr>
               <w:t xml:space="preserve">L2  </w:t>
             </w:r>
-            <w:hyperlink w:history="1" r:id="rIdicfrmvidxdca2sru8oobs">
+            <w:hyperlink w:history="1" r:id="rIdekvq4uwpylwuxc8qugqws">
               <w:r>
                 <w:rPr>
                   <w:rStyle w:val="Hyperlink"/>
@@ -607,7 +607,7 @@
               </w:rPr>
               <w:t xml:space="preserve">L3  </w:t>
             </w:r>
-            <w:hyperlink w:history="1" r:id="rIdm61vbsxlo1e-_1ygbcc7g">
+            <w:hyperlink w:history="1" r:id="rId8vtga2pkhmlaldbs4bnxz">
               <w:r>
                 <w:rPr>
                   <w:rStyle w:val="Hyperlink"/>
@@ -638,7 +638,7 @@
               </w:rPr>
               <w:t xml:space="preserve">L4  </w:t>
             </w:r>
-            <w:hyperlink w:history="1" r:id="rIdsgwlziep3wmo9iax1bg3e">
+            <w:hyperlink w:history="1" r:id="rIdkjsfous1tv8vpul3eoe1h">
               <w:r>
                 <w:rPr>
                   <w:rStyle w:val="Hyperlink"/>
@@ -669,7 +669,7 @@
               </w:rPr>
               <w:t xml:space="preserve">L5  </w:t>
             </w:r>
-            <w:hyperlink w:history="1" r:id="rIddlojhnik0sze5w471ul3z">
+            <w:hyperlink w:history="1" r:id="rIdbpgv96ljb6ce_4mi_5kgx">
               <w:r>
                 <w:rPr>
                   <w:rStyle w:val="Hyperlink"/>
@@ -700,7 +700,7 @@
               </w:rPr>
               <w:t xml:space="preserve">L6  </w:t>
             </w:r>
-            <w:hyperlink w:history="1" r:id="rIdf_1ewi0sfzugay5yzug9q">
+            <w:hyperlink w:history="1" r:id="rId5xvkslfm61bxkubstmug1">
               <w:r>
                 <w:rPr>
                   <w:rStyle w:val="Hyperlink"/>
@@ -731,7 +731,7 @@
               </w:rPr>
               <w:t xml:space="preserve">L7  </w:t>
             </w:r>
-            <w:hyperlink w:history="1" r:id="rId1grr1kfx4elgt2m2x2yme">
+            <w:hyperlink w:history="1" r:id="rIdfrrj21gm4mmdilqgr39wt">
               <w:r>
                 <w:rPr>
                   <w:rStyle w:val="Hyperlink"/>
@@ -908,7 +908,7 @@
       <w:pPr>
         <w:pStyle w:val="Note"/>
       </w:pPr>
-      <w:hyperlink w:history="1" r:id="rIdekt7fgytwdtp2kt3ykhim">
+      <w:hyperlink w:history="1" r:id="rIdb42e4l3hfrzlgnfjll3rb">
         <w:r>
           <w:rPr>
             <w:rStyle w:val="Hyperlink"/>
@@ -931,7 +931,7 @@
         </w:rPr>
         <w:t xml:space="preserve">  ›  </w:t>
       </w:r>
-      <w:hyperlink w:history="1" r:id="rIdivtydihl5ts09mehwxtf5">
+      <w:hyperlink w:history="1" r:id="rIdx9cuvd3vx4gkxtwfo9odf">
         <w:r>
           <w:rPr>
             <w:rStyle w:val="Hyperlink"/>
@@ -945,7 +945,7 @@
         </w:rPr>
         <w:t xml:space="preserve">  ›  </w:t>
       </w:r>
-      <w:hyperlink w:history="1" r:id="rIdeqth4ruj5maa5hk7apy17">
+      <w:hyperlink w:history="1" r:id="rIdzlhzxxco6dkq2nv4vbp5r">
         <w:r>
           <w:rPr>
             <w:rStyle w:val="Hyperlink"/>
@@ -1379,7 +1379,7 @@
         </w:rPr>
         <w:t xml:space="preserve">Button: </w:t>
       </w:r>
-      <w:hyperlink w:history="1" r:id="rId_0upnkqxqed4oi6yw3kvx">
+      <w:hyperlink w:history="1" r:id="rIdotb-sanialpwvav6jafx8">
         <w:r>
           <w:rPr>
             <w:rStyle w:val="Hyperlink"/>
@@ -1448,7 +1448,7 @@
       <w:r>
         <w:t xml:space="preserve">HLB HAMT is a Power BI consulting company that is also a licensed audit, tax and advisory firm, and a member of the HLB International network. Power BI gives us the platform; our accountants and engineers make the numbers reconcile. That combination anchors our </w:t>
       </w:r>
-      <w:hyperlink w:history="1" r:id="rIde5n1t7cbx7vfkrs4jotoi">
+      <w:hyperlink w:history="1" r:id="rIdli08jjycyopbsefjqfex8">
         <w:r>
           <w:rPr>
             <w:rStyle w:val="Hyperlink"/>
@@ -2107,7 +2107,7 @@
       <w:r>
         <w:t xml:space="preserve">Our consultants begin with the KPIs a role or sector is judged on, then design the model, measures and page layout around those numbers. The same KPI-first thinking runs through our wider </w:t>
       </w:r>
-      <w:hyperlink w:history="1" r:id="rIdfo_17q2kqycic5i1chcml">
+      <w:hyperlink w:history="1" r:id="rIdsmfbwp1k-atxbzbbcgj8t">
         <w:r>
           <w:rPr>
             <w:rStyle w:val="Hyperlink"/>
@@ -2187,7 +2187,7 @@
       <w:r>
         <w:t xml:space="preserve">We track taxable income, IAS 12 deferred tax, transfer pricing and VAT returns, with free zone and mainland results kept apart. With our </w:t>
       </w:r>
-      <w:hyperlink w:history="1" r:id="rIds4gxq5o38sfmts91l4y2p">
+      <w:hyperlink w:history="1" r:id="rIdjpllm1wfq3sixqwu7s7qz">
         <w:r>
           <w:rPr>
             <w:rStyle w:val="Hyperlink"/>
@@ -2530,7 +2530,7 @@
       <w:r>
         <w:t xml:space="preserve">We work model-first, not visual-first: semantic models with consistent KPI definitions and tested DAX come ahead of the first chart. On that base we build executive dashboards and analyst reports with drill-through, cross-filtering, slicers and bookmarks, plus mobile layouts and Arabic right-to-left design. See </w:t>
       </w:r>
-      <w:hyperlink w:history="1" r:id="rIdclvprp1tx9vrcjmslfez4">
+      <w:hyperlink w:history="1" r:id="rId71ad8ggq_w4id8fwcnqar">
         <w:r>
           <w:rPr>
             <w:rStyle w:val="Hyperlink"/>
@@ -3457,7 +3457,7 @@
       <w:r>
         <w:t xml:space="preserve">Booked revenue in Power BI, open-deal scoring in </w:t>
       </w:r>
-      <w:hyperlink w:history="1" r:id="rId3apivezgtkf2_m0apct_k">
+      <w:hyperlink w:history="1" r:id="rIdxjbpfjgxvhe5oalsu6nvk">
         <w:r>
           <w:rPr>
             <w:rStyle w:val="Hyperlink"/>
@@ -3730,7 +3730,7 @@
       <w:r>
         <w:t xml:space="preserve">Yes. It is often the first thing clients ask us to fix. Rather than a team member copying figures between workbooks every week, data refreshes on a schedule and dashboards stay current. Through </w:t>
       </w:r>
-      <w:hyperlink w:history="1" r:id="rIdssdcc3oruhe0bjdtpulsw">
+      <w:hyperlink w:history="1" r:id="rId_l4xwkeitec4z_xowwbik">
         <w:r>
           <w:rPr>
             <w:rStyle w:val="Hyperlink"/>
@@ -3787,7 +3787,7 @@
       <w:r>
         <w:t xml:space="preserve">, and our </w:t>
       </w:r>
-      <w:hyperlink w:history="1" r:id="rIdul1b_aue8dpppfadztibi">
+      <w:hyperlink w:history="1" r:id="rId-jontt4mdxmr6pwb1ceyr">
         <w:r>
           <w:rPr>
             <w:rStyle w:val="Hyperlink"/>
@@ -3885,7 +3885,7 @@
         </w:numPr>
         <w:spacing w:after="40"/>
       </w:pPr>
-      <w:hyperlink w:history="1" r:id="rIdh6bdviwsikfn2sjohj7ci">
+      <w:hyperlink w:history="1" r:id="rId2etf90vtdafp8natfrfvk">
         <w:r>
           <w:rPr>
             <w:rStyle w:val="Hyperlink"/>
@@ -3912,7 +3912,7 @@
         </w:numPr>
         <w:spacing w:after="40"/>
       </w:pPr>
-      <w:hyperlink w:history="1" r:id="rIdxttrp-urqtzo73yiprb1a">
+      <w:hyperlink w:history="1" r:id="rIdyyqzkovphnjtbwbletwll">
         <w:r>
           <w:rPr>
             <w:rStyle w:val="Hyperlink"/>
@@ -3939,7 +3939,7 @@
         </w:numPr>
         <w:spacing w:after="40"/>
       </w:pPr>
-      <w:hyperlink w:history="1" r:id="rIdupeedkvnlj8omoxxmtzs3">
+      <w:hyperlink w:history="1" r:id="rId6ahowivrjgr-qzgokzhvv">
         <w:r>
           <w:rPr>
             <w:rStyle w:val="Hyperlink"/>
@@ -3966,7 +3966,7 @@
         </w:numPr>
         <w:spacing w:after="40"/>
       </w:pPr>
-      <w:hyperlink w:history="1" r:id="rIdmdaw3jpl8td0kdhiyz5hn">
+      <w:hyperlink w:history="1" r:id="rIdxs6cl86-t_af6yffc4m6f">
         <w:r>
           <w:rPr>
             <w:rStyle w:val="Hyperlink"/>
@@ -3983,7 +3983,7 @@
         </w:rPr>
         <w:t xml:space="preserve">; also </w:t>
       </w:r>
-      <w:hyperlink w:history="1" r:id="rIdqm52snt4syg9xd8i46uum">
+      <w:hyperlink w:history="1" r:id="rIdp6ynkhytdsndunsoeqwtn">
         <w:r>
           <w:rPr>
             <w:rStyle w:val="Hyperlink"/>
@@ -4010,7 +4010,7 @@
         </w:numPr>
         <w:spacing w:after="40"/>
       </w:pPr>
-      <w:hyperlink w:history="1" r:id="rIdup54iatbriobchinsslpk">
+      <w:hyperlink w:history="1" r:id="rId7l6tipmtruiuvkim3pjsf">
         <w:r>
           <w:rPr>
             <w:rStyle w:val="Hyperlink"/>
@@ -4027,7 +4027,7 @@
         </w:rPr>
         <w:t xml:space="preserve">; </w:t>
       </w:r>
-      <w:hyperlink w:history="1" r:id="rId3k57q_xmmrn1uie6oov7m">
+      <w:hyperlink w:history="1" r:id="rIdbt6ptvwuncp9fhtd3blkk">
         <w:r>
           <w:rPr>
             <w:rStyle w:val="Hyperlink"/>
@@ -4070,7 +4070,7 @@
         </w:numPr>
         <w:spacing w:after="40"/>
       </w:pPr>
-      <w:hyperlink w:history="1" r:id="rId6wpm4pw8f9t-irnfqar3w">
+      <w:hyperlink w:history="1" r:id="rIdyjhdqlszsm5i5ttsenqqb">
         <w:r>
           <w:rPr>
             <w:rStyle w:val="Hyperlink"/>
@@ -4097,7 +4097,7 @@
         </w:numPr>
         <w:spacing w:after="40"/>
       </w:pPr>
-      <w:hyperlink w:history="1" r:id="rIdewkz8vhsy5zx0zoziqy-j">
+      <w:hyperlink w:history="1" r:id="rIdfusryf4jz8enyoruddpzu">
         <w:r>
           <w:rPr>
             <w:rStyle w:val="Hyperlink"/>
@@ -4131,7 +4131,7 @@
         </w:rPr>
         <w:t xml:space="preserve">Microsoft Power BI </w:t>
       </w:r>
-      <w:hyperlink w:history="1" r:id="rIdf2f44cr3wxhnqgqpfhjvy">
+      <w:hyperlink w:history="1" r:id="rIdzz9xyher06zivko1vvrkn">
         <w:r>
           <w:rPr>
             <w:rStyle w:val="Hyperlink"/>
@@ -4148,7 +4148,7 @@
         </w:rPr>
         <w:t xml:space="preserve"> and </w:t>
       </w:r>
-      <w:hyperlink w:history="1" r:id="rIdivtqszqnqcepxgy_8oxnt">
+      <w:hyperlink w:history="1" r:id="rIdeenjkcndvhdv2owmrdt_y">
         <w:r>
           <w:rPr>
             <w:rStyle w:val="Hyperlink"/>
@@ -4182,7 +4182,7 @@
         </w:rPr>
         <w:t xml:space="preserve">Microsoft Learn, </w:t>
       </w:r>
-      <w:hyperlink w:history="1" r:id="rIdg5hshnjopn158ofwczv4l">
+      <w:hyperlink w:history="1" r:id="rIdfeydrc8alv5mbmcovlfhg">
         <w:r>
           <w:rPr>
             <w:rStyle w:val="Hyperlink"/>
@@ -4199,7 +4199,7 @@
         </w:rPr>
         <w:t xml:space="preserve"> and </w:t>
       </w:r>
-      <w:hyperlink w:history="1" r:id="rIdupp9jintmax2v8jqtpmxq">
+      <w:hyperlink w:history="1" r:id="rIdtwu4biemmx2chzl5-lqac">
         <w:r>
           <w:rPr>
             <w:rStyle w:val="Hyperlink"/>
@@ -4226,7 +4226,7 @@
         </w:numPr>
         <w:spacing w:after="40"/>
       </w:pPr>
-      <w:hyperlink w:history="1" r:id="rIdtmofxx0pyfvl_3osnlq-u">
+      <w:hyperlink w:history="1" r:id="rIdtdxpeocbl2bpsdho4ti5l">
         <w:r>
           <w:rPr>
             <w:rStyle w:val="Hyperlink"/>

</xml_diff>

<commit_message>
WIP: regenerate Power BI homepage outputs from draft-v8 (Deliver in progress)
All 5 output files regenerated with the 33x/PowerUP! removal.
Interrupted by a rate limit while fixing a hyperlink colour styling
issue in the Insurance-format doc (links rendering in body ink
instead of link blue) - final polish still to come.
</commit_message>
<xml_diff>
--- a/content-pipeline/requirements/2026-09-28-power-bi-services-homepage/output/power-bi-services-homepage.docx
+++ b/content-pipeline/requirements/2026-09-28-power-bi-services-homepage/output/power-bi-services-homepage.docx
@@ -21,9 +21,10 @@
     <w:p>
       <w:pPr>
         <w:pStyle w:val="Note"/>
-      </w:pPr>
-      <w:r>
-        <w:t xml:space="preserve">Prepared 29 September 2026 from the approved draft (draft-v7.md, Test PASS in test-report-v7.md). Replaces the 28 September delivery built from draft-v4.md. Grey section bars, "Button:" lines and labels are production notes for the web team; everything else is page copy, in page order. Footnote numbers follow order of appearance on the page.</w:t>
+        <w:spacing w:after="200"/>
+      </w:pPr>
+      <w:r>
+        <w:t xml:space="preserve">Prepared 29 September 2026 from the approved draft (draft-v8.md, Test PASS in test-report-v8.md; Revision 4 correction). Replaces the earlier 29 September delivery built from draft-v7.md. Grey section bars, "Button:" lines and labels are production notes for the web team; everything else is page copy, in page order. Footnote numbers follow order of appearance on the page.</w:t>
       </w:r>
     </w:p>
     <w:tbl>
@@ -43,6 +44,9 @@
         <w:gridCol w:w="6826"/>
       </w:tblGrid>
       <w:tr>
+        <w:trPr>
+          <w:cantSplit/>
+        </w:trPr>
         <w:tc>
           <w:tcPr>
             <w:tcW w:type="dxa" w:w="2200"/>
@@ -54,15 +58,15 @@
             </w:tcBorders>
             <w:shd w:fill="EEF4F6" w:color="auto" w:val="clear"/>
             <w:tcMar>
-              <w:top w:type="dxa" w:w="50"/>
-              <w:left w:type="dxa" w:w="140"/>
-              <w:bottom w:type="dxa" w:w="50"/>
-              <w:right w:type="dxa" w:w="140"/>
+              <w:top w:type="dxa" w:w="60"/>
+              <w:left w:type="dxa" w:w="100"/>
+              <w:bottom w:type="dxa" w:w="60"/>
+              <w:right w:type="dxa" w:w="100"/>
             </w:tcMar>
           </w:tcPr>
           <w:p>
             <w:pPr>
-              <w:spacing w:after="0" w:line="240" w:lineRule="auto"/>
+              <w:spacing w:after="20" w:line="240" w:lineRule="auto"/>
             </w:pPr>
             <w:r>
               <w:rPr>
@@ -85,10 +89,10 @@
               <w:right w:val="single" w:color="D1D5DB" w:sz="4"/>
             </w:tcBorders>
             <w:tcMar>
-              <w:top w:type="dxa" w:w="50"/>
-              <w:left w:type="dxa" w:w="140"/>
-              <w:bottom w:type="dxa" w:w="50"/>
-              <w:right w:type="dxa" w:w="140"/>
+              <w:top w:type="dxa" w:w="60"/>
+              <w:left w:type="dxa" w:w="100"/>
+              <w:bottom w:type="dxa" w:w="60"/>
+              <w:right w:type="dxa" w:w="100"/>
             </w:tcMar>
           </w:tcPr>
           <w:p>
@@ -106,6 +110,9 @@
         </w:tc>
       </w:tr>
       <w:tr>
+        <w:trPr>
+          <w:cantSplit/>
+        </w:trPr>
         <w:tc>
           <w:tcPr>
             <w:tcW w:type="dxa" w:w="2200"/>
@@ -117,15 +124,15 @@
             </w:tcBorders>
             <w:shd w:fill="EEF4F6" w:color="auto" w:val="clear"/>
             <w:tcMar>
-              <w:top w:type="dxa" w:w="50"/>
-              <w:left w:type="dxa" w:w="140"/>
-              <w:bottom w:type="dxa" w:w="50"/>
-              <w:right w:type="dxa" w:w="140"/>
+              <w:top w:type="dxa" w:w="60"/>
+              <w:left w:type="dxa" w:w="100"/>
+              <w:bottom w:type="dxa" w:w="60"/>
+              <w:right w:type="dxa" w:w="100"/>
             </w:tcMar>
           </w:tcPr>
           <w:p>
             <w:pPr>
-              <w:spacing w:after="0" w:line="240" w:lineRule="auto"/>
+              <w:spacing w:after="20" w:line="240" w:lineRule="auto"/>
             </w:pPr>
             <w:r>
               <w:rPr>
@@ -148,10 +155,10 @@
               <w:right w:val="single" w:color="D1D5DB" w:sz="4"/>
             </w:tcBorders>
             <w:tcMar>
-              <w:top w:type="dxa" w:w="50"/>
-              <w:left w:type="dxa" w:w="140"/>
-              <w:bottom w:type="dxa" w:w="50"/>
-              <w:right w:type="dxa" w:w="140"/>
+              <w:top w:type="dxa" w:w="60"/>
+              <w:left w:type="dxa" w:w="100"/>
+              <w:bottom w:type="dxa" w:w="60"/>
+              <w:right w:type="dxa" w:w="100"/>
             </w:tcMar>
           </w:tcPr>
           <w:p>
@@ -169,6 +176,9 @@
         </w:tc>
       </w:tr>
       <w:tr>
+        <w:trPr>
+          <w:cantSplit/>
+        </w:trPr>
         <w:tc>
           <w:tcPr>
             <w:tcW w:type="dxa" w:w="2200"/>
@@ -180,15 +190,15 @@
             </w:tcBorders>
             <w:shd w:fill="EEF4F6" w:color="auto" w:val="clear"/>
             <w:tcMar>
-              <w:top w:type="dxa" w:w="50"/>
-              <w:left w:type="dxa" w:w="140"/>
-              <w:bottom w:type="dxa" w:w="50"/>
-              <w:right w:type="dxa" w:w="140"/>
+              <w:top w:type="dxa" w:w="60"/>
+              <w:left w:type="dxa" w:w="100"/>
+              <w:bottom w:type="dxa" w:w="60"/>
+              <w:right w:type="dxa" w:w="100"/>
             </w:tcMar>
           </w:tcPr>
           <w:p>
             <w:pPr>
-              <w:spacing w:after="0" w:line="240" w:lineRule="auto"/>
+              <w:spacing w:after="20" w:line="240" w:lineRule="auto"/>
             </w:pPr>
             <w:r>
               <w:rPr>
@@ -211,10 +221,10 @@
               <w:right w:val="single" w:color="D1D5DB" w:sz="4"/>
             </w:tcBorders>
             <w:tcMar>
-              <w:top w:type="dxa" w:w="50"/>
-              <w:left w:type="dxa" w:w="140"/>
-              <w:bottom w:type="dxa" w:w="50"/>
-              <w:right w:type="dxa" w:w="140"/>
+              <w:top w:type="dxa" w:w="60"/>
+              <w:left w:type="dxa" w:w="100"/>
+              <w:bottom w:type="dxa" w:w="60"/>
+              <w:right w:type="dxa" w:w="100"/>
             </w:tcMar>
           </w:tcPr>
           <w:p>
@@ -232,6 +242,9 @@
         </w:tc>
       </w:tr>
       <w:tr>
+        <w:trPr>
+          <w:cantSplit/>
+        </w:trPr>
         <w:tc>
           <w:tcPr>
             <w:tcW w:type="dxa" w:w="2200"/>
@@ -243,15 +256,15 @@
             </w:tcBorders>
             <w:shd w:fill="EEF4F6" w:color="auto" w:val="clear"/>
             <w:tcMar>
-              <w:top w:type="dxa" w:w="50"/>
-              <w:left w:type="dxa" w:w="140"/>
-              <w:bottom w:type="dxa" w:w="50"/>
-              <w:right w:type="dxa" w:w="140"/>
+              <w:top w:type="dxa" w:w="60"/>
+              <w:left w:type="dxa" w:w="100"/>
+              <w:bottom w:type="dxa" w:w="60"/>
+              <w:right w:type="dxa" w:w="100"/>
             </w:tcMar>
           </w:tcPr>
           <w:p>
             <w:pPr>
-              <w:spacing w:after="0" w:line="240" w:lineRule="auto"/>
+              <w:spacing w:after="20" w:line="240" w:lineRule="auto"/>
             </w:pPr>
             <w:r>
               <w:rPr>
@@ -274,10 +287,10 @@
               <w:right w:val="single" w:color="D1D5DB" w:sz="4"/>
             </w:tcBorders>
             <w:tcMar>
-              <w:top w:type="dxa" w:w="50"/>
-              <w:left w:type="dxa" w:w="140"/>
-              <w:bottom w:type="dxa" w:w="50"/>
-              <w:right w:type="dxa" w:w="140"/>
+              <w:top w:type="dxa" w:w="60"/>
+              <w:left w:type="dxa" w:w="100"/>
+              <w:bottom w:type="dxa" w:w="60"/>
+              <w:right w:type="dxa" w:w="100"/>
             </w:tcMar>
           </w:tcPr>
           <w:p>
@@ -295,6 +308,9 @@
         </w:tc>
       </w:tr>
       <w:tr>
+        <w:trPr>
+          <w:cantSplit/>
+        </w:trPr>
         <w:tc>
           <w:tcPr>
             <w:tcW w:type="dxa" w:w="2200"/>
@@ -306,15 +322,15 @@
             </w:tcBorders>
             <w:shd w:fill="EEF4F6" w:color="auto" w:val="clear"/>
             <w:tcMar>
-              <w:top w:type="dxa" w:w="50"/>
-              <w:left w:type="dxa" w:w="140"/>
-              <w:bottom w:type="dxa" w:w="50"/>
-              <w:right w:type="dxa" w:w="140"/>
+              <w:top w:type="dxa" w:w="60"/>
+              <w:left w:type="dxa" w:w="100"/>
+              <w:bottom w:type="dxa" w:w="60"/>
+              <w:right w:type="dxa" w:w="100"/>
             </w:tcMar>
           </w:tcPr>
           <w:p>
             <w:pPr>
-              <w:spacing w:after="0" w:line="240" w:lineRule="auto"/>
+              <w:spacing w:after="20" w:line="240" w:lineRule="auto"/>
             </w:pPr>
             <w:r>
               <w:rPr>
@@ -337,10 +353,10 @@
               <w:right w:val="single" w:color="D1D5DB" w:sz="4"/>
             </w:tcBorders>
             <w:tcMar>
-              <w:top w:type="dxa" w:w="50"/>
-              <w:left w:type="dxa" w:w="140"/>
-              <w:bottom w:type="dxa" w:w="50"/>
-              <w:right w:type="dxa" w:w="140"/>
+              <w:top w:type="dxa" w:w="60"/>
+              <w:left w:type="dxa" w:w="100"/>
+              <w:bottom w:type="dxa" w:w="60"/>
+              <w:right w:type="dxa" w:w="100"/>
             </w:tcMar>
           </w:tcPr>
           <w:p>
@@ -358,6 +374,9 @@
         </w:tc>
       </w:tr>
       <w:tr>
+        <w:trPr>
+          <w:cantSplit/>
+        </w:trPr>
         <w:tc>
           <w:tcPr>
             <w:tcW w:type="dxa" w:w="2200"/>
@@ -369,15 +388,15 @@
             </w:tcBorders>
             <w:shd w:fill="EEF4F6" w:color="auto" w:val="clear"/>
             <w:tcMar>
-              <w:top w:type="dxa" w:w="50"/>
-              <w:left w:type="dxa" w:w="140"/>
-              <w:bottom w:type="dxa" w:w="50"/>
-              <w:right w:type="dxa" w:w="140"/>
+              <w:top w:type="dxa" w:w="60"/>
+              <w:left w:type="dxa" w:w="100"/>
+              <w:bottom w:type="dxa" w:w="60"/>
+              <w:right w:type="dxa" w:w="100"/>
             </w:tcMar>
           </w:tcPr>
           <w:p>
             <w:pPr>
-              <w:spacing w:after="0" w:line="240" w:lineRule="auto"/>
+              <w:spacing w:after="20" w:line="240" w:lineRule="auto"/>
             </w:pPr>
             <w:r>
               <w:rPr>
@@ -400,10 +419,10 @@
               <w:right w:val="single" w:color="D1D5DB" w:sz="4"/>
             </w:tcBorders>
             <w:tcMar>
-              <w:top w:type="dxa" w:w="50"/>
-              <w:left w:type="dxa" w:w="140"/>
-              <w:bottom w:type="dxa" w:w="50"/>
-              <w:right w:type="dxa" w:w="140"/>
+              <w:top w:type="dxa" w:w="60"/>
+              <w:left w:type="dxa" w:w="100"/>
+              <w:bottom w:type="dxa" w:w="60"/>
+              <w:right w:type="dxa" w:w="100"/>
             </w:tcMar>
           </w:tcPr>
           <w:p>
@@ -421,6 +440,9 @@
         </w:tc>
       </w:tr>
       <w:tr>
+        <w:trPr>
+          <w:cantSplit/>
+        </w:trPr>
         <w:tc>
           <w:tcPr>
             <w:tcW w:type="dxa" w:w="2200"/>
@@ -432,15 +454,15 @@
             </w:tcBorders>
             <w:shd w:fill="EEF4F6" w:color="auto" w:val="clear"/>
             <w:tcMar>
-              <w:top w:type="dxa" w:w="50"/>
-              <w:left w:type="dxa" w:w="140"/>
-              <w:bottom w:type="dxa" w:w="50"/>
-              <w:right w:type="dxa" w:w="140"/>
+              <w:top w:type="dxa" w:w="60"/>
+              <w:left w:type="dxa" w:w="100"/>
+              <w:bottom w:type="dxa" w:w="60"/>
+              <w:right w:type="dxa" w:w="100"/>
             </w:tcMar>
           </w:tcPr>
           <w:p>
             <w:pPr>
-              <w:spacing w:after="0" w:line="240" w:lineRule="auto"/>
+              <w:spacing w:after="20" w:line="240" w:lineRule="auto"/>
             </w:pPr>
             <w:r>
               <w:rPr>
@@ -463,10 +485,10 @@
               <w:right w:val="single" w:color="D1D5DB" w:sz="4"/>
             </w:tcBorders>
             <w:tcMar>
-              <w:top w:type="dxa" w:w="50"/>
-              <w:left w:type="dxa" w:w="140"/>
-              <w:bottom w:type="dxa" w:w="50"/>
-              <w:right w:type="dxa" w:w="140"/>
+              <w:top w:type="dxa" w:w="60"/>
+              <w:left w:type="dxa" w:w="100"/>
+              <w:bottom w:type="dxa" w:w="60"/>
+              <w:right w:type="dxa" w:w="100"/>
             </w:tcMar>
           </w:tcPr>
           <w:p>
@@ -478,12 +500,15 @@
                 <w:sz w:val="17"/>
                 <w:szCs w:val="17"/>
               </w:rPr>
-              <w:t xml:space="preserve">Why HLB HAMT (#whyhlbhamt)  ·  The Platform (#explorepowerbi)  ·  Use Cases (#usecases)  ·  Services (#services)  ·  Proof of Concept (#methodology)  ·  Engagement Models (#packages)  ·  FAQ (#faq)</w:t>
+              <w:t xml:space="preserve">Why HLB HAMT (#whyhlbhamt) · The Platform (#explorepowerbi) · Use Cases (#usecases) · Services (#services) · Proof of Concept (#methodology) · Engagement Models (#packages) · FAQ (#faq)</w:t>
             </w:r>
           </w:p>
         </w:tc>
       </w:tr>
       <w:tr>
+        <w:trPr>
+          <w:cantSplit/>
+        </w:trPr>
         <w:tc>
           <w:tcPr>
             <w:tcW w:type="dxa" w:w="2200"/>
@@ -495,15 +520,15 @@
             </w:tcBorders>
             <w:shd w:fill="EEF4F6" w:color="auto" w:val="clear"/>
             <w:tcMar>
-              <w:top w:type="dxa" w:w="50"/>
-              <w:left w:type="dxa" w:w="140"/>
-              <w:bottom w:type="dxa" w:w="50"/>
-              <w:right w:type="dxa" w:w="140"/>
+              <w:top w:type="dxa" w:w="60"/>
+              <w:left w:type="dxa" w:w="100"/>
+              <w:bottom w:type="dxa" w:w="60"/>
+              <w:right w:type="dxa" w:w="100"/>
             </w:tcMar>
           </w:tcPr>
           <w:p>
             <w:pPr>
-              <w:spacing w:after="0" w:line="240" w:lineRule="auto"/>
+              <w:spacing w:after="20" w:line="240" w:lineRule="auto"/>
             </w:pPr>
             <w:r>
               <w:rPr>
@@ -526,10 +551,10 @@
               <w:right w:val="single" w:color="D1D5DB" w:sz="4"/>
             </w:tcBorders>
             <w:tcMar>
-              <w:top w:type="dxa" w:w="50"/>
-              <w:left w:type="dxa" w:w="140"/>
-              <w:bottom w:type="dxa" w:w="50"/>
-              <w:right w:type="dxa" w:w="140"/>
+              <w:top w:type="dxa" w:w="60"/>
+              <w:left w:type="dxa" w:w="100"/>
+              <w:bottom w:type="dxa" w:w="60"/>
+              <w:right w:type="dxa" w:w="100"/>
             </w:tcMar>
           </w:tcPr>
           <w:p>
@@ -543,9 +568,9 @@
                 <w:sz w:val="17"/>
                 <w:szCs w:val="17"/>
               </w:rPr>
-              <w:t xml:space="preserve">L1  </w:t>
+              <w:t xml:space="preserve">L1 </w:t>
             </w:r>
-            <w:hyperlink w:history="1" r:id="rId749ga3svso-nnzn7tqhhj">
+            <w:hyperlink w:history="1" r:id="rIdmwuoxuyaqqkpqrqqpbgsa">
               <w:r>
                 <w:rPr>
                   <w:rStyle w:val="Hyperlink"/>
@@ -574,9 +599,9 @@
                 <w:sz w:val="17"/>
                 <w:szCs w:val="17"/>
               </w:rPr>
-              <w:t xml:space="preserve">L2  </w:t>
+              <w:t xml:space="preserve">L2 </w:t>
             </w:r>
-            <w:hyperlink w:history="1" r:id="rIdekvq4uwpylwuxc8qugqws">
+            <w:hyperlink w:history="1" r:id="rIde99xsq9cqsb1rqeyaioau">
               <w:r>
                 <w:rPr>
                   <w:rStyle w:val="Hyperlink"/>
@@ -605,9 +630,9 @@
                 <w:sz w:val="17"/>
                 <w:szCs w:val="17"/>
               </w:rPr>
-              <w:t xml:space="preserve">L3  </w:t>
+              <w:t xml:space="preserve">L3 </w:t>
             </w:r>
-            <w:hyperlink w:history="1" r:id="rId8vtga2pkhmlaldbs4bnxz">
+            <w:hyperlink w:history="1" r:id="rId5q9aayiwafwtjbe1qypag">
               <w:r>
                 <w:rPr>
                   <w:rStyle w:val="Hyperlink"/>
@@ -636,9 +661,9 @@
                 <w:sz w:val="17"/>
                 <w:szCs w:val="17"/>
               </w:rPr>
-              <w:t xml:space="preserve">L4  </w:t>
+              <w:t xml:space="preserve">L4 </w:t>
             </w:r>
-            <w:hyperlink w:history="1" r:id="rIdkjsfous1tv8vpul3eoe1h">
+            <w:hyperlink w:history="1" r:id="rIdoqoyrvegtdppdtbyvlfro">
               <w:r>
                 <w:rPr>
                   <w:rStyle w:val="Hyperlink"/>
@@ -667,9 +692,9 @@
                 <w:sz w:val="17"/>
                 <w:szCs w:val="17"/>
               </w:rPr>
-              <w:t xml:space="preserve">L5  </w:t>
+              <w:t xml:space="preserve">L5 </w:t>
             </w:r>
-            <w:hyperlink w:history="1" r:id="rIdbpgv96ljb6ce_4mi_5kgx">
+            <w:hyperlink w:history="1" r:id="rId6e8ts27aehwgzcxoitevx">
               <w:r>
                 <w:rPr>
                   <w:rStyle w:val="Hyperlink"/>
@@ -698,9 +723,9 @@
                 <w:sz w:val="17"/>
                 <w:szCs w:val="17"/>
               </w:rPr>
-              <w:t xml:space="preserve">L6  </w:t>
+              <w:t xml:space="preserve">L6 </w:t>
             </w:r>
-            <w:hyperlink w:history="1" r:id="rId5xvkslfm61bxkubstmug1">
+            <w:hyperlink w:history="1" r:id="rIdlcuuelkatll0etktrxvda">
               <w:r>
                 <w:rPr>
                   <w:rStyle w:val="Hyperlink"/>
@@ -729,9 +754,9 @@
                 <w:sz w:val="17"/>
                 <w:szCs w:val="17"/>
               </w:rPr>
-              <w:t xml:space="preserve">L7  </w:t>
+              <w:t xml:space="preserve">L7 </w:t>
             </w:r>
-            <w:hyperlink w:history="1" r:id="rIdfrrj21gm4mmdilqgr39wt">
+            <w:hyperlink w:history="1" r:id="rId_n_ipkqvm3zx_fdhmbxbz">
               <w:r>
                 <w:rPr>
                   <w:rStyle w:val="Hyperlink"/>
@@ -758,12 +783,15 @@
                 <w:sz w:val="17"/>
                 <w:szCs w:val="17"/>
               </w:rPr>
-              <w:t xml:space="preserve">PLACEHOLDER, page not yet built: advanced analytics services → /services/advanced-analytics-services/ (S6 card 6; dotted underline in this document)</w:t>
+              <w:t xml:space="preserve">PLACEHOLDER, page slug to be confirmed: advanced analytics services → /services/advanced-analytics-services/ (S6 card 6; dotted underline in this document)</w:t>
             </w:r>
           </w:p>
         </w:tc>
       </w:tr>
       <w:tr>
+        <w:trPr>
+          <w:cantSplit/>
+        </w:trPr>
         <w:tc>
           <w:tcPr>
             <w:tcW w:type="dxa" w:w="2200"/>
@@ -775,15 +803,15 @@
             </w:tcBorders>
             <w:shd w:fill="EEF4F6" w:color="auto" w:val="clear"/>
             <w:tcMar>
-              <w:top w:type="dxa" w:w="50"/>
-              <w:left w:type="dxa" w:w="140"/>
-              <w:bottom w:type="dxa" w:w="50"/>
-              <w:right w:type="dxa" w:w="140"/>
+              <w:top w:type="dxa" w:w="60"/>
+              <w:left w:type="dxa" w:w="100"/>
+              <w:bottom w:type="dxa" w:w="60"/>
+              <w:right w:type="dxa" w:w="100"/>
             </w:tcMar>
           </w:tcPr>
           <w:p>
             <w:pPr>
-              <w:spacing w:after="0" w:line="240" w:lineRule="auto"/>
+              <w:spacing w:after="20" w:line="240" w:lineRule="auto"/>
             </w:pPr>
             <w:r>
               <w:rPr>
@@ -806,10 +834,10 @@
               <w:right w:val="single" w:color="D1D5DB" w:sz="4"/>
             </w:tcBorders>
             <w:tcMar>
-              <w:top w:type="dxa" w:w="50"/>
-              <w:left w:type="dxa" w:w="140"/>
-              <w:bottom w:type="dxa" w:w="50"/>
-              <w:right w:type="dxa" w:w="140"/>
+              <w:top w:type="dxa" w:w="60"/>
+              <w:left w:type="dxa" w:w="100"/>
+              <w:bottom w:type="dxa" w:w="60"/>
+              <w:right w:type="dxa" w:w="100"/>
             </w:tcMar>
           </w:tcPr>
           <w:p>
@@ -827,6 +855,9 @@
         </w:tc>
       </w:tr>
       <w:tr>
+        <w:trPr>
+          <w:cantSplit/>
+        </w:trPr>
         <w:tc>
           <w:tcPr>
             <w:tcW w:type="dxa" w:w="2200"/>
@@ -838,15 +869,15 @@
             </w:tcBorders>
             <w:shd w:fill="EEF4F6" w:color="auto" w:val="clear"/>
             <w:tcMar>
-              <w:top w:type="dxa" w:w="50"/>
-              <w:left w:type="dxa" w:w="140"/>
-              <w:bottom w:type="dxa" w:w="50"/>
-              <w:right w:type="dxa" w:w="140"/>
+              <w:top w:type="dxa" w:w="60"/>
+              <w:left w:type="dxa" w:w="100"/>
+              <w:bottom w:type="dxa" w:w="60"/>
+              <w:right w:type="dxa" w:w="100"/>
             </w:tcMar>
           </w:tcPr>
           <w:p>
             <w:pPr>
-              <w:spacing w:after="0" w:line="240" w:lineRule="auto"/>
+              <w:spacing w:after="20" w:line="240" w:lineRule="auto"/>
             </w:pPr>
             <w:r>
               <w:rPr>
@@ -869,10 +900,10 @@
               <w:right w:val="single" w:color="D1D5DB" w:sz="4"/>
             </w:tcBorders>
             <w:tcMar>
-              <w:top w:type="dxa" w:w="50"/>
-              <w:left w:type="dxa" w:w="140"/>
-              <w:bottom w:type="dxa" w:w="50"/>
-              <w:right w:type="dxa" w:w="140"/>
+              <w:top w:type="dxa" w:w="60"/>
+              <w:left w:type="dxa" w:w="100"/>
+              <w:bottom w:type="dxa" w:w="60"/>
+              <w:right w:type="dxa" w:w="100"/>
             </w:tcMar>
           </w:tcPr>
           <w:p>
@@ -891,24 +922,16 @@
       </w:tr>
     </w:tbl>
     <w:p>
-      <w:r>
-        <w:br w:type="page"/>
-      </w:r>
-    </w:p>
-    <w:p>
       <w:pPr>
         <w:pStyle w:val="Marker"/>
         <w:keepNext/>
       </w:pPr>
       <w:r>
-        <w:t xml:space="preserve">S0  ·  Breadcrumb (not counted)</w:t>
-      </w:r>
-    </w:p>
-    <w:p>
-      <w:pPr>
-        <w:pStyle w:val="Note"/>
-      </w:pPr>
-      <w:hyperlink w:history="1" r:id="rIdb42e4l3hfrzlgnfjll3rb">
+        <w:t xml:space="preserve">S0 · Breadcrumb (not counted)</w:t>
+      </w:r>
+    </w:p>
+    <w:p>
+      <w:hyperlink w:history="1" r:id="rIdfwiwxbydiykjfqzq6zoyl">
         <w:r>
           <w:rPr>
             <w:rStyle w:val="Hyperlink"/>
@@ -923,6 +946,9 @@
         <w:t xml:space="preserve">  ›  </w:t>
       </w:r>
       <w:r>
+        <w:rPr>
+          <w:color w:val="4B5563"/>
+        </w:rPr>
         <w:t xml:space="preserve">Services</w:t>
       </w:r>
       <w:r>
@@ -931,7 +957,7 @@
         </w:rPr>
         <w:t xml:space="preserve">  ›  </w:t>
       </w:r>
-      <w:hyperlink w:history="1" r:id="rIdx9cuvd3vx4gkxtwfo9odf">
+      <w:hyperlink w:history="1" r:id="rIdhiv16_gsea9k3ldb6y4s8">
         <w:r>
           <w:rPr>
             <w:rStyle w:val="Hyperlink"/>
@@ -945,7 +971,7 @@
         </w:rPr>
         <w:t xml:space="preserve">  ›  </w:t>
       </w:r>
-      <w:hyperlink w:history="1" r:id="rIdzlhzxxco6dkq2nv4vbp5r">
+      <w:hyperlink w:history="1" r:id="rIdtqg8a2tqbf0ojiemjojce">
         <w:r>
           <w:rPr>
             <w:rStyle w:val="Hyperlink"/>
@@ -960,6 +986,9 @@
         <w:t xml:space="preserve">  ›  </w:t>
       </w:r>
       <w:r>
+        <w:rPr>
+          <w:color w:val="4B5563"/>
+        </w:rPr>
         <w:t xml:space="preserve">Data Analytics &amp; Business Intelligence (Power BI)</w:t>
       </w:r>
     </w:p>
@@ -969,7 +998,7 @@
         <w:keepNext/>
       </w:pPr>
       <w:r>
-        <w:t xml:space="preserve">S1  ·  Hero, "one version of the numbers" sub-block and deployment line</w:t>
+        <w:t xml:space="preserve">S1 · Hero, "one version of the numbers" sub-block and deployment line</w:t>
       </w:r>
     </w:p>
     <w:p>
@@ -984,18 +1013,14 @@
     <w:p>
       <w:pPr>
         <w:pStyle w:val="Heading1"/>
-        <w:keepNext/>
-      </w:pPr>
-      <w:bookmarkStart w:name="top" w:id="1"/>
+      </w:pPr>
       <w:r>
         <w:t xml:space="preserve">HLB HAMT: Your Power BI Service Partner for Smarter Decisions in the UAE</w:t>
       </w:r>
-      <w:bookmarkEnd w:id="1"/>
     </w:p>
     <w:p>
       <w:pPr>
         <w:pStyle w:val="Lede"/>
-        <w:keepNext/>
       </w:pPr>
       <w:r>
         <w:t xml:space="preserve">HLB HAMT designs, builds and runs your Power BI service, turning ERP, CRM, finance and spreadsheet data into dashboards your leadership team can take straight into the boardroom. Our chartered accountants work beside our data engineers, so the measures behind each report follow the rules your auditors test, whether you operate in one emirate or across the GCC.</w:t>
@@ -1034,7 +1059,7 @@
         <w:t xml:space="preserve">Button: </w:t>
       </w:r>
       <w:r>
-        <w:t xml:space="preserve">See the PowerUP! offer</w:t>
+        <w:t xml:space="preserve">See our engagement models</w:t>
       </w:r>
       <w:r>
         <w:rPr>
@@ -1119,12 +1144,12 @@
         <w:keepNext/>
       </w:pPr>
       <w:r>
-        <w:t xml:space="preserve">S2  ·  Dark stats strip (4 items, no heading on page)</w:t>
+        <w:t xml:space="preserve">S2 · Dark stats strip (3 items, no heading on page)</w:t>
       </w:r>
     </w:p>
     <w:tbl>
       <w:tblPr>
-        <w:tblW w:type="dxa" w:w="9024"/>
+        <w:tblW w:type="dxa" w:w="9026"/>
         <w:tblBorders>
           <w:top w:val="single" w:color="auto" w:sz="4"/>
           <w:left w:val="single" w:color="auto" w:sz="4"/>
@@ -1135,32 +1160,34 @@
         </w:tblBorders>
       </w:tblPr>
       <w:tblGrid>
-        <w:gridCol w:w="2256"/>
-        <w:gridCol w:w="2256"/>
-        <w:gridCol w:w="2256"/>
-        <w:gridCol w:w="2256"/>
+        <w:gridCol w:w="3008"/>
+        <w:gridCol w:w="3008"/>
+        <w:gridCol w:w="3010"/>
       </w:tblGrid>
       <w:tr>
+        <w:trPr>
+          <w:cantSplit/>
+        </w:trPr>
         <w:tc>
           <w:tcPr>
-            <w:tcW w:type="dxa" w:w="2256"/>
+            <w:tcW w:type="dxa" w:w="3008"/>
             <w:tcBorders>
-              <w:top w:val="single" w:color="D1D5DB" w:sz="4"/>
-              <w:left w:val="single" w:color="D1D5DB" w:sz="4"/>
-              <w:bottom w:val="single" w:color="D1D5DB" w:sz="4"/>
-              <w:right w:val="single" w:color="D1D5DB" w:sz="4"/>
+              <w:top w:val="single" w:color="FFFFFF" w:sz="6"/>
+              <w:left w:val="single" w:color="FFFFFF" w:sz="6"/>
+              <w:bottom w:val="single" w:color="FFFFFF" w:sz="6"/>
+              <w:right w:val="single" w:color="FFFFFF" w:sz="6"/>
             </w:tcBorders>
             <w:shd w:fill="3C3C3B" w:color="auto" w:val="clear"/>
             <w:tcMar>
-              <w:top w:type="dxa" w:w="100"/>
+              <w:top w:type="dxa" w:w="140"/>
               <w:left w:type="dxa" w:w="140"/>
-              <w:bottom w:type="dxa" w:w="100"/>
+              <w:bottom w:type="dxa" w:w="160"/>
               <w:right w:type="dxa" w:w="140"/>
             </w:tcMar>
           </w:tcPr>
           <w:p>
             <w:pPr>
-              <w:spacing w:after="60"/>
+              <w:spacing w:after="60" w:line="240" w:lineRule="auto"/>
             </w:pPr>
             <w:r>
               <w:rPr>
@@ -1174,19 +1201,22 @@
             </w:r>
           </w:p>
           <w:p>
+            <w:pPr>
+              <w:spacing w:after="0" w:line="260" w:lineRule="auto"/>
+            </w:pPr>
             <w:r>
               <w:rPr>
                 <w:color w:val="E5E7EB"/>
-                <w:sz w:val="18"/>
-                <w:szCs w:val="18"/>
+                <w:sz w:val="17"/>
+                <w:szCs w:val="17"/>
               </w:rPr>
               <w:t xml:space="preserve">Power BI connectors; we configure yours and build missing ones.</w:t>
             </w:r>
             <w:r>
               <w:rPr>
                 <w:color w:val="E5E7EB"/>
-                <w:sz w:val="18"/>
-                <w:szCs w:val="18"/>
+                <w:sz w:val="17"/>
+                <w:szCs w:val="17"/>
                 <w:vertAlign w:val="superscript"/>
               </w:rPr>
               <w:t xml:space="preserve">2</w:t>
@@ -1195,76 +1225,24 @@
         </w:tc>
         <w:tc>
           <w:tcPr>
-            <w:tcW w:type="dxa" w:w="2256"/>
+            <w:tcW w:type="dxa" w:w="3008"/>
             <w:tcBorders>
-              <w:top w:val="single" w:color="D1D5DB" w:sz="4"/>
-              <w:left w:val="single" w:color="D1D5DB" w:sz="4"/>
-              <w:bottom w:val="single" w:color="D1D5DB" w:sz="4"/>
-              <w:right w:val="single" w:color="D1D5DB" w:sz="4"/>
+              <w:top w:val="single" w:color="FFFFFF" w:sz="6"/>
+              <w:left w:val="single" w:color="FFFFFF" w:sz="6"/>
+              <w:bottom w:val="single" w:color="FFFFFF" w:sz="6"/>
+              <w:right w:val="single" w:color="FFFFFF" w:sz="6"/>
             </w:tcBorders>
             <w:shd w:fill="3C3C3B" w:color="auto" w:val="clear"/>
             <w:tcMar>
-              <w:top w:type="dxa" w:w="100"/>
+              <w:top w:type="dxa" w:w="140"/>
               <w:left w:type="dxa" w:w="140"/>
-              <w:bottom w:type="dxa" w:w="100"/>
+              <w:bottom w:type="dxa" w:w="160"/>
               <w:right w:type="dxa" w:w="140"/>
             </w:tcMar>
           </w:tcPr>
           <w:p>
             <w:pPr>
-              <w:spacing w:after="60"/>
-            </w:pPr>
-            <w:r>
-              <w:rPr>
-                <w:b/>
-                <w:bCs/>
-                <w:color w:val="FFFFFF"/>
-                <w:sz w:val="26"/>
-                <w:szCs w:val="26"/>
-              </w:rPr>
-              <w:t xml:space="preserve">33x</w:t>
-            </w:r>
-          </w:p>
-          <w:p>
-            <w:r>
-              <w:rPr>
-                <w:color w:val="E5E7EB"/>
-                <w:sz w:val="18"/>
-                <w:szCs w:val="18"/>
-              </w:rPr>
-              <w:t xml:space="preserve">Faster report load times in one recent HLB HAMT engagement.</w:t>
-            </w:r>
-            <w:r>
-              <w:rPr>
-                <w:color w:val="E5E7EB"/>
-                <w:sz w:val="18"/>
-                <w:szCs w:val="18"/>
-                <w:vertAlign w:val="superscript"/>
-              </w:rPr>
-              <w:t xml:space="preserve">3</w:t>
-            </w:r>
-          </w:p>
-        </w:tc>
-        <w:tc>
-          <w:tcPr>
-            <w:tcW w:type="dxa" w:w="2256"/>
-            <w:tcBorders>
-              <w:top w:val="single" w:color="D1D5DB" w:sz="4"/>
-              <w:left w:val="single" w:color="D1D5DB" w:sz="4"/>
-              <w:bottom w:val="single" w:color="D1D5DB" w:sz="4"/>
-              <w:right w:val="single" w:color="D1D5DB" w:sz="4"/>
-            </w:tcBorders>
-            <w:shd w:fill="3C3C3B" w:color="auto" w:val="clear"/>
-            <w:tcMar>
-              <w:top w:type="dxa" w:w="100"/>
-              <w:left w:type="dxa" w:w="140"/>
-              <w:bottom w:type="dxa" w:w="100"/>
-              <w:right w:type="dxa" w:w="140"/>
-            </w:tcMar>
-          </w:tcPr>
-          <w:p>
-            <w:pPr>
-              <w:spacing w:after="60"/>
+              <w:spacing w:after="60" w:line="240" w:lineRule="auto"/>
             </w:pPr>
             <w:r>
               <w:rPr>
@@ -1278,45 +1256,48 @@
             </w:r>
           </w:p>
           <w:p>
+            <w:pPr>
+              <w:spacing w:after="0" w:line="260" w:lineRule="auto"/>
+            </w:pPr>
             <w:r>
               <w:rPr>
                 <w:color w:val="E5E7EB"/>
-                <w:sz w:val="18"/>
-                <w:szCs w:val="18"/>
+                <w:sz w:val="17"/>
+                <w:szCs w:val="17"/>
               </w:rPr>
               <w:t xml:space="preserve">A licensed UAE audit, tax and advisory firm that also builds your data platform.</w:t>
             </w:r>
             <w:r>
               <w:rPr>
                 <w:color w:val="E5E7EB"/>
-                <w:sz w:val="18"/>
-                <w:szCs w:val="18"/>
+                <w:sz w:val="17"/>
+                <w:szCs w:val="17"/>
                 <w:vertAlign w:val="superscript"/>
               </w:rPr>
-              <w:t xml:space="preserve">4</w:t>
+              <w:t xml:space="preserve">3</w:t>
             </w:r>
           </w:p>
         </w:tc>
         <w:tc>
           <w:tcPr>
-            <w:tcW w:type="dxa" w:w="2256"/>
+            <w:tcW w:type="dxa" w:w="3010"/>
             <w:tcBorders>
-              <w:top w:val="single" w:color="D1D5DB" w:sz="4"/>
-              <w:left w:val="single" w:color="D1D5DB" w:sz="4"/>
-              <w:bottom w:val="single" w:color="D1D5DB" w:sz="4"/>
-              <w:right w:val="single" w:color="D1D5DB" w:sz="4"/>
+              <w:top w:val="single" w:color="FFFFFF" w:sz="6"/>
+              <w:left w:val="single" w:color="FFFFFF" w:sz="6"/>
+              <w:bottom w:val="single" w:color="FFFFFF" w:sz="6"/>
+              <w:right w:val="single" w:color="FFFFFF" w:sz="6"/>
             </w:tcBorders>
             <w:shd w:fill="3C3C3B" w:color="auto" w:val="clear"/>
             <w:tcMar>
-              <w:top w:type="dxa" w:w="100"/>
+              <w:top w:type="dxa" w:w="140"/>
               <w:left w:type="dxa" w:w="140"/>
-              <w:bottom w:type="dxa" w:w="100"/>
+              <w:bottom w:type="dxa" w:w="160"/>
               <w:right w:type="dxa" w:w="140"/>
             </w:tcMar>
           </w:tcPr>
           <w:p>
             <w:pPr>
-              <w:spacing w:after="60"/>
+              <w:spacing w:after="60" w:line="240" w:lineRule="auto"/>
             </w:pPr>
             <w:r>
               <w:rPr>
@@ -1330,11 +1311,14 @@
             </w:r>
           </w:p>
           <w:p>
+            <w:pPr>
+              <w:spacing w:after="0" w:line="260" w:lineRule="auto"/>
+            </w:pPr>
             <w:r>
               <w:rPr>
                 <w:color w:val="E5E7EB"/>
-                <w:sz w:val="18"/>
-                <w:szCs w:val="18"/>
+                <w:sz w:val="17"/>
+                <w:szCs w:val="17"/>
               </w:rPr>
               <w:t xml:space="preserve">Right-to-left dashboards planned from the first mockup, not retrofitted.</w:t>
             </w:r>
@@ -1348,7 +1332,7 @@
         <w:keepNext/>
       </w:pPr>
       <w:r>
-        <w:t xml:space="preserve">S2b  ·  Recognition bar</w:t>
+        <w:t xml:space="preserve">S2b · Recognition bar</w:t>
       </w:r>
     </w:p>
     <w:p>
@@ -1356,6 +1340,8 @@
         <w:rPr>
           <w:b/>
           <w:bCs/>
+          <w:sz w:val="21"/>
+          <w:szCs w:val="21"/>
         </w:rPr>
         <w:t xml:space="preserve">HLB HAMT builds on Power BI. Microsoft was named a Leader in the 2026 Gartner® Magic Quadrant™ for Analytics and BI Platforms for the 19th consecutive year.</w:t>
       </w:r>
@@ -1363,9 +1349,11 @@
         <w:rPr>
           <w:b/>
           <w:bCs/>
+          <w:sz w:val="21"/>
+          <w:szCs w:val="21"/>
           <w:vertAlign w:val="superscript"/>
         </w:rPr>
-        <w:t xml:space="preserve">5</w:t>
+        <w:t xml:space="preserve">4</w:t>
       </w:r>
     </w:p>
     <w:p>
@@ -1379,7 +1367,7 @@
         </w:rPr>
         <w:t xml:space="preserve">Button: </w:t>
       </w:r>
-      <w:hyperlink w:history="1" r:id="rIdotb-sanialpwvav6jafx8">
+      <w:hyperlink w:history="1" r:id="rIdnnw7irmzrw-qkbblrpqzi">
         <w:r>
           <w:rPr>
             <w:rStyle w:val="Hyperlink"/>
@@ -1391,7 +1379,7 @@
         <w:rPr>
           <w:color w:val="4B5563"/>
         </w:rPr>
-        <w:t xml:space="preserve">  →  external link, opens in a new tab (same target as Source 5)</w:t>
+        <w:t xml:space="preserve">  →  external link, opens in a new tab (same target as Source 4)</w:t>
       </w:r>
     </w:p>
     <w:p>
@@ -1400,7 +1388,7 @@
         <w:keepNext/>
       </w:pPr>
       <w:r>
-        <w:t xml:space="preserve">S3  ·  Sticky anchor nav (not counted)</w:t>
+        <w:t xml:space="preserve">S3 · Sticky anchor nav (not counted)</w:t>
       </w:r>
     </w:p>
     <w:p>
@@ -1417,7 +1405,7 @@
         <w:keepNext/>
       </w:pPr>
       <w:r>
-        <w:t xml:space="preserve">S4  ·  Why HLB HAMT  ·  #whyhlbhamt</w:t>
+        <w:t xml:space="preserve">S4 · Why HLB HAMT · #whyhlbhamt</w:t>
       </w:r>
     </w:p>
     <w:p>
@@ -1434,21 +1422,18 @@
         <w:pStyle w:val="Heading2"/>
         <w:keepNext/>
       </w:pPr>
-      <w:bookmarkStart w:name="whyhlbhamt" w:id="2"/>
       <w:r>
         <w:t xml:space="preserve">Great Dashboards Start With the Numbers Behind Them</w:t>
       </w:r>
-      <w:bookmarkEnd w:id="2"/>
     </w:p>
     <w:p>
       <w:pPr>
         <w:pStyle w:val="Lede"/>
-        <w:keepNext/>
       </w:pPr>
       <w:r>
         <w:t xml:space="preserve">HLB HAMT is a Power BI consulting company that is also a licensed audit, tax and advisory firm, and a member of the HLB International network. Power BI gives us the platform; our accountants and engineers make the numbers reconcile. That combination anchors our </w:t>
       </w:r>
-      <w:hyperlink w:history="1" r:id="rIdli08jjycyopbsefjqfex8">
+      <w:hyperlink w:history="1" r:id="rIdnsqyqs5x0ygeqeq8jpb0n">
         <w:r>
           <w:rPr>
             <w:rStyle w:val="Hyperlink"/>
@@ -1533,7 +1518,7 @@
         <w:keepNext/>
       </w:pPr>
       <w:r>
-        <w:t xml:space="preserve">S5  ·  The Platform We Deliver (module table and platform layer)  ·  #explorepowerbi</w:t>
+        <w:t xml:space="preserve">S5 · The Platform We Deliver (module table and platform layer) · #explorepowerbi</w:t>
       </w:r>
     </w:p>
     <w:p>
@@ -1550,16 +1535,13 @@
         <w:pStyle w:val="Heading2"/>
         <w:keepNext/>
       </w:pPr>
-      <w:bookmarkStart w:name="explorepowerbi" w:id="3"/>
       <w:r>
         <w:t xml:space="preserve">What HLB HAMT Builds for You on Power BI</w:t>
       </w:r>
-      <w:bookmarkEnd w:id="3"/>
     </w:p>
     <w:p>
       <w:pPr>
         <w:pStyle w:val="Lede"/>
-        <w:keepNext/>
       </w:pPr>
       <w:r>
         <w:t xml:space="preserve">HLB HAMT delivers your reporting on Power BI because it works natively with the Microsoft productivity and business apps your staff already rely on. People who live in those tools pick it up with very little friction, which shortens the gap between go-live and everyday use. Below is what we build on each part of the platform.</w:t>
@@ -1600,12 +1582,11 @@
     <w:p>
       <w:pPr>
         <w:pStyle w:val="ListParagraph"/>
-        <w:keepNext/>
         <w:numPr>
           <w:ilvl w:val="0"/>
           <w:numId w:val="2"/>
         </w:numPr>
-        <w:spacing w:after="30"/>
+        <w:spacing w:after="20"/>
       </w:pPr>
       <w:r>
         <w:t xml:space="preserve">Interactive visuals</w:t>
@@ -1614,12 +1595,11 @@
     <w:p>
       <w:pPr>
         <w:pStyle w:val="ListParagraph"/>
-        <w:keepNext/>
         <w:numPr>
           <w:ilvl w:val="0"/>
           <w:numId w:val="2"/>
         </w:numPr>
-        <w:spacing w:after="30"/>
+        <w:spacing w:after="20"/>
       </w:pPr>
       <w:r>
         <w:t xml:space="preserve">DAX measures for custom KPIs</w:t>
@@ -1628,12 +1608,11 @@
     <w:p>
       <w:pPr>
         <w:pStyle w:val="ListParagraph"/>
-        <w:keepNext/>
         <w:numPr>
           <w:ilvl w:val="0"/>
           <w:numId w:val="2"/>
         </w:numPr>
-        <w:spacing w:after="30"/>
+        <w:spacing w:after="20"/>
       </w:pPr>
       <w:r>
         <w:t xml:space="preserve">Data shaping and cleansing</w:t>
@@ -1642,12 +1621,11 @@
     <w:p>
       <w:pPr>
         <w:pStyle w:val="ListParagraph"/>
-        <w:keepNext/>
         <w:numPr>
           <w:ilvl w:val="0"/>
           <w:numId w:val="2"/>
         </w:numPr>
-        <w:spacing w:after="30"/>
+        <w:spacing w:after="20"/>
       </w:pPr>
       <w:r>
         <w:t xml:space="preserve">Reusable report themes</w:t>
@@ -1656,12 +1634,11 @@
     <w:p>
       <w:pPr>
         <w:pStyle w:val="ListParagraph"/>
-        <w:keepNext w:val="false"/>
         <w:numPr>
           <w:ilvl w:val="0"/>
           <w:numId w:val="2"/>
         </w:numPr>
-        <w:spacing w:after="120"/>
+        <w:spacing w:after="20"/>
       </w:pPr>
       <w:r>
         <w:t xml:space="preserve">Arabic and English layouts</w:t>
@@ -1693,7 +1670,7 @@
         <w:rPr>
           <w:vertAlign w:val="superscript"/>
         </w:rPr>
-        <w:t xml:space="preserve">6</w:t>
+        <w:t xml:space="preserve">5</w:t>
       </w:r>
       <w:r>
         <w:t xml:space="preserve"> Leadership reads dashboards, analysts work in reports, and our administrators keep both healthy as usage grows.</w:t>
@@ -1711,12 +1688,11 @@
     <w:p>
       <w:pPr>
         <w:pStyle w:val="ListParagraph"/>
-        <w:keepNext/>
         <w:numPr>
           <w:ilvl w:val="0"/>
           <w:numId w:val="2"/>
         </w:numPr>
-        <w:spacing w:after="30"/>
+        <w:spacing w:after="20"/>
       </w:pPr>
       <w:r>
         <w:t xml:space="preserve">Workspaces and apps</w:t>
@@ -1725,12 +1701,11 @@
     <w:p>
       <w:pPr>
         <w:pStyle w:val="ListParagraph"/>
-        <w:keepNext/>
         <w:numPr>
           <w:ilvl w:val="0"/>
           <w:numId w:val="2"/>
         </w:numPr>
-        <w:spacing w:after="30"/>
+        <w:spacing w:after="20"/>
       </w:pPr>
       <w:r>
         <w:t xml:space="preserve">Scheduled refresh</w:t>
@@ -1739,12 +1714,11 @@
     <w:p>
       <w:pPr>
         <w:pStyle w:val="ListParagraph"/>
-        <w:keepNext/>
         <w:numPr>
           <w:ilvl w:val="0"/>
           <w:numId w:val="2"/>
         </w:numPr>
-        <w:spacing w:after="30"/>
+        <w:spacing w:after="20"/>
       </w:pPr>
       <w:r>
         <w:t xml:space="preserve">Row-level security</w:t>
@@ -1753,12 +1727,11 @@
     <w:p>
       <w:pPr>
         <w:pStyle w:val="ListParagraph"/>
-        <w:keepNext/>
         <w:numPr>
           <w:ilvl w:val="0"/>
           <w:numId w:val="2"/>
         </w:numPr>
-        <w:spacing w:after="30"/>
+        <w:spacing w:after="20"/>
       </w:pPr>
       <w:r>
         <w:t xml:space="preserve">Subscriptions and sharing</w:t>
@@ -1767,12 +1740,11 @@
     <w:p>
       <w:pPr>
         <w:pStyle w:val="ListParagraph"/>
-        <w:keepNext w:val="false"/>
         <w:numPr>
           <w:ilvl w:val="0"/>
           <w:numId w:val="2"/>
         </w:numPr>
-        <w:spacing w:after="120"/>
+        <w:spacing w:after="20"/>
       </w:pPr>
       <w:r>
         <w:t xml:space="preserve">Usage monitoring</w:t>
@@ -1813,12 +1785,11 @@
     <w:p>
       <w:pPr>
         <w:pStyle w:val="ListParagraph"/>
-        <w:keepNext/>
         <w:numPr>
           <w:ilvl w:val="0"/>
           <w:numId w:val="2"/>
         </w:numPr>
-        <w:spacing w:after="30"/>
+        <w:spacing w:after="20"/>
       </w:pPr>
       <w:r>
         <w:t xml:space="preserve">Native and partner connectors</w:t>
@@ -1827,12 +1798,11 @@
     <w:p>
       <w:pPr>
         <w:pStyle w:val="ListParagraph"/>
-        <w:keepNext/>
         <w:numPr>
           <w:ilvl w:val="0"/>
           <w:numId w:val="2"/>
         </w:numPr>
-        <w:spacing w:after="30"/>
+        <w:spacing w:after="20"/>
       </w:pPr>
       <w:r>
         <w:t xml:space="preserve">Custom connector builds</w:t>
@@ -1841,12 +1811,11 @@
     <w:p>
       <w:pPr>
         <w:pStyle w:val="ListParagraph"/>
-        <w:keepNext/>
         <w:numPr>
           <w:ilvl w:val="0"/>
           <w:numId w:val="2"/>
         </w:numPr>
-        <w:spacing w:after="30"/>
+        <w:spacing w:after="20"/>
       </w:pPr>
       <w:r>
         <w:t xml:space="preserve">On-premises data gateway</w:t>
@@ -1855,12 +1824,11 @@
     <w:p>
       <w:pPr>
         <w:pStyle w:val="ListParagraph"/>
-        <w:keepNext/>
         <w:numPr>
           <w:ilvl w:val="0"/>
           <w:numId w:val="2"/>
         </w:numPr>
-        <w:spacing w:after="30"/>
+        <w:spacing w:after="20"/>
       </w:pPr>
       <w:r>
         <w:t xml:space="preserve">ERP and CRM integration</w:t>
@@ -1869,12 +1837,11 @@
     <w:p>
       <w:pPr>
         <w:pStyle w:val="ListParagraph"/>
-        <w:keepNext w:val="false"/>
         <w:numPr>
           <w:ilvl w:val="0"/>
           <w:numId w:val="2"/>
         </w:numPr>
-        <w:spacing w:after="120"/>
+        <w:spacing w:after="20"/>
       </w:pPr>
       <w:r>
         <w:t xml:space="preserve">Spreadsheet and file sources</w:t>
@@ -1915,12 +1882,11 @@
     <w:p>
       <w:pPr>
         <w:pStyle w:val="ListParagraph"/>
-        <w:keepNext/>
         <w:numPr>
           <w:ilvl w:val="0"/>
           <w:numId w:val="2"/>
         </w:numPr>
-        <w:spacing w:after="30"/>
+        <w:spacing w:after="20"/>
       </w:pPr>
       <w:r>
         <w:t xml:space="preserve">Power BI mobile apps</w:t>
@@ -1929,12 +1895,11 @@
     <w:p>
       <w:pPr>
         <w:pStyle w:val="ListParagraph"/>
-        <w:keepNext/>
         <w:numPr>
           <w:ilvl w:val="0"/>
           <w:numId w:val="2"/>
         </w:numPr>
-        <w:spacing w:after="30"/>
+        <w:spacing w:after="20"/>
       </w:pPr>
       <w:r>
         <w:t xml:space="preserve">Data-driven alerts</w:t>
@@ -1943,12 +1908,11 @@
     <w:p>
       <w:pPr>
         <w:pStyle w:val="ListParagraph"/>
-        <w:keepNext/>
         <w:numPr>
           <w:ilvl w:val="0"/>
           <w:numId w:val="2"/>
         </w:numPr>
-        <w:spacing w:after="30"/>
+        <w:spacing w:after="20"/>
       </w:pPr>
       <w:r>
         <w:t xml:space="preserve">Mobile-optimised layouts</w:t>
@@ -1957,12 +1921,11 @@
     <w:p>
       <w:pPr>
         <w:pStyle w:val="ListParagraph"/>
-        <w:keepNext/>
         <w:numPr>
           <w:ilvl w:val="0"/>
           <w:numId w:val="2"/>
         </w:numPr>
-        <w:spacing w:after="30"/>
+        <w:spacing w:after="20"/>
       </w:pPr>
       <w:r>
         <w:t xml:space="preserve">Embedded analytics</w:t>
@@ -1971,12 +1934,11 @@
     <w:p>
       <w:pPr>
         <w:pStyle w:val="ListParagraph"/>
-        <w:keepNext w:val="false"/>
         <w:numPr>
           <w:ilvl w:val="0"/>
           <w:numId w:val="2"/>
         </w:numPr>
-        <w:spacing w:after="120"/>
+        <w:spacing w:after="20"/>
       </w:pPr>
       <w:r>
         <w:t xml:space="preserve">Capacity-based licensing</w:t>
@@ -2017,12 +1979,11 @@
     <w:p>
       <w:pPr>
         <w:pStyle w:val="ListParagraph"/>
-        <w:keepNext/>
         <w:numPr>
           <w:ilvl w:val="0"/>
           <w:numId w:val="2"/>
         </w:numPr>
-        <w:spacing w:after="30"/>
+        <w:spacing w:after="20"/>
       </w:pPr>
       <w:r>
         <w:t xml:space="preserve">Data platform readiness assessment</w:t>
@@ -2031,12 +1992,11 @@
     <w:p>
       <w:pPr>
         <w:pStyle w:val="ListParagraph"/>
-        <w:keepNext/>
         <w:numPr>
           <w:ilvl w:val="0"/>
           <w:numId w:val="2"/>
         </w:numPr>
-        <w:spacing w:after="30"/>
+        <w:spacing w:after="20"/>
       </w:pPr>
       <w:r>
         <w:t xml:space="preserve">Automated data pipelines</w:t>
@@ -2045,12 +2005,11 @@
     <w:p>
       <w:pPr>
         <w:pStyle w:val="ListParagraph"/>
-        <w:keepNext/>
         <w:numPr>
           <w:ilvl w:val="0"/>
           <w:numId w:val="2"/>
         </w:numPr>
-        <w:spacing w:after="30"/>
+        <w:spacing w:after="20"/>
       </w:pPr>
       <w:r>
         <w:t xml:space="preserve">Bronze, Silver and Gold layers</w:t>
@@ -2059,12 +2018,11 @@
     <w:p>
       <w:pPr>
         <w:pStyle w:val="ListParagraph"/>
-        <w:keepNext w:val="false"/>
         <w:numPr>
           <w:ilvl w:val="0"/>
           <w:numId w:val="2"/>
         </w:numPr>
-        <w:spacing w:after="120"/>
+        <w:spacing w:after="20"/>
       </w:pPr>
       <w:r>
         <w:t xml:space="preserve">Migration planning</w:t>
@@ -2076,7 +2034,7 @@
         <w:keepNext/>
       </w:pPr>
       <w:r>
-        <w:t xml:space="preserve">S6  ·  Use cases (6 flip cards: front = title and tagline, back = detail and button)  ·  #usecases</w:t>
+        <w:t xml:space="preserve">S6 · Use cases (6 flip cards: front = title and tagline, back = detail and button) · #usecases</w:t>
       </w:r>
     </w:p>
     <w:p>
@@ -2093,21 +2051,18 @@
         <w:pStyle w:val="Heading2"/>
         <w:keepNext/>
       </w:pPr>
-      <w:bookmarkStart w:name="usecases" w:id="4"/>
       <w:r>
         <w:t xml:space="preserve">Dashboards Shaped Around the Decisions You Make</w:t>
       </w:r>
-      <w:bookmarkEnd w:id="4"/>
     </w:p>
     <w:p>
       <w:pPr>
         <w:pStyle w:val="Lede"/>
-        <w:keepNext/>
       </w:pPr>
       <w:r>
         <w:t xml:space="preserve">Our consultants begin with the KPIs a role or sector is judged on, then design the model, measures and page layout around those numbers. The same KPI-first thinking runs through our wider </w:t>
       </w:r>
-      <w:hyperlink w:history="1" r:id="rIdsmfbwp1k-atxbzbbcgj8t">
+      <w:hyperlink w:history="1" r:id="rIdzchy1dtjut52mnollgreo">
         <w:r>
           <w:rPr>
             <w:rStyle w:val="Hyperlink"/>
@@ -2187,7 +2142,7 @@
       <w:r>
         <w:t xml:space="preserve">We track taxable income, IAS 12 deferred tax, transfer pricing and VAT returns, with free zone and mainland results kept apart. With our </w:t>
       </w:r>
-      <w:hyperlink w:history="1" r:id="rIdjpllm1wfq3sixqwu7s7qz">
+      <w:hyperlink w:history="1" r:id="rIdsczuvrsbgqacf2tdvaeox">
         <w:r>
           <w:rPr>
             <w:rStyle w:val="Hyperlink"/>
@@ -2380,8 +2335,7 @@
       </w:r>
       <w:r>
         <w:rPr>
-          <w:color w:val="005A77"/>
-          <w:u w:val="dotted" w:color="005A77"/>
+          <w:u w:val="dotted"/>
         </w:rPr>
         <w:t xml:space="preserve">advanced analytics services</w:t>
       </w:r>
@@ -2430,7 +2384,7 @@
         <w:keepNext/>
       </w:pPr>
       <w:r>
-        <w:t xml:space="preserve">S7  ·  HLB HAMT's Power BI Services (numbered offerings 01 to 06)  ·  #services</w:t>
+        <w:t xml:space="preserve">S7 · HLB HAMT's Power BI Services (numbered offerings 01 to 06) · #services</w:t>
       </w:r>
     </w:p>
     <w:p>
@@ -2447,16 +2401,13 @@
         <w:pStyle w:val="Heading2"/>
         <w:keepNext/>
       </w:pPr>
-      <w:bookmarkStart w:name="services" w:id="5"/>
       <w:r>
         <w:t xml:space="preserve">HLB HAMT's Power BI Services</w:t>
       </w:r>
-      <w:bookmarkEnd w:id="5"/>
     </w:p>
     <w:p>
       <w:pPr>
         <w:pStyle w:val="Lede"/>
-        <w:keepNext/>
       </w:pPr>
       <w:r>
         <w:t xml:space="preserve">We handle every stage of a Power BI programme ourselves, from strategy through to post-launch support, and most clients use several of the services below. Your engagement model, covered further down, decides the mix.</w:t>
@@ -2530,7 +2481,7 @@
       <w:r>
         <w:t xml:space="preserve">We work model-first, not visual-first: semantic models with consistent KPI definitions and tested DAX come ahead of the first chart. On that base we build executive dashboards and analyst reports with drill-through, cross-filtering, slicers and bookmarks, plus mobile layouts and Arabic right-to-left design. See </w:t>
       </w:r>
-      <w:hyperlink w:history="1" r:id="rId71ad8ggq_w4id8fwcnqar">
+      <w:hyperlink w:history="1" r:id="rIdcbfxbnnffpwpjepid5_qi">
         <w:r>
           <w:rPr>
             <w:rStyle w:val="Hyperlink"/>
@@ -2617,7 +2568,7 @@
         <w:keepNext/>
       </w:pPr>
       <w:r>
-        <w:t xml:space="preserve">S8  ·  Mid-page CTA 1</w:t>
+        <w:t xml:space="preserve">S8 · Mid-page CTA 1</w:t>
       </w:r>
     </w:p>
     <w:p>
@@ -2661,7 +2612,7 @@
         <w:keepNext/>
       </w:pPr>
       <w:r>
-        <w:t xml:space="preserve">S9  ·  5-step proof of concept (highlighted band)  ·  #methodology</w:t>
+        <w:t xml:space="preserve">S9 · 5-step proof of concept (highlighted band) · #methodology</w:t>
       </w:r>
     </w:p>
     <w:p>
@@ -2678,7 +2629,7 @@
         <w:pStyle w:val="Heading2"/>
         <w:keepNext/>
       </w:pPr>
-      <w:bookmarkStart w:name="methodology" w:id="6"/>
+      <w:bookmarkStart w:name="methodology" w:id="1"/>
       <w:r>
         <w:t xml:space="preserve">A Working Power BI Dashboard on Your Data in 7 Days</w:t>
       </w:r>
@@ -2686,14 +2637,13 @@
         <w:rPr>
           <w:vertAlign w:val="superscript"/>
         </w:rPr>
-        <w:t xml:space="preserve">7</w:t>
-      </w:r>
-      <w:bookmarkEnd w:id="6"/>
+        <w:t xml:space="preserve">6</w:t>
+      </w:r>
+      <w:bookmarkEnd w:id="1"/>
     </w:p>
     <w:p>
       <w:pPr>
         <w:pStyle w:val="Lede"/>
-        <w:keepNext/>
       </w:pPr>
       <w:r>
         <w:t xml:space="preserve">We prove the value on your own data for a defined use case, measured against success criteria agreed at the outset, while the investment is still small. Your next decision then rests on pages your team has clicked through itself.</w:t>
@@ -2841,7 +2791,7 @@
         <w:keepNext/>
       </w:pPr>
       <w:r>
-        <w:t xml:space="preserve">S10  ·  Engagement models and PowerUP!  ·  #packages</w:t>
+        <w:t xml:space="preserve">S10 · Engagement models (4-tab matrix: Explore, Implement, Extend, Support) · #packages</w:t>
       </w:r>
     </w:p>
     <w:p>
@@ -2858,16 +2808,15 @@
         <w:pStyle w:val="Heading2"/>
         <w:keepNext/>
       </w:pPr>
-      <w:bookmarkStart w:name="packages" w:id="7"/>
+      <w:bookmarkStart w:name="packages" w:id="2"/>
       <w:r>
         <w:t xml:space="preserve">Engagement Models That Match Where You Are Today</w:t>
       </w:r>
-      <w:bookmarkEnd w:id="7"/>
+      <w:bookmarkEnd w:id="2"/>
     </w:p>
     <w:p>
       <w:pPr>
         <w:pStyle w:val="Lede"/>
-        <w:keepNext/>
       </w:pPr>
       <w:r>
         <w:t xml:space="preserve">We offer four ways in: explore before you spend, implement in phases, extend your own team, or hand us the ongoing care. You can switch models as your needs change.</w:t>
@@ -2875,231 +2824,7 @@
     </w:p>
     <w:p>
       <w:pPr>
-        <w:pStyle w:val="Label"/>
-        <w:keepNext/>
-      </w:pPr>
-      <w:r>
-        <w:t xml:space="preserve">Featured card  ·  badge: Limited offer</w:t>
-      </w:r>
-    </w:p>
-    <w:p>
-      <w:pPr>
-        <w:pStyle w:val="Heading3"/>
-        <w:keepNext/>
-      </w:pPr>
-      <w:r>
-        <w:t xml:space="preserve">PowerUP!: HLB HAMT's Fixed-Price Power BI Accelerator</w:t>
-      </w:r>
-    </w:p>
-    <w:p>
-      <w:pPr>
-        <w:pStyle w:val="Price"/>
-      </w:pPr>
-      <w:r>
-        <w:t xml:space="preserve">$4,500 fixed-price accelerator</w:t>
-      </w:r>
-    </w:p>
-    <w:p>
-      <w:r>
-        <w:t xml:space="preserve">PowerUP! is for organisations sitting on useful data that nobody has yet turned into answers. We connect your files, chart the KPIs your stakeholders care about most, and guide your team towards early results against objectives agreed on day one. Because the scope is capped, the fee does not move.</w:t>
-      </w:r>
-    </w:p>
-    <w:p>
-      <w:pPr>
-        <w:pStyle w:val="Label"/>
-        <w:keepNext/>
-      </w:pPr>
-      <w:r>
-        <w:t xml:space="preserve">What's in scope</w:t>
-      </w:r>
-    </w:p>
-    <w:p>
-      <w:pPr>
-        <w:pStyle w:val="ListParagraph"/>
-        <w:keepNext/>
-        <w:numPr>
-          <w:ilvl w:val="0"/>
-          <w:numId w:val="2"/>
-        </w:numPr>
-        <w:spacing w:after="30"/>
-      </w:pPr>
-      <w:r>
-        <w:t xml:space="preserve">A requirements workshop that pins down a clear use case</w:t>
-      </w:r>
-    </w:p>
-    <w:p>
-      <w:pPr>
-        <w:pStyle w:val="ListParagraph"/>
-        <w:keepNext/>
-        <w:numPr>
-          <w:ilvl w:val="0"/>
-          <w:numId w:val="2"/>
-        </w:numPr>
-        <w:spacing w:after="30"/>
-      </w:pPr>
-      <w:r>
-        <w:t xml:space="preserve">File-based data sources supplied by you</w:t>
-      </w:r>
-    </w:p>
-    <w:p>
-      <w:pPr>
-        <w:pStyle w:val="ListParagraph"/>
-        <w:keepNext/>
-        <w:numPr>
-          <w:ilvl w:val="0"/>
-          <w:numId w:val="2"/>
-        </w:numPr>
-        <w:spacing w:after="30"/>
-      </w:pPr>
-      <w:r>
-        <w:t xml:space="preserve">Up to 5 report tabs</w:t>
-      </w:r>
-    </w:p>
-    <w:p>
-      <w:pPr>
-        <w:pStyle w:val="ListParagraph"/>
-        <w:keepNext/>
-        <w:numPr>
-          <w:ilvl w:val="0"/>
-          <w:numId w:val="2"/>
-        </w:numPr>
-        <w:spacing w:after="30"/>
-      </w:pPr>
-      <w:r>
-        <w:t xml:space="preserve">Up to 2 distinct consumer personas</w:t>
-      </w:r>
-    </w:p>
-    <w:p>
-      <w:pPr>
-        <w:pStyle w:val="ListParagraph"/>
-        <w:keepNext w:val="false"/>
-        <w:numPr>
-          <w:ilvl w:val="0"/>
-          <w:numId w:val="2"/>
-        </w:numPr>
-        <w:spacing w:after="120"/>
-      </w:pPr>
-      <w:r>
-        <w:t xml:space="preserve">Mockup approval, then 1 revision round after functional delivery</w:t>
-      </w:r>
-    </w:p>
-    <w:p>
-      <w:pPr>
-        <w:pStyle w:val="Label"/>
-        <w:keepNext/>
-      </w:pPr>
-      <w:r>
-        <w:t xml:space="preserve">What you receive</w:t>
-      </w:r>
-    </w:p>
-    <w:p>
-      <w:pPr>
-        <w:pStyle w:val="ListParagraph"/>
-        <w:keepNext/>
-        <w:numPr>
-          <w:ilvl w:val="0"/>
-          <w:numId w:val="2"/>
-        </w:numPr>
-        <w:spacing w:after="30"/>
-      </w:pPr>
-      <w:r>
-        <w:t xml:space="preserve">Requirements workshop documentation</w:t>
-      </w:r>
-    </w:p>
-    <w:p>
-      <w:pPr>
-        <w:pStyle w:val="ListParagraph"/>
-        <w:keepNext/>
-        <w:numPr>
-          <w:ilvl w:val="0"/>
-          <w:numId w:val="2"/>
-        </w:numPr>
-        <w:spacing w:after="30"/>
-      </w:pPr>
-      <w:r>
-        <w:t xml:space="preserve">Data transformation scripts</w:t>
-      </w:r>
-    </w:p>
-    <w:p>
-      <w:pPr>
-        <w:pStyle w:val="ListParagraph"/>
-        <w:keepNext/>
-        <w:numPr>
-          <w:ilvl w:val="0"/>
-          <w:numId w:val="2"/>
-        </w:numPr>
-        <w:spacing w:after="30"/>
-      </w:pPr>
-      <w:r>
-        <w:t xml:space="preserve">Data model diagram</w:t>
-      </w:r>
-    </w:p>
-    <w:p>
-      <w:pPr>
-        <w:pStyle w:val="ListParagraph"/>
-        <w:keepNext/>
-        <w:numPr>
-          <w:ilvl w:val="0"/>
-          <w:numId w:val="2"/>
-        </w:numPr>
-        <w:spacing w:after="30"/>
-      </w:pPr>
-      <w:r>
-        <w:t xml:space="preserve">Data dictionary</w:t>
-      </w:r>
-    </w:p>
-    <w:p>
-      <w:pPr>
-        <w:pStyle w:val="ListParagraph"/>
-        <w:keepNext/>
-        <w:numPr>
-          <w:ilvl w:val="0"/>
-          <w:numId w:val="2"/>
-        </w:numPr>
-        <w:spacing w:after="30"/>
-      </w:pPr>
-      <w:r>
-        <w:t xml:space="preserve">Completed reports and dashboards</w:t>
-      </w:r>
-    </w:p>
-    <w:p>
-      <w:pPr>
-        <w:pStyle w:val="ListParagraph"/>
-        <w:keepNext w:val="false"/>
-        <w:numPr>
-          <w:ilvl w:val="0"/>
-          <w:numId w:val="2"/>
-        </w:numPr>
-        <w:spacing w:after="120"/>
-      </w:pPr>
-      <w:r>
-        <w:t xml:space="preserve">A published Power BI app</w:t>
-      </w:r>
-    </w:p>
-    <w:p>
-      <w:pPr>
-        <w:pStyle w:val="Button"/>
-      </w:pPr>
-      <w:r>
-        <w:rPr>
-          <w:b/>
-          <w:bCs/>
-        </w:rPr>
-        <w:t xml:space="preserve">Button: </w:t>
-      </w:r>
-      <w:r>
-        <w:t xml:space="preserve">Enquire about PowerUP!</w:t>
-      </w:r>
-      <w:r>
-        <w:rPr>
-          <w:color w:val="4B5563"/>
-        </w:rPr>
-        <w:t xml:space="preserve">  →  #contact</w:t>
-      </w:r>
-    </w:p>
-    <w:p>
-      <w:pPr>
-        <w:pStyle w:val="Label"/>
+        <w:pStyle w:val="SubBlock"/>
         <w:keepNext/>
       </w:pPr>
       <w:r>
@@ -3160,7 +2885,7 @@
     </w:p>
     <w:p>
       <w:pPr>
-        <w:pStyle w:val="Label"/>
+        <w:pStyle w:val="SubBlock"/>
         <w:keepNext/>
       </w:pPr>
       <w:r>
@@ -3224,7 +2949,7 @@
     </w:p>
     <w:p>
       <w:pPr>
-        <w:pStyle w:val="Label"/>
+        <w:pStyle w:val="SubBlock"/>
         <w:keepNext/>
       </w:pPr>
       <w:r>
@@ -3274,7 +2999,7 @@
     </w:p>
     <w:p>
       <w:pPr>
-        <w:pStyle w:val="Label"/>
+        <w:pStyle w:val="SubBlock"/>
         <w:keepNext/>
       </w:pPr>
       <w:r>
@@ -3370,7 +3095,7 @@
         <w:keepNext/>
       </w:pPr>
       <w:r>
-        <w:t xml:space="preserve">S11  ·  HLB HAMT advantage (6-tile credential grid)</w:t>
+        <w:t xml:space="preserve">S11 · HLB HAMT advantage (6-tile credential grid)</w:t>
       </w:r>
     </w:p>
     <w:p>
@@ -3387,16 +3112,13 @@
         <w:pStyle w:val="Heading2"/>
         <w:keepNext/>
       </w:pPr>
-      <w:bookmarkStart w:name="advantage" w:id="8"/>
       <w:r>
         <w:t xml:space="preserve">Why UAE Businesses Choose HLB HAMT for Power BI Services</w:t>
       </w:r>
-      <w:bookmarkEnd w:id="8"/>
     </w:p>
     <w:p>
       <w:pPr>
         <w:pStyle w:val="Lede"/>
-        <w:keepNext/>
       </w:pPr>
       <w:r>
         <w:t xml:space="preserve">We expect to be judged the way any Power BI consulting company should be: on whether your board acts on the figures we deliver.</w:t>
@@ -3441,7 +3163,7 @@
     </w:p>
     <w:p>
       <w:r>
-        <w:t xml:space="preserve">Begin with the fixed-price PowerUP! or a working dashboard on your data, then scale once it proves itself.</w:t>
+        <w:t xml:space="preserve">Begin with a working dashboard on your own data, then scale once it proves itself.</w:t>
       </w:r>
     </w:p>
     <w:p>
@@ -3457,7 +3179,7 @@
       <w:r>
         <w:t xml:space="preserve">Booked revenue in Power BI, open-deal scoring in </w:t>
       </w:r>
-      <w:hyperlink w:history="1" r:id="rIdxjbpfjgxvhe5oalsu6nvk">
+      <w:hyperlink w:history="1" r:id="rIdgbdncoivgn1jknd6kemhp">
         <w:r>
           <w:rPr>
             <w:rStyle w:val="Hyperlink"/>
@@ -3486,7 +3208,7 @@
         <w:rPr>
           <w:vertAlign w:val="superscript"/>
         </w:rPr>
-        <w:t xml:space="preserve">4</w:t>
+        <w:t xml:space="preserve">3</w:t>
       </w:r>
     </w:p>
     <w:p>
@@ -3509,7 +3231,7 @@
         <w:keepNext/>
       </w:pPr>
       <w:r>
-        <w:t xml:space="preserve">S12  ·  See it in action (static visual; no video supplied)</w:t>
+        <w:t xml:space="preserve">S12 · See it in action (static visual; no video supplied)</w:t>
       </w:r>
     </w:p>
     <w:p>
@@ -3526,13 +3248,14 @@
         <w:pStyle w:val="Heading2"/>
         <w:keepNext/>
       </w:pPr>
-      <w:bookmarkStart w:name="demo" w:id="9"/>
       <w:r>
         <w:t xml:space="preserve">Inside an HLB HAMT Power BI Dashboard</w:t>
       </w:r>
-      <w:bookmarkEnd w:id="9"/>
-    </w:p>
-    <w:p>
+    </w:p>
+    <w:p>
+      <w:pPr>
+        <w:pStyle w:val="Lede"/>
+      </w:pPr>
       <w:r>
         <w:t xml:space="preserve">A sample of the executive views we build, in Arabic and English, drilling from the group total to each entity with every subtotal adding up on the way down.</w:t>
       </w:r>
@@ -3579,7 +3302,7 @@
         <w:keepNext/>
       </w:pPr>
       <w:r>
-        <w:t xml:space="preserve">S13  ·  Mid-page CTA 2</w:t>
+        <w:t xml:space="preserve">S13 · Mid-page CTA 2</w:t>
       </w:r>
     </w:p>
     <w:p>
@@ -3623,7 +3346,7 @@
         <w:keepNext/>
       </w:pPr>
       <w:r>
-        <w:t xml:space="preserve">S14  ·  FAQ (single accordion, first item open)  ·  #faq</w:t>
+        <w:t xml:space="preserve">S14 · FAQ (single accordion, first item open) · #faq</w:t>
       </w:r>
     </w:p>
     <w:p>
@@ -3640,11 +3363,9 @@
         <w:pStyle w:val="Heading2"/>
         <w:keepNext/>
       </w:pPr>
-      <w:bookmarkStart w:name="faq" w:id="10"/>
       <w:r>
         <w:t xml:space="preserve">Questions UAE Teams Ask Before Choosing a Power BI Partner</w:t>
       </w:r>
-      <w:bookmarkEnd w:id="10"/>
     </w:p>
     <w:p>
       <w:pPr>
@@ -3663,7 +3384,7 @@
         <w:rPr>
           <w:vertAlign w:val="superscript"/>
         </w:rPr>
-        <w:t xml:space="preserve">6</w:t>
+        <w:t xml:space="preserve">5</w:t>
       </w:r>
       <w:r>
         <w:t xml:space="preserve"> The Power BI service runs in the browser: access rules decide who sees each published report, data refreshes on its own schedule, and related reports are grouped into apps for each audience. Report authors mostly work in Desktop; everyone else uses the cloud. We set up both, with a workspace structure matched to how your organisation shares information.</w:t>
@@ -3686,21 +3407,21 @@
         <w:rPr>
           <w:vertAlign w:val="superscript"/>
         </w:rPr>
-        <w:t xml:space="preserve">8</w:t>
-      </w:r>
-      <w:r>
-        <w:t xml:space="preserve"> Large deployments and external embedding run on capacity-based licensing, priced separately. As a reselling partner, we advise on the right licence mix and supply it, and </w:t>
+        <w:t xml:space="preserve">7</w:t>
+      </w:r>
+      <w:r>
+        <w:t xml:space="preserve"> Large deployments and external embedding run on capacity-based licensing, priced separately. As a reselling partner, we advise on the right licence mix and supply it, and our </w:t>
       </w:r>
       <w:hyperlink w:history="1" w:anchor="packages">
         <w:r>
           <w:rPr>
             <w:rStyle w:val="Hyperlink"/>
           </w:rPr>
-          <w:t xml:space="preserve">PowerUP!</w:t>
+          <w:t xml:space="preserve">engagement models</w:t>
         </w:r>
       </w:hyperlink>
       <w:r>
-        <w:t xml:space="preserve"> gives you a fixed-price way to start.</w:t>
+        <w:t xml:space="preserve"> let you start small.</w:t>
       </w:r>
     </w:p>
     <w:p>
@@ -3730,7 +3451,7 @@
       <w:r>
         <w:t xml:space="preserve">Yes. It is often the first thing clients ask us to fix. Rather than a team member copying figures between workbooks every week, data refreshes on a schedule and dashboards stay current. Through </w:t>
       </w:r>
-      <w:hyperlink w:history="1" r:id="rId_l4xwkeitec4z_xowwbik">
+      <w:hyperlink w:history="1" r:id="rIdai3hkavvjtxofwc2eyu0t">
         <w:r>
           <w:rPr>
             <w:rStyle w:val="Hyperlink"/>
@@ -3773,7 +3494,7 @@
         <w:rPr>
           <w:vertAlign w:val="superscript"/>
         </w:rPr>
-        <w:t xml:space="preserve">9</w:t>
+        <w:t xml:space="preserve">8</w:t>
       </w:r>
       <w:r>
         <w:t xml:space="preserve"> Data can be kept in-country in the Dubai or Abu Dhabi cloud region</w:t>
@@ -3787,7 +3508,7 @@
       <w:r>
         <w:t xml:space="preserve">, and our </w:t>
       </w:r>
-      <w:hyperlink w:history="1" r:id="rId-jontt4mdxmr6pwb1ceyr">
+      <w:hyperlink w:history="1" r:id="rIds0_p6ksmho9mpu30qxakf">
         <w:r>
           <w:rPr>
             <w:rStyle w:val="Hyperlink"/>
@@ -3802,7 +3523,7 @@
         <w:rPr>
           <w:vertAlign w:val="superscript"/>
         </w:rPr>
-        <w:t xml:space="preserve">10</w:t>
+        <w:t xml:space="preserve">9</w:t>
       </w:r>
     </w:p>
     <w:p>
@@ -3836,7 +3557,7 @@
         <w:rPr>
           <w:vertAlign w:val="superscript"/>
         </w:rPr>
-        <w:t xml:space="preserve">10</w:t>
+        <w:t xml:space="preserve">9</w:t>
       </w:r>
     </w:p>
     <w:p>
@@ -3869,7 +3590,7 @@
     </w:p>
     <w:p>
       <w:pPr>
-        <w:pStyle w:val="Label"/>
+        <w:pStyle w:val="SubBlock"/>
         <w:keepNext/>
       </w:pPr>
       <w:r>
@@ -3879,26 +3600,28 @@
     <w:p>
       <w:pPr>
         <w:pStyle w:val="ListParagraph"/>
+        <w:keepNext/>
+        <w:keepLines/>
         <w:numPr>
           <w:ilvl w:val="0"/>
           <w:numId w:val="3"/>
         </w:numPr>
         <w:spacing w:after="40"/>
       </w:pPr>
-      <w:hyperlink w:history="1" r:id="rId2etf90vtdafp8natfrfvk">
+      <w:hyperlink w:history="1" r:id="rId2w4n4mns4xshnvsznnuhn">
         <w:r>
           <w:rPr>
             <w:rStyle w:val="Hyperlink"/>
-            <w:sz w:val="16"/>
-            <w:szCs w:val="16"/>
+            <w:sz w:val="17"/>
+            <w:szCs w:val="17"/>
           </w:rPr>
           <w:t xml:space="preserve">Microsoft Learn, cloud region availability for Power BI and Microsoft's data platform</w:t>
         </w:r>
       </w:hyperlink>
       <w:r>
         <w:rPr>
-          <w:sz w:val="16"/>
-          <w:szCs w:val="16"/>
+          <w:sz w:val="17"/>
+          <w:szCs w:val="17"/>
         </w:rPr>
         <w:t xml:space="preserve">.</w:t>
       </w:r>
@@ -3906,26 +3629,28 @@
     <w:p>
       <w:pPr>
         <w:pStyle w:val="ListParagraph"/>
+        <w:keepNext/>
+        <w:keepLines/>
         <w:numPr>
           <w:ilvl w:val="0"/>
           <w:numId w:val="3"/>
         </w:numPr>
         <w:spacing w:after="40"/>
       </w:pPr>
-      <w:hyperlink w:history="1" r:id="rIdyyqzkovphnjtbwbletwll">
+      <w:hyperlink w:history="1" r:id="rIdljadgckyvlhri_mi0bna6">
         <w:r>
           <w:rPr>
             <w:rStyle w:val="Hyperlink"/>
-            <w:sz w:val="16"/>
-            <w:szCs w:val="16"/>
+            <w:sz w:val="17"/>
+            <w:szCs w:val="17"/>
           </w:rPr>
           <w:t xml:space="preserve">Microsoft Learn, "Data sources in Power BI Desktop"</w:t>
         </w:r>
       </w:hyperlink>
       <w:r>
         <w:rPr>
-          <w:sz w:val="16"/>
-          <w:szCs w:val="16"/>
+          <w:sz w:val="17"/>
+          <w:szCs w:val="17"/>
         </w:rPr>
         <w:t xml:space="preserve">.</w:t>
       </w:r>
@@ -3933,191 +3658,229 @@
     <w:p>
       <w:pPr>
         <w:pStyle w:val="ListParagraph"/>
+        <w:keepNext/>
+        <w:keepLines/>
         <w:numPr>
           <w:ilvl w:val="0"/>
           <w:numId w:val="3"/>
         </w:numPr>
         <w:spacing w:after="40"/>
       </w:pPr>
-      <w:hyperlink w:history="1" r:id="rId6ahowivrjgr-qzgokzhvv">
+      <w:hyperlink w:history="1" r:id="rIdvu0pfwg0zfzefrtxijksm">
         <w:r>
           <w:rPr>
             <w:rStyle w:val="Hyperlink"/>
-            <w:sz w:val="16"/>
-            <w:szCs w:val="16"/>
+            <w:sz w:val="17"/>
+            <w:szCs w:val="17"/>
           </w:rPr>
-          <w:t xml:space="preserve">HLB HAMT, Data Visualization Services</w:t>
+          <w:t xml:space="preserve">HLB HAMT press release, "HLB HAMT Celebrates 25 Years of Unwavering Excellence"</w:t>
         </w:r>
       </w:hyperlink>
       <w:r>
         <w:rPr>
-          <w:sz w:val="16"/>
-          <w:szCs w:val="16"/>
-        </w:rPr>
-        <w:t xml:space="preserve"> ("In a recent engagement, we achieved a 33x improvement in report load times and interactivity").</w:t>
+          <w:sz w:val="17"/>
+          <w:szCs w:val="17"/>
+        </w:rPr>
+        <w:t xml:space="preserve">; also </w:t>
+      </w:r>
+      <w:hyperlink w:history="1" r:id="rId6m4ocnak4e9acqtuawcoi">
+        <w:r>
+          <w:rPr>
+            <w:rStyle w:val="Hyperlink"/>
+            <w:sz w:val="17"/>
+            <w:szCs w:val="17"/>
+          </w:rPr>
+          <w:t xml:space="preserve">HLB HAMT About Us anniversary page</w:t>
+        </w:r>
+      </w:hyperlink>
+      <w:r>
+        <w:rPr>
+          <w:sz w:val="17"/>
+          <w:szCs w:val="17"/>
+        </w:rPr>
+        <w:t xml:space="preserve"> (founded as HAMT &amp; Associates in 1999; joined HLB International in 2007).</w:t>
       </w:r>
     </w:p>
     <w:p>
       <w:pPr>
         <w:pStyle w:val="ListParagraph"/>
+        <w:keepNext/>
+        <w:keepLines/>
         <w:numPr>
           <w:ilvl w:val="0"/>
           <w:numId w:val="3"/>
         </w:numPr>
         <w:spacing w:after="40"/>
       </w:pPr>
-      <w:hyperlink w:history="1" r:id="rIdxs6cl86-t_af6yffc4m6f">
+      <w:hyperlink w:history="1" r:id="rIdr44sa3eoq6z7jt2t_q2gx">
         <w:r>
           <w:rPr>
             <w:rStyle w:val="Hyperlink"/>
-            <w:sz w:val="16"/>
-            <w:szCs w:val="16"/>
+            <w:sz w:val="17"/>
+            <w:szCs w:val="17"/>
           </w:rPr>
-          <w:t xml:space="preserve">HLB HAMT press release, "HLB HAMT Celebrates 25 Years of Unwavering Excellence"</w:t>
+          <w:t xml:space="preserve">Microsoft, "Microsoft named a Leader in the 2026 Gartner Magic Quadrant for Analytics and BI Platforms" (Power BI Updates Blog)</w:t>
         </w:r>
       </w:hyperlink>
       <w:r>
         <w:rPr>
-          <w:sz w:val="16"/>
-          <w:szCs w:val="16"/>
-        </w:rPr>
-        <w:t xml:space="preserve">; also </w:t>
-      </w:r>
-      <w:hyperlink w:history="1" r:id="rIdp6ynkhytdsndunsoeqwtn">
+          <w:sz w:val="17"/>
+          <w:szCs w:val="17"/>
+        </w:rPr>
+        <w:t xml:space="preserve">; </w:t>
+      </w:r>
+      <w:hyperlink w:history="1" r:id="rIdyq24rqxbf12ymv32ikkli">
         <w:r>
           <w:rPr>
             <w:rStyle w:val="Hyperlink"/>
-            <w:sz w:val="16"/>
-            <w:szCs w:val="16"/>
+            <w:sz w:val="17"/>
+            <w:szCs w:val="17"/>
           </w:rPr>
-          <w:t xml:space="preserve">HLB HAMT, 25 Years of Excellence</w:t>
+          <w:t xml:space="preserve">verbatim repost</w:t>
         </w:r>
       </w:hyperlink>
       <w:r>
         <w:rPr>
+          <w:sz w:val="17"/>
+          <w:szCs w:val="17"/>
+        </w:rPr>
+        <w:t xml:space="preserve">.</w:t>
+      </w:r>
+    </w:p>
+    <w:p>
+      <w:pPr>
+        <w:keepNext/>
+        <w:keepLines/>
+        <w:spacing w:after="60"/>
+        <w:ind w:left="540"/>
+      </w:pPr>
+      <w:r>
+        <w:rPr>
+          <w:i/>
+          <w:iCs/>
+          <w:color w:val="4B5563"/>
           <w:sz w:val="16"/>
           <w:szCs w:val="16"/>
         </w:rPr>
-        <w:t xml:space="preserve"> (founded as HAMT &amp; Associates in 1999; joined HLB International in 2007).</w:t>
+        <w:t xml:space="preserve">Gartner does not endorse any vendor, product or service depicted in its research publications. GARTNER and MAGIC QUADRANT are registered trademarks of Gartner, Inc. and/or its affiliates.</w:t>
       </w:r>
     </w:p>
     <w:p>
       <w:pPr>
         <w:pStyle w:val="ListParagraph"/>
+        <w:keepNext/>
+        <w:keepLines/>
         <w:numPr>
           <w:ilvl w:val="0"/>
           <w:numId w:val="3"/>
         </w:numPr>
         <w:spacing w:after="40"/>
       </w:pPr>
-      <w:hyperlink w:history="1" r:id="rId7l6tipmtruiuvkim3pjsf">
+      <w:hyperlink w:history="1" r:id="rIdrhydknb0nbmkytfspcl5e">
         <w:r>
           <w:rPr>
             <w:rStyle w:val="Hyperlink"/>
-            <w:sz w:val="16"/>
-            <w:szCs w:val="16"/>
+            <w:sz w:val="17"/>
+            <w:szCs w:val="17"/>
           </w:rPr>
-          <w:t xml:space="preserve">Microsoft, "Microsoft named a Leader in the 2026 Gartner Magic Quadrant for Analytics and BI Platforms" (Power BI Updates Blog)</w:t>
+          <w:t xml:space="preserve">Microsoft Learn, Power BI service vs Power BI Desktop</w:t>
         </w:r>
       </w:hyperlink>
       <w:r>
         <w:rPr>
-          <w:sz w:val="16"/>
-          <w:szCs w:val="16"/>
-        </w:rPr>
-        <w:t xml:space="preserve">; </w:t>
-      </w:r>
-      <w:hyperlink w:history="1" r:id="rIdbt6ptvwuncp9fhtd3blkk">
-        <w:r>
-          <w:rPr>
-            <w:rStyle w:val="Hyperlink"/>
-            <w:sz w:val="16"/>
-            <w:szCs w:val="16"/>
-          </w:rPr>
-          <w:t xml:space="preserve">verbatim repost</w:t>
-        </w:r>
-      </w:hyperlink>
-      <w:r>
-        <w:rPr>
-          <w:sz w:val="16"/>
-          <w:szCs w:val="16"/>
+          <w:sz w:val="17"/>
+          <w:szCs w:val="17"/>
         </w:rPr>
         <w:t xml:space="preserve">.</w:t>
       </w:r>
     </w:p>
     <w:p>
       <w:pPr>
-        <w:spacing w:after="40"/>
-        <w:ind w:left="360"/>
-      </w:pPr>
-      <w:r>
-        <w:rPr>
-          <w:i/>
-          <w:iCs/>
-          <w:color w:val="4B5563"/>
-          <w:sz w:val="16"/>
-          <w:szCs w:val="16"/>
-        </w:rPr>
-        <w:t xml:space="preserve">Gartner does not endorse any vendor, product or service depicted in its research publications. GARTNER and MAGIC QUADRANT are registered trademarks of Gartner, Inc. and/or its affiliates.</w:t>
-      </w:r>
-    </w:p>
-    <w:p>
-      <w:pPr>
         <w:pStyle w:val="ListParagraph"/>
+        <w:keepNext/>
+        <w:keepLines/>
         <w:numPr>
           <w:ilvl w:val="0"/>
           <w:numId w:val="3"/>
         </w:numPr>
         <w:spacing w:after="40"/>
       </w:pPr>
-      <w:hyperlink w:history="1" r:id="rIdyjhdqlszsm5i5ttsenqqb">
+      <w:hyperlink w:history="1" r:id="rIdmnrctkxqugs46rblqmo-g">
         <w:r>
           <w:rPr>
             <w:rStyle w:val="Hyperlink"/>
-            <w:sz w:val="16"/>
-            <w:szCs w:val="16"/>
+            <w:sz w:val="17"/>
+            <w:szCs w:val="17"/>
           </w:rPr>
-          <w:t xml:space="preserve">Microsoft Learn, Power BI service vs Power BI Desktop</w:t>
+          <w:t xml:space="preserve">HLB HAMT service commitment</w:t>
         </w:r>
       </w:hyperlink>
       <w:r>
         <w:rPr>
-          <w:sz w:val="16"/>
-          <w:szCs w:val="16"/>
-        </w:rPr>
-        <w:t xml:space="preserve">.</w:t>
+          <w:sz w:val="17"/>
+          <w:szCs w:val="17"/>
+        </w:rPr>
+        <w:t xml:space="preserve"> ("a Power BI proof of concept can be delivered in as little as 7 days for defined use cases").</w:t>
       </w:r>
     </w:p>
     <w:p>
       <w:pPr>
         <w:pStyle w:val="ListParagraph"/>
+        <w:keepNext/>
+        <w:keepLines/>
         <w:numPr>
           <w:ilvl w:val="0"/>
           <w:numId w:val="3"/>
         </w:numPr>
         <w:spacing w:after="40"/>
       </w:pPr>
-      <w:hyperlink w:history="1" r:id="rIdfusryf4jz8enyoruddpzu">
+      <w:r>
+        <w:rPr>
+          <w:sz w:val="17"/>
+          <w:szCs w:val="17"/>
+        </w:rPr>
+        <w:t xml:space="preserve">Microsoft Power BI </w:t>
+      </w:r>
+      <w:hyperlink w:history="1" r:id="rIdpow21vbt4jryrzzj66w0g">
         <w:r>
           <w:rPr>
             <w:rStyle w:val="Hyperlink"/>
-            <w:sz w:val="16"/>
-            <w:szCs w:val="16"/>
+            <w:sz w:val="17"/>
+            <w:szCs w:val="17"/>
           </w:rPr>
-          <w:t xml:space="preserve">HLB HAMT service commitment</w:t>
+          <w:t xml:space="preserve">pricing update</w:t>
         </w:r>
       </w:hyperlink>
       <w:r>
         <w:rPr>
-          <w:sz w:val="16"/>
-          <w:szCs w:val="16"/>
-        </w:rPr>
-        <w:t xml:space="preserve"> ("a Power BI proof of concept can be delivered in as little as 7 days for defined use cases").</w:t>
+          <w:sz w:val="17"/>
+          <w:szCs w:val="17"/>
+        </w:rPr>
+        <w:t xml:space="preserve"> and </w:t>
+      </w:r>
+      <w:hyperlink w:history="1" r:id="rIdv6of5ap-gmw3xw1hs5ftb">
+        <w:r>
+          <w:rPr>
+            <w:rStyle w:val="Hyperlink"/>
+            <w:sz w:val="17"/>
+            <w:szCs w:val="17"/>
+          </w:rPr>
+          <w:t xml:space="preserve">pricing page</w:t>
+        </w:r>
+      </w:hyperlink>
+      <w:r>
+        <w:rPr>
+          <w:sz w:val="17"/>
+          <w:szCs w:val="17"/>
+        </w:rPr>
+        <w:t xml:space="preserve">.</w:t>
       </w:r>
     </w:p>
     <w:p>
       <w:pPr>
         <w:pStyle w:val="ListParagraph"/>
+        <w:keepNext/>
+        <w:keepLines/>
         <w:numPr>
           <w:ilvl w:val="0"/>
           <w:numId w:val="3"/>
@@ -4126,120 +3889,71 @@
       </w:pPr>
       <w:r>
         <w:rPr>
-          <w:sz w:val="16"/>
-          <w:szCs w:val="16"/>
-        </w:rPr>
-        <w:t xml:space="preserve">Microsoft Power BI </w:t>
-      </w:r>
-      <w:hyperlink w:history="1" r:id="rIdzz9xyher06zivko1vvrkn">
+          <w:sz w:val="17"/>
+          <w:szCs w:val="17"/>
+        </w:rPr>
+        <w:t xml:space="preserve">Microsoft Learn, </w:t>
+      </w:r>
+      <w:hyperlink w:history="1" r:id="rIdzpqudn4tcviitp4ex6n4i">
         <w:r>
           <w:rPr>
             <w:rStyle w:val="Hyperlink"/>
-            <w:sz w:val="16"/>
-            <w:szCs w:val="16"/>
+            <w:sz w:val="17"/>
+            <w:szCs w:val="17"/>
           </w:rPr>
-          <w:t xml:space="preserve">pricing update</w:t>
+          <w:t xml:space="preserve">ISO/IEC 27001</w:t>
         </w:r>
       </w:hyperlink>
       <w:r>
         <w:rPr>
-          <w:sz w:val="16"/>
-          <w:szCs w:val="16"/>
+          <w:sz w:val="17"/>
+          <w:szCs w:val="17"/>
         </w:rPr>
         <w:t xml:space="preserve"> and </w:t>
       </w:r>
-      <w:hyperlink w:history="1" r:id="rIdeenjkcndvhdv2owmrdt_y">
+      <w:hyperlink w:history="1" r:id="rId1jcepubluo_7i_shktgjd">
         <w:r>
           <w:rPr>
             <w:rStyle w:val="Hyperlink"/>
-            <w:sz w:val="16"/>
-            <w:szCs w:val="16"/>
+            <w:sz w:val="17"/>
+            <w:szCs w:val="17"/>
           </w:rPr>
-          <w:t xml:space="preserve">pricing page</w:t>
+          <w:t xml:space="preserve">SOC 2</w:t>
         </w:r>
       </w:hyperlink>
       <w:r>
         <w:rPr>
-          <w:sz w:val="16"/>
-          <w:szCs w:val="16"/>
-        </w:rPr>
-        <w:t xml:space="preserve">.</w:t>
+          <w:sz w:val="17"/>
+          <w:szCs w:val="17"/>
+        </w:rPr>
+        <w:t xml:space="preserve"> offerings.</w:t>
       </w:r>
     </w:p>
     <w:p>
       <w:pPr>
         <w:pStyle w:val="ListParagraph"/>
+        <w:keepNext w:val="false"/>
+        <w:keepLines/>
         <w:numPr>
           <w:ilvl w:val="0"/>
           <w:numId w:val="3"/>
         </w:numPr>
         <w:spacing w:after="40"/>
       </w:pPr>
-      <w:r>
-        <w:rPr>
-          <w:sz w:val="16"/>
-          <w:szCs w:val="16"/>
-        </w:rPr>
-        <w:t xml:space="preserve">Microsoft Learn, </w:t>
-      </w:r>
-      <w:hyperlink w:history="1" r:id="rIdfeydrc8alv5mbmcovlfhg">
+      <w:hyperlink w:history="1" r:id="rIdzkurzl9mqadqh-ghdc2vg">
         <w:r>
           <w:rPr>
             <w:rStyle w:val="Hyperlink"/>
-            <w:sz w:val="16"/>
-            <w:szCs w:val="16"/>
-          </w:rPr>
-          <w:t xml:space="preserve">ISO/IEC 27001</w:t>
-        </w:r>
-      </w:hyperlink>
-      <w:r>
-        <w:rPr>
-          <w:sz w:val="16"/>
-          <w:szCs w:val="16"/>
-        </w:rPr>
-        <w:t xml:space="preserve"> and </w:t>
-      </w:r>
-      <w:hyperlink w:history="1" r:id="rIdtwu4biemmx2chzl5-lqac">
-        <w:r>
-          <w:rPr>
-            <w:rStyle w:val="Hyperlink"/>
-            <w:sz w:val="16"/>
-            <w:szCs w:val="16"/>
-          </w:rPr>
-          <w:t xml:space="preserve">SOC 2</w:t>
-        </w:r>
-      </w:hyperlink>
-      <w:r>
-        <w:rPr>
-          <w:sz w:val="16"/>
-          <w:szCs w:val="16"/>
-        </w:rPr>
-        <w:t xml:space="preserve"> offerings.</w:t>
-      </w:r>
-    </w:p>
-    <w:p>
-      <w:pPr>
-        <w:pStyle w:val="ListParagraph"/>
-        <w:numPr>
-          <w:ilvl w:val="0"/>
-          <w:numId w:val="3"/>
-        </w:numPr>
-        <w:spacing w:after="40"/>
-      </w:pPr>
-      <w:hyperlink w:history="1" r:id="rIdtdxpeocbl2bpsdho4ti5l">
-        <w:r>
-          <w:rPr>
-            <w:rStyle w:val="Hyperlink"/>
-            <w:sz w:val="16"/>
-            <w:szCs w:val="16"/>
+            <w:sz w:val="17"/>
+            <w:szCs w:val="17"/>
           </w:rPr>
           <w:t xml:space="preserve">Microsoft Learn, overview of the generative AI assistant in Power BI</w:t>
         </w:r>
       </w:hyperlink>
       <w:r>
         <w:rPr>
-          <w:sz w:val="16"/>
-          <w:szCs w:val="16"/>
+          <w:sz w:val="17"/>
+          <w:szCs w:val="17"/>
         </w:rPr>
         <w:t xml:space="preserve">.</w:t>
       </w:r>
@@ -4250,7 +3964,7 @@
         <w:keepNext/>
       </w:pPr>
       <w:r>
-        <w:t xml:space="preserve">S15  ·  Final contact CTA and form  ·  #contact</w:t>
+        <w:t xml:space="preserve">S15 · Final contact CTA and form · #contact</w:t>
       </w:r>
     </w:p>
     <w:p>
@@ -4258,11 +3972,9 @@
         <w:pStyle w:val="Heading2"/>
         <w:keepNext/>
       </w:pPr>
-      <w:bookmarkStart w:name="contact" w:id="11"/>
       <w:r>
         <w:t xml:space="preserve">Book Your Free Consultation</w:t>
       </w:r>
-      <w:bookmarkEnd w:id="11"/>
     </w:p>
     <w:p>
       <w:r>
@@ -4271,8 +3983,7 @@
     </w:p>
     <w:p>
       <w:pPr>
-        <w:pStyle w:val="Label"/>
-        <w:keepNext/>
+        <w:pStyle w:val="Note"/>
       </w:pPr>
       <w:r>
         <w:t xml:space="preserve">Form: site-standard "Let's Connect" component (field labels not counted)</w:t>
@@ -4283,7 +3994,7 @@
         <w:pStyle w:val="Note"/>
       </w:pPr>
       <w:r>
-        <w:t xml:space="preserve">Fields: Your name  ·  Email address  ·  Phone number  ·  Location  ·  Select your Services  ·  Your message</w:t>
+        <w:t xml:space="preserve">Fields: Your name · Email address · Phone number · Location · Select your Services · Your message</w:t>
       </w:r>
     </w:p>
     <w:p>
@@ -4321,7 +4032,7 @@
         <w:keepNext/>
       </w:pPr>
       <w:r>
-        <w:t xml:space="preserve">S16  ·  Footer</w:t>
+        <w:t xml:space="preserve">S16 · Footer</w:t>
       </w:r>
     </w:p>
     <w:p>
@@ -4333,8 +4044,8 @@
       </w:r>
     </w:p>
     <w:sectPr>
-      <w:headerReference w:type="default" r:id="rId7"/>
-      <w:footerReference w:type="default" r:id="rId8"/>
+      <w:headerReference w:type="default" r:id="rId6"/>
+      <w:footerReference w:type="default" r:id="rId7"/>
       <w:pgSz w:w="11906" w:h="16838" w:orient="portrait"/>
       <w:pgMar w:top="1440" w:right="1440" w:bottom="1300" w:left="1440" w:header="708" w:footer="708" w:gutter="0"/>
       <w:pgNumType/>
@@ -4342,10 +4053,6 @@
     </w:sectPr>
   </w:body>
 </w:document>
-</file>
-
-<file path=word/comments.xml><?xml version="1.0" encoding="utf-8"?>
-<w:comments xmlns:cx="http://schemas.microsoft.com/office/drawing/2014/chartex" xmlns:cx1="http://schemas.microsoft.com/office/drawing/2015/9/8/chartex" xmlns:cx2="http://schemas.microsoft.com/office/drawing/2015/10/21/chartex" xmlns:cx3="http://schemas.microsoft.com/office/drawing/2016/5/9/chartex" xmlns:cx4="http://schemas.microsoft.com/office/drawing/2016/5/10/chartex" xmlns:cx5="http://schemas.microsoft.com/office/drawing/2016/5/11/chartex" xmlns:cx6="http://schemas.microsoft.com/office/drawing/2016/5/12/chartex" xmlns:cx7="http://schemas.microsoft.com/office/drawing/2016/5/13/chartex" xmlns:cx8="http://schemas.microsoft.com/office/drawing/2016/5/14/chartex" xmlns:mc="http://schemas.openxmlformats.org/markup-compatibility/2006" xmlns:aink="http://schemas.microsoft.com/office/drawing/2016/ink" xmlns:am3d="http://schemas.microsoft.com/office/drawing/2017/model3d" xmlns:o="urn:schemas-microsoft-com:office:office" xmlns:r="http://schemas.openxmlformats.org/officeDocument/2006/relationships" xmlns:m="http://schemas.openxmlformats.org/officeDocument/2006/math" xmlns:v="urn:schemas-microsoft-com:vml" xmlns:wp14="http://schemas.microsoft.com/office/word/2010/wordprocessingDrawing" xmlns:wp="http://schemas.openxmlformats.org/drawingml/2006/wordprocessingDrawing" xmlns:w10="urn:schemas-microsoft-com:office:word" xmlns:w="http://schemas.openxmlformats.org/wordprocessingml/2006/main" xmlns:w14="http://schemas.microsoft.com/office/word/2010/wordml" xmlns:w15="http://schemas.microsoft.com/office/word/2012/wordml" xmlns:w16cex="http://schemas.microsoft.com/office/word/2018/wordml/cex" xmlns:w16cid="http://schemas.microsoft.com/office/word/2016/wordml/cid" xmlns:w16="http://schemas.microsoft.com/office/word/2018/wordml" xmlns:w16sdtdh="http://schemas.microsoft.com/office/word/2020/wordml/sdtdatahash" xmlns:w16se="http://schemas.microsoft.com/office/word/2015/wordml/symex" xmlns:wpg="http://schemas.microsoft.com/office/word/2010/wordprocessingGroup" xmlns:wpi="http://schemas.microsoft.com/office/word/2010/wordprocessingInk" xmlns:wne="http://schemas.microsoft.com/office/word/2006/wordml" xmlns:wps="http://schemas.microsoft.com/office/word/2010/wordprocessingShape"/>
 </file>
 
 <file path=word/endnotes.xml><?xml version="1.0" encoding="utf-8"?>
@@ -4401,9 +4108,8 @@
     </w:r>
     <w:r>
       <w:rPr>
-        <w:color w:val="4B5563"/>
-        <w:sz w:val="16"/>
-        <w:szCs w:val="16"/>
+        <w:sz w:val="18"/>
+        <w:szCs w:val="18"/>
       </w:rPr>
       <w:fldChar w:fldCharType="begin"/>
       <w:instrText xml:space="preserve">PAGE</w:instrText>
@@ -4420,9 +4126,8 @@
     </w:r>
     <w:r>
       <w:rPr>
-        <w:color w:val="4B5563"/>
-        <w:sz w:val="16"/>
-        <w:szCs w:val="16"/>
+        <w:sz w:val="18"/>
+        <w:szCs w:val="18"/>
       </w:rPr>
       <w:fldChar w:fldCharType="begin"/>
       <w:instrText xml:space="preserve">NUMPAGES</w:instrText>
@@ -4492,7 +4197,7 @@
 <w:numbering xmlns:wpc="http://schemas.microsoft.com/office/word/2010/wordprocessingCanvas" xmlns:mc="http://schemas.openxmlformats.org/markup-compatibility/2006" xmlns:o="urn:schemas-microsoft-com:office:office" xmlns:r="http://schemas.openxmlformats.org/officeDocument/2006/relationships" xmlns:m="http://schemas.openxmlformats.org/officeDocument/2006/math" xmlns:v="urn:schemas-microsoft-com:vml" xmlns:wp14="http://schemas.microsoft.com/office/word/2010/wordprocessingDrawing" xmlns:wp="http://schemas.openxmlformats.org/drawingml/2006/wordprocessingDrawing" xmlns:w10="urn:schemas-microsoft-com:office:word" xmlns:w="http://schemas.openxmlformats.org/wordprocessingml/2006/main" xmlns:w14="http://schemas.microsoft.com/office/word/2010/wordml" xmlns:w15="http://schemas.microsoft.com/office/word/2012/wordml" xmlns:wpg="http://schemas.microsoft.com/office/word/2010/wordprocessingGroup" xmlns:wpi="http://schemas.microsoft.com/office/word/2010/wordprocessingInk" xmlns:wne="http://schemas.microsoft.com/office/word/2006/wordml" xmlns:wps="http://schemas.microsoft.com/office/word/2010/wordprocessingShape" mc:Ignorable="w14 w15 wp14">
   <w:abstractNum w:abstractNumId="1" w15:restartNumberingAfterBreak="0">
     <w:multiLevelType w:val="hybridMultilevel"/>
-    <w:lvl w:ilvl="0" w15:tentative="1">
+    <w:lvl w:ilvl="0" w:tentative="1">
       <w:start w:val="1"/>
       <w:numFmt w:val="bullet"/>
       <w:lvlText w:val="●"/>
@@ -4501,7 +4206,7 @@
         <w:ind w:left="720" w:hanging="360"/>
       </w:pPr>
     </w:lvl>
-    <w:lvl w:ilvl="1" w15:tentative="1">
+    <w:lvl w:ilvl="1" w:tentative="1">
       <w:start w:val="1"/>
       <w:numFmt w:val="bullet"/>
       <w:lvlText w:val="○"/>
@@ -4510,7 +4215,7 @@
         <w:ind w:left="1440" w:hanging="360"/>
       </w:pPr>
     </w:lvl>
-    <w:lvl w:ilvl="2" w15:tentative="1">
+    <w:lvl w:ilvl="2" w:tentative="1">
       <w:start w:val="1"/>
       <w:numFmt w:val="bullet"/>
       <w:lvlText w:val="■"/>
@@ -4519,7 +4224,7 @@
         <w:ind w:left="2160" w:hanging="360"/>
       </w:pPr>
     </w:lvl>
-    <w:lvl w:ilvl="3" w15:tentative="1">
+    <w:lvl w:ilvl="3" w:tentative="1">
       <w:start w:val="1"/>
       <w:numFmt w:val="bullet"/>
       <w:lvlText w:val="●"/>
@@ -4528,7 +4233,7 @@
         <w:ind w:left="2880" w:hanging="360"/>
       </w:pPr>
     </w:lvl>
-    <w:lvl w:ilvl="4" w15:tentative="1">
+    <w:lvl w:ilvl="4" w:tentative="1">
       <w:start w:val="1"/>
       <w:numFmt w:val="bullet"/>
       <w:lvlText w:val="○"/>
@@ -4537,7 +4242,7 @@
         <w:ind w:left="3600" w:hanging="360"/>
       </w:pPr>
     </w:lvl>
-    <w:lvl w:ilvl="5" w15:tentative="1">
+    <w:lvl w:ilvl="5" w:tentative="1">
       <w:start w:val="1"/>
       <w:numFmt w:val="bullet"/>
       <w:lvlText w:val="■"/>
@@ -4546,7 +4251,7 @@
         <w:ind w:left="4320" w:hanging="360"/>
       </w:pPr>
     </w:lvl>
-    <w:lvl w:ilvl="6" w15:tentative="1">
+    <w:lvl w:ilvl="6" w:tentative="1">
       <w:start w:val="1"/>
       <w:numFmt w:val="bullet"/>
       <w:lvlText w:val="●"/>
@@ -4555,7 +4260,7 @@
         <w:ind w:left="5040" w:hanging="360"/>
       </w:pPr>
     </w:lvl>
-    <w:lvl w:ilvl="7" w15:tentative="1">
+    <w:lvl w:ilvl="7" w:tentative="1">
       <w:start w:val="1"/>
       <w:numFmt w:val="bullet"/>
       <w:lvlText w:val="●"/>
@@ -4564,7 +4269,7 @@
         <w:ind w:left="5760" w:hanging="360"/>
       </w:pPr>
     </w:lvl>
-    <w:lvl w:ilvl="8" w15:tentative="1">
+    <w:lvl w:ilvl="8" w:tentative="1">
       <w:start w:val="1"/>
       <w:numFmt w:val="bullet"/>
       <w:lvlText w:val="●"/>
@@ -4576,30 +4281,35 @@
   </w:abstractNum>
   <w:abstractNum w:abstractNumId="2" w15:restartNumberingAfterBreak="0">
     <w:multiLevelType w:val="hybridMultilevel"/>
-    <w:lvl w:ilvl="0" w15:tentative="1">
+    <w:lvl w:ilvl="0" w:tentative="1">
       <w:start w:val="1"/>
       <w:numFmt w:val="bullet"/>
-      <w:lvlText w:val="•"/>
+      <w:lvlText w:val="●"/>
       <w:lvlJc w:val="left"/>
       <w:pPr>
-        <w:ind w:left="540" w:hanging="270"/>
+        <w:ind w:left="720" w:hanging="360"/>
+      </w:pPr>
+    </w:lvl>
+    <w:lvl w:ilvl="1" w:tentative="1">
+      <w:start w:val="1"/>
+      <w:numFmt w:val="bullet"/>
+      <w:lvlText w:val="○"/>
+      <w:lvlJc w:val="left"/>
+      <w:pPr>
+        <w:ind w:left="1440" w:hanging="360"/>
       </w:pPr>
     </w:lvl>
   </w:abstractNum>
   <w:abstractNum w:abstractNumId="3" w15:restartNumberingAfterBreak="0">
     <w:multiLevelType w:val="hybridMultilevel"/>
-    <w:lvl w:ilvl="0" w15:tentative="1">
+    <w:lvl w:ilvl="0" w:tentative="1">
       <w:start w:val="1"/>
       <w:numFmt w:val="decimal"/>
       <w:lvlText w:val="%1."/>
       <w:lvlJc w:val="left"/>
       <w:pPr>
-        <w:ind w:left="360" w:hanging="360"/>
-      </w:pPr>
-      <w:rPr>
-        <w:sz w:val="16"/>
-        <w:szCs w:val="16"/>
-      </w:rPr>
+        <w:ind w:left="540" w:hanging="360"/>
+      </w:pPr>
     </w:lvl>
   </w:abstractNum>
   <w:num w:numId="1">
@@ -4640,48 +4350,9 @@
       </w:pPr>
     </w:pPrDefault>
   </w:docDefaults>
-  <w:style w:type="paragraph" w:styleId="Title">
-    <w:name w:val="Title"/>
-    <w:basedOn w:val="Normal"/>
-    <w:next w:val="Normal"/>
+  <w:style w:type="paragraph" w:styleId="Normal" w:default="1">
+    <w:name w:val="Normal"/>
     <w:qFormat/>
-    <w:rPr>
-      <w:sz w:val="56"/>
-      <w:szCs w:val="56"/>
-    </w:rPr>
-  </w:style>
-  <w:style w:type="paragraph" w:styleId="Heading1">
-    <w:name w:val="Heading 1"/>
-    <w:basedOn w:val="Normal"/>
-    <w:next w:val="Normal"/>
-    <w:qFormat/>
-    <w:rPr>
-      <w:color w:val="2E74B5"/>
-      <w:sz w:val="32"/>
-      <w:szCs w:val="32"/>
-    </w:rPr>
-  </w:style>
-  <w:style w:type="paragraph" w:styleId="Heading2">
-    <w:name w:val="Heading 2"/>
-    <w:basedOn w:val="Normal"/>
-    <w:next w:val="Normal"/>
-    <w:qFormat/>
-    <w:rPr>
-      <w:color w:val="2E74B5"/>
-      <w:sz w:val="26"/>
-      <w:szCs w:val="26"/>
-    </w:rPr>
-  </w:style>
-  <w:style w:type="paragraph" w:styleId="Heading3">
-    <w:name w:val="Heading 3"/>
-    <w:basedOn w:val="Normal"/>
-    <w:next w:val="Normal"/>
-    <w:qFormat/>
-    <w:rPr>
-      <w:color w:val="1F4D78"/>
-      <w:sz w:val="24"/>
-      <w:szCs w:val="24"/>
-    </w:rPr>
   </w:style>
   <w:style w:type="paragraph" w:styleId="Heading4">
     <w:name w:val="Heading 4"/>
@@ -4726,16 +4397,6 @@
     <w:name w:val="List Paragraph"/>
     <w:basedOn w:val="Normal"/>
     <w:qFormat/>
-  </w:style>
-  <w:style w:type="character" w:styleId="Hyperlink">
-    <w:name w:val="Hyperlink"/>
-    <w:basedOn w:val="DefaultParagraphFont"/>
-    <w:uiPriority w:val="99"/>
-    <w:unhideWhenUsed/>
-    <w:rPr>
-      <w:color w:val="0563C1"/>
-      <w:u w:val="single"/>
-    </w:rPr>
   </w:style>
   <w:style w:type="character" w:styleId="FootnoteReference">
     <w:name w:val="footnote reference"/>
@@ -4898,6 +4559,7 @@
   <w:style w:type="paragraph" w:styleId="Eyebrow">
     <w:name w:val="Eyebrow"/>
     <w:basedOn w:val="Normal"/>
+    <w:next w:val="Normal"/>
     <w:pPr>
       <w:spacing w:after="40" w:before="80"/>
     </w:pPr>
@@ -4914,6 +4576,7 @@
   <w:style w:type="paragraph" w:styleId="Lede">
     <w:name w:val="Lede"/>
     <w:basedOn w:val="Normal"/>
+    <w:next w:val="Normal"/>
     <w:pPr>
       <w:spacing w:after="160"/>
     </w:pPr>
@@ -4926,6 +4589,7 @@
   <w:style w:type="paragraph" w:styleId="Label">
     <w:name w:val="Label"/>
     <w:basedOn w:val="Normal"/>
+    <w:next w:val="Normal"/>
     <w:pPr>
       <w:spacing w:after="40" w:before="160"/>
     </w:pPr>
@@ -4940,8 +4604,9 @@
     </w:rPr>
   </w:style>
   <w:style w:type="paragraph" w:styleId="Number">
-    <w:name w:val="Item Number"/>
+    <w:name w:val="Number"/>
     <w:basedOn w:val="Normal"/>
+    <w:next w:val="Normal"/>
     <w:pPr>
       <w:spacing w:after="0" w:before="200"/>
     </w:pPr>
@@ -4954,8 +4619,9 @@
     </w:rPr>
   </w:style>
   <w:style w:type="paragraph" w:styleId="SubBlock">
-    <w:name w:val="Sub-block Line"/>
+    <w:name w:val="Sub Block"/>
     <w:basedOn w:val="Normal"/>
+    <w:next w:val="Normal"/>
     <w:pPr>
       <w:spacing w:after="60" w:before="240"/>
     </w:pPr>
@@ -4967,23 +4633,10 @@
       <w:szCs w:val="26"/>
     </w:rPr>
   </w:style>
-  <w:style w:type="paragraph" w:styleId="Price">
-    <w:name w:val="Price Line"/>
+  <w:style w:type="paragraph" w:styleId="Button">
+    <w:name w:val="Button"/>
     <w:basedOn w:val="Normal"/>
-    <w:pPr>
-      <w:spacing w:after="100" w:before="60"/>
-    </w:pPr>
-    <w:rPr>
-      <w:b/>
-      <w:bCs/>
-      <w:color w:val="005A77"/>
-      <w:sz w:val="28"/>
-      <w:szCs w:val="28"/>
-    </w:rPr>
-  </w:style>
-  <w:style w:type="paragraph" w:styleId="Button">
-    <w:name w:val="Button Note"/>
-    <w:basedOn w:val="Normal"/>
+    <w:next w:val="Normal"/>
     <w:pPr>
       <w:spacing w:after="140" w:before="40"/>
     </w:pPr>
@@ -4994,8 +4647,9 @@
     </w:rPr>
   </w:style>
   <w:style w:type="paragraph" w:styleId="Note">
-    <w:name w:val="Production Note"/>
+    <w:name w:val="Note"/>
     <w:basedOn w:val="Normal"/>
+    <w:next w:val="Normal"/>
     <w:rPr>
       <w:color w:val="4B5563"/>
       <w:sz w:val="18"/>
@@ -5003,8 +4657,9 @@
     </w:rPr>
   </w:style>
   <w:style w:type="paragraph" w:styleId="Small">
-    <w:name w:val="Small Print"/>
+    <w:name w:val="Small"/>
     <w:basedOn w:val="Normal"/>
+    <w:next w:val="Normal"/>
     <w:pPr>
       <w:spacing w:before="160"/>
     </w:pPr>
@@ -5017,6 +4672,7 @@
   <w:style w:type="paragraph" w:styleId="Marker">
     <w:name w:val="Section Marker"/>
     <w:basedOn w:val="Normal"/>
+    <w:next w:val="Normal"/>
     <w:pPr>
       <w:pBdr>
         <w:left w:val="single" w:color="005A77" w:sz="18" w:space="4"/>
@@ -5035,8 +4691,9 @@
     </w:rPr>
   </w:style>
   <w:style w:type="paragraph" w:styleId="Placeholder">
-    <w:name w:val="Asset Placeholder"/>
+    <w:name w:val="Placeholder"/>
     <w:basedOn w:val="Normal"/>
+    <w:next w:val="Normal"/>
     <w:pPr>
       <w:pBdr>
         <w:top w:val="dashed" w:color="C89400" w:sz="6" w:space="6"/>
@@ -5054,5 +4711,304 @@
       <w:szCs w:val="18"/>
     </w:rPr>
   </w:style>
+  <w:style w:type="character" w:styleId="Hyperlink">
+    <w:name w:val="Hyperlink"/>
+    <w:uiPriority w:val="99"/>
+    <w:unhideWhenUsed/>
+    <w:rPr>
+      <w:color w:val="0563C1"/>
+      <w:u w:val="single"/>
+    </w:rPr>
+  </w:style>
 </w:styles>
+</file>
+
+<file path=word/theme/theme1.xml><?xml version="1.0" encoding="utf-8"?>
+<a:theme xmlns:a="http://schemas.openxmlformats.org/drawingml/2006/main" name="Office Theme">
+  <a:themeElements>
+    <a:clrScheme name="Office">
+      <a:dk1>
+        <a:sysClr val="windowText" lastClr="000000"/>
+      </a:dk1>
+      <a:lt1>
+        <a:sysClr val="window" lastClr="FFFFFF"/>
+      </a:lt1>
+      <a:dk2>
+        <a:srgbClr val="44546A"/>
+      </a:dk2>
+      <a:lt2>
+        <a:srgbClr val="E7E6E6"/>
+      </a:lt2>
+      <a:accent1>
+        <a:srgbClr val="4472C4"/>
+      </a:accent1>
+      <a:accent2>
+        <a:srgbClr val="ED7D31"/>
+      </a:accent2>
+      <a:accent3>
+        <a:srgbClr val="A5A5A5"/>
+      </a:accent3>
+      <a:accent4>
+        <a:srgbClr val="FFC000"/>
+      </a:accent4>
+      <a:accent5>
+        <a:srgbClr val="5B9BD5"/>
+      </a:accent5>
+      <a:accent6>
+        <a:srgbClr val="70AD47"/>
+      </a:accent6>
+      <a:hlink>
+        <a:srgbClr val="0563C1"/>
+      </a:hlink>
+      <a:folHlink>
+        <a:srgbClr val="954F72"/>
+      </a:folHlink>
+    </a:clrScheme>
+    <a:fontScheme name="Office">
+      <a:majorFont>
+        <a:latin typeface="Calibri Light" panose="020F0302020204030204"/>
+        <a:ea typeface=""/>
+        <a:cs typeface=""/>
+        <a:font script="Jpan" typeface="游ゴシック Light"/>
+        <a:font script="Hang" typeface="맑은 고딕"/>
+        <a:font script="Hans" typeface="等线 Light"/>
+        <a:font script="Hant" typeface="新細明體"/>
+        <a:font script="Arab" typeface="Times New Roman"/>
+        <a:font script="Hebr" typeface="Times New Roman"/>
+        <a:font script="Thai" typeface="Angsana New"/>
+        <a:font script="Ethi" typeface="Nyala"/>
+        <a:font script="Beng" typeface="Vrinda"/>
+        <a:font script="Gujr" typeface="Shruti"/>
+        <a:font script="Khmr" typeface="MoolBoran"/>
+        <a:font script="Knda" typeface="Tunga"/>
+        <a:font script="Guru" typeface="Raavi"/>
+        <a:font script="Cans" typeface="Euphemia"/>
+        <a:font script="Cher" typeface="Plantagenet Cherokee"/>
+        <a:font script="Yiii" typeface="Microsoft Yi Baiti"/>
+        <a:font script="Tibt" typeface="Microsoft Himalaya"/>
+        <a:font script="Thaa" typeface="MV Boli"/>
+        <a:font script="Deva" typeface="Mangal"/>
+        <a:font script="Telu" typeface="Gautami"/>
+        <a:font script="Taml" typeface="Latha"/>
+        <a:font script="Syrc" typeface="Estrangelo Edessa"/>
+        <a:font script="Orya" typeface="Kalinga"/>
+        <a:font script="Mlym" typeface="Kartika"/>
+        <a:font script="Laoo" typeface="DokChampa"/>
+        <a:font script="Sinh" typeface="Iskoola Pota"/>
+        <a:font script="Mong" typeface="Mongolian Baiti"/>
+        <a:font script="Viet" typeface="Times New Roman"/>
+        <a:font script="Uigh" typeface="Microsoft Uighur"/>
+        <a:font script="Geor" typeface="Sylfaen"/>
+        <a:font script="Armn" typeface="Arial"/>
+        <a:font script="Bugi" typeface="Leelawadee UI"/>
+        <a:font script="Bopo" typeface="Microsoft JhengHei"/>
+        <a:font script="Java" typeface="Javanese Text"/>
+        <a:font script="Lisu" typeface="Segoe UI"/>
+        <a:font script="Mymr" typeface="Myanmar Text"/>
+        <a:font script="Nkoo" typeface="Ebrima"/>
+        <a:font script="Olck" typeface="Nirmala UI"/>
+        <a:font script="Osma" typeface="Ebrima"/>
+        <a:font script="Phag" typeface="Phagspa"/>
+        <a:font script="Syrn" typeface="Estrangelo Edessa"/>
+        <a:font script="Syrj" typeface="Estrangelo Edessa"/>
+        <a:font script="Syre" typeface="Estrangelo Edessa"/>
+        <a:font script="Sora" typeface="Nirmala UI"/>
+        <a:font script="Tale" typeface="Microsoft Tai Le"/>
+        <a:font script="Talu" typeface="Microsoft New Tai Lue"/>
+        <a:font script="Tfng" typeface="Ebrima"/>
+      </a:majorFont>
+      <a:minorFont>
+        <a:latin typeface="Calibri" panose="020F0502020204030204"/>
+        <a:ea typeface=""/>
+        <a:cs typeface=""/>
+        <a:font script="Jpan" typeface="游明朝"/>
+        <a:font script="Hang" typeface="맑은 고딕"/>
+        <a:font script="Hans" typeface="等线"/>
+        <a:font script="Hant" typeface="新細明體"/>
+        <a:font script="Arab" typeface="Arial"/>
+        <a:font script="Hebr" typeface="Arial"/>
+        <a:font script="Thai" typeface="Cordia New"/>
+        <a:font script="Ethi" typeface="Nyala"/>
+        <a:font script="Beng" typeface="Vrinda"/>
+        <a:font script="Gujr" typeface="Shruti"/>
+        <a:font script="Khmr" typeface="DaunPenh"/>
+        <a:font script="Knda" typeface="Tunga"/>
+        <a:font script="Guru" typeface="Raavi"/>
+        <a:font script="Cans" typeface="Euphemia"/>
+        <a:font script="Cher" typeface="Plantagenet Cherokee"/>
+        <a:font script="Yiii" typeface="Microsoft Yi Baiti"/>
+        <a:font script="Tibt" typeface="Microsoft Himalaya"/>
+        <a:font script="Thaa" typeface="MV Boli"/>
+        <a:font script="Deva" typeface="Mangal"/>
+        <a:font script="Telu" typeface="Gautami"/>
+        <a:font script="Taml" typeface="Latha"/>
+        <a:font script="Syrc" typeface="Estrangelo Edessa"/>
+        <a:font script="Orya" typeface="Kalinga"/>
+        <a:font script="Mlym" typeface="Kartika"/>
+        <a:font script="Laoo" typeface="DokChampa"/>
+        <a:font script="Sinh" typeface="Iskoola Pota"/>
+        <a:font script="Mong" typeface="Mongolian Baiti"/>
+        <a:font script="Viet" typeface="Arial"/>
+        <a:font script="Uigh" typeface="Microsoft Uighur"/>
+        <a:font script="Geor" typeface="Sylfaen"/>
+        <a:font script="Armn" typeface="Arial"/>
+        <a:font script="Bugi" typeface="Leelawadee UI"/>
+        <a:font script="Bopo" typeface="Microsoft JhengHei"/>
+        <a:font script="Java" typeface="Javanese Text"/>
+        <a:font script="Lisu" typeface="Segoe UI"/>
+        <a:font script="Mymr" typeface="Myanmar Text"/>
+        <a:font script="Nkoo" typeface="Ebrima"/>
+        <a:font script="Olck" typeface="Nirmala UI"/>
+        <a:font script="Osma" typeface="Ebrima"/>
+        <a:font script="Phag" typeface="Phagspa"/>
+        <a:font script="Syrn" typeface="Estrangelo Edessa"/>
+        <a:font script="Syrj" typeface="Estrangelo Edessa"/>
+        <a:font script="Syre" typeface="Estrangelo Edessa"/>
+        <a:font script="Sora" typeface="Nirmala UI"/>
+        <a:font script="Tale" typeface="Microsoft Tai Le"/>
+        <a:font script="Talu" typeface="Microsoft New Tai Lue"/>
+        <a:font script="Tfng" typeface="Ebrima"/>
+      </a:minorFont>
+    </a:fontScheme>
+    <a:fmtScheme name="Office">
+      <a:fillStyleLst>
+        <a:solidFill>
+          <a:schemeClr val="phClr"/>
+        </a:solidFill>
+        <a:gradFill rotWithShape="true">
+          <a:gsLst>
+            <a:gs pos="0">
+              <a:schemeClr val="phClr">
+                <a:lumMod val="110000"/>
+                <a:satMod val="105000"/>
+                <a:tint val="67000"/>
+              </a:schemeClr>
+            </a:gs>
+            <a:gs pos="50000">
+              <a:schemeClr val="phClr">
+                <a:lumMod val="105000"/>
+                <a:satMod val="103000"/>
+                <a:tint val="73000"/>
+              </a:schemeClr>
+            </a:gs>
+            <a:gs pos="100000">
+              <a:schemeClr val="phClr">
+                <a:lumMod val="105000"/>
+                <a:satMod val="109000"/>
+                <a:tint val="81000"/>
+              </a:schemeClr>
+            </a:gs>
+          </a:gsLst>
+          <a:lin ang="5400000" scaled="false"/>
+        </a:gradFill>
+        <a:gradFill rotWithShape="true">
+          <a:gsLst>
+            <a:gs pos="0">
+              <a:schemeClr val="phClr">
+                <a:satMod val="103000"/>
+                <a:lumMod val="102000"/>
+                <a:tint val="94000"/>
+              </a:schemeClr>
+            </a:gs>
+            <a:gs pos="50000">
+              <a:schemeClr val="phClr">
+                <a:satMod val="110000"/>
+                <a:lumMod val="100000"/>
+                <a:shade val="100000"/>
+              </a:schemeClr>
+            </a:gs>
+            <a:gs pos="100000">
+              <a:schemeClr val="phClr">
+                <a:lumMod val="99000"/>
+                <a:satMod val="120000"/>
+                <a:shade val="78000"/>
+              </a:schemeClr>
+            </a:gs>
+          </a:gsLst>
+          <a:lin ang="5400000" scaled="false"/>
+        </a:gradFill>
+      </a:fillStyleLst>
+      <a:lnStyleLst>
+        <a:ln w="6350" cap="flat" cmpd="sng" algn="ctr">
+          <a:solidFill>
+            <a:schemeClr val="phClr"/>
+          </a:solidFill>
+          <a:prstDash val="solid"/>
+          <a:miter lim="800000"/>
+        </a:ln>
+        <a:ln w="12700" cap="flat" cmpd="sng" algn="ctr">
+          <a:solidFill>
+            <a:schemeClr val="phClr"/>
+          </a:solidFill>
+          <a:prstDash val="solid"/>
+          <a:miter lim="800000"/>
+        </a:ln>
+        <a:ln w="19050" cap="flat" cmpd="sng" algn="ctr">
+          <a:solidFill>
+            <a:schemeClr val="phClr"/>
+          </a:solidFill>
+          <a:prstDash val="solid"/>
+          <a:miter lim="800000"/>
+        </a:ln>
+      </a:lnStyleLst>
+      <a:effectStyleLst>
+        <a:effectStyle>
+          <a:effectLst/>
+        </a:effectStyle>
+        <a:effectStyle>
+          <a:effectLst/>
+        </a:effectStyle>
+        <a:effectStyle>
+          <a:effectLst>
+            <a:outerShdw blurRad="57150" dist="19050" dir="5400000" algn="ctr" rotWithShape="false">
+              <a:srgbClr val="000000">
+                <a:alpha val="63000"/>
+              </a:srgbClr>
+            </a:outerShdw>
+          </a:effectLst>
+        </a:effectStyle>
+      </a:effectStyleLst>
+      <a:bgFillStyleLst>
+        <a:solidFill>
+          <a:schemeClr val="phClr"/>
+        </a:solidFill>
+        <a:solidFill>
+          <a:schemeClr val="phClr">
+            <a:tint val="95000"/>
+            <a:satMod val="170000"/>
+          </a:schemeClr>
+        </a:solidFill>
+        <a:gradFill rotWithShape="true">
+          <a:gsLst>
+            <a:gs pos="0">
+              <a:schemeClr val="phClr">
+                <a:tint val="93000"/>
+                <a:satMod val="150000"/>
+                <a:shade val="98000"/>
+                <a:lumMod val="102000"/>
+              </a:schemeClr>
+            </a:gs>
+            <a:gs pos="50000">
+              <a:schemeClr val="phClr">
+                <a:tint val="98000"/>
+                <a:satMod val="130000"/>
+                <a:shade val="90000"/>
+                <a:lumMod val="103000"/>
+              </a:schemeClr>
+            </a:gs>
+            <a:gs pos="100000">
+              <a:schemeClr val="phClr">
+                <a:shade val="63000"/>
+                <a:satMod val="120000"/>
+              </a:schemeClr>
+            </a:gs>
+          </a:gsLst>
+          <a:lin ang="5400000" scaled="false"/>
+        </a:gradFill>
+      </a:bgFillStyleLst>
+    </a:fmtScheme>
+  </a:themeElements>
+  <a:objectDefaults/>
+  <a:extraClrSchemeLst/>
+</a:theme>
 </file>
</xml_diff>